<commit_message>
falta el plan del curso de machine learning en la u
</commit_message>
<xml_diff>
--- a/1_curso_machine_learning/0_plan_del_curso/plan_curso_machine_learning_Formato oficial de curso v4_14_08_2023.docx
+++ b/1_curso_machine_learning/0_plan_del_curso/plan_curso_machine_learning_Formato oficial de curso v4_14_08_2023.docx
@@ -16,7 +16,7 @@
         <w:tblpPr w:vertAnchor="page" w:horzAnchor="margin" w:leftFromText="141" w:rightFromText="141" w:tblpX="0" w:tblpY="646"/>
         <w:tblW w:w="10485" w:type="dxa"/>
         <w:jc w:val="left"/>
-        <w:tblInd w:w="-5" w:type="dxa"/>
+        <w:tblInd w:w="70" w:type="dxa"/>
         <w:tblLayout w:type="fixed"/>
         <w:tblCellMar>
           <w:top w:w="0" w:type="dxa"/>
@@ -299,6 +299,7 @@
                 <w:ilvl w:val="0"/>
                 <w:numId w:val="1"/>
               </w:numPr>
+              <w:suppressAutoHyphens w:val="true"/>
               <w:spacing w:before="0" w:after="0"/>
               <w:jc w:val="left"/>
               <w:rPr>
@@ -313,7 +314,7 @@
                 <w:kern w:val="0"/>
                 <w:lang w:val="es-ES" w:eastAsia="es-ES" w:bidi="ar-SA"/>
               </w:rPr>
-              <w:t xml:space="preserve">INFORMACIÓN GENERAL </w:t>
+              <w:t>INFORMACIÓN GENERAL</w:t>
             </w:r>
           </w:p>
         </w:tc>
@@ -339,6 +340,7 @@
             <w:pPr>
               <w:pStyle w:val="Normal"/>
               <w:widowControl/>
+              <w:suppressAutoHyphens w:val="true"/>
               <w:spacing w:before="0" w:after="0"/>
               <w:jc w:val="left"/>
               <w:rPr>
@@ -378,6 +380,7 @@
             <w:pPr>
               <w:pStyle w:val="Normal"/>
               <w:widowControl/>
+              <w:suppressAutoHyphens w:val="true"/>
               <w:spacing w:before="0" w:after="0"/>
               <w:jc w:val="left"/>
               <w:rPr>
@@ -417,6 +420,7 @@
             <w:pPr>
               <w:pStyle w:val="Normal"/>
               <w:widowControl/>
+              <w:suppressAutoHyphens w:val="true"/>
               <w:spacing w:before="0" w:after="0"/>
               <w:jc w:val="left"/>
               <w:rPr>
@@ -456,6 +460,7 @@
             <w:pPr>
               <w:pStyle w:val="Normal"/>
               <w:widowControl/>
+              <w:suppressAutoHyphens w:val="true"/>
               <w:spacing w:before="0" w:after="0"/>
               <w:jc w:val="left"/>
               <w:rPr>
@@ -463,12 +468,21 @@
                 <w:sz w:val="20"/>
               </w:rPr>
             </w:pPr>
+            <w:r>
+              <w:rPr>
+                <w:rFonts w:eastAsia="Times New Roman" w:cs="Times New Roman"/>
+                <w:kern w:val="0"/>
+                <w:szCs w:val="20"/>
+                <w:lang w:val="es-ES" w:eastAsia="es-ES" w:bidi="ar-SA"/>
+              </w:rPr>
+              <w:t>Programa de desarrollo docente</w:t>
+            </w:r>
             <w:sdt>
               <w:sdtPr>
-                <w:id w:val="-1962957546"/>
                 <w:placeholder>
                   <w:docPart w:val="7D78BE8594F04685B47111E0483C2C94"/>
                 </w:placeholder>
+                <w:id w:val="-1962957546"/>
               </w:sdtPr>
               <w:sdtContent>
                 <w:r>
@@ -478,7 +492,14 @@
                     <w:szCs w:val="20"/>
                     <w:lang w:val="es-ES" w:eastAsia="es-ES" w:bidi="ar-SA"/>
                   </w:rPr>
-                  <w:t>Escriba el nombre del programa académico.</w:t>
+                </w:r>
+                <w:r>
+                  <w:rPr>
+                    <w:rFonts w:eastAsia="Times New Roman" w:cs="Times New Roman"/>
+                    <w:kern w:val="0"/>
+                    <w:szCs w:val="20"/>
+                    <w:lang w:val="es-ES" w:eastAsia="es-ES" w:bidi="ar-SA"/>
+                  </w:rPr>
                 </w:r>
               </w:sdtContent>
             </w:sdt>
@@ -506,6 +527,7 @@
             <w:pPr>
               <w:pStyle w:val="Normal"/>
               <w:widowControl/>
+              <w:suppressAutoHyphens w:val="true"/>
               <w:spacing w:before="0" w:after="0"/>
               <w:jc w:val="left"/>
               <w:rPr>
@@ -585,6 +607,7 @@
             <w:pPr>
               <w:pStyle w:val="Normal"/>
               <w:widowControl/>
+              <w:suppressAutoHyphens w:val="true"/>
               <w:spacing w:before="0" w:after="0"/>
               <w:jc w:val="left"/>
               <w:rPr>
@@ -594,11 +617,8 @@
             </w:pPr>
             <w:r>
               <w:rPr>
-                <w:rFonts w:eastAsia="Times New Roman" w:cs="Times New Roman" w:ascii="Calibri" w:hAnsi="Calibri"/>
-                <w:kern w:val="0"/>
+                <w:rFonts w:asciiTheme="minorHAnsi" w:hAnsiTheme="minorHAnsi" w:ascii="Calibri" w:hAnsi="Calibri"/>
                 <w:sz w:val="20"/>
-                <w:szCs w:val="20"/>
-                <w:lang w:val="es-ES" w:eastAsia="es-ES" w:bidi="ar-SA"/>
               </w:rPr>
             </w:r>
           </w:p>
@@ -625,6 +645,7 @@
             <w:pPr>
               <w:pStyle w:val="Normal"/>
               <w:widowControl/>
+              <w:suppressAutoHyphens w:val="true"/>
               <w:spacing w:before="0" w:after="0"/>
               <w:jc w:val="left"/>
               <w:rPr>
@@ -664,6 +685,7 @@
             <w:pPr>
               <w:pStyle w:val="Normal"/>
               <w:widowControl/>
+              <w:suppressAutoHyphens w:val="true"/>
               <w:spacing w:before="0" w:after="0"/>
               <w:jc w:val="left"/>
               <w:rPr>
@@ -685,6 +707,14 @@
                     <w:szCs w:val="20"/>
                     <w:lang w:val="es-ES" w:eastAsia="es-ES" w:bidi="ar-SA"/>
                   </w:rPr>
+                </w:r>
+                <w:r>
+                  <w:rPr>
+                    <w:rFonts w:eastAsia="Times New Roman" w:cs="Times New Roman"/>
+                    <w:kern w:val="0"/>
+                    <w:szCs w:val="20"/>
+                    <w:lang w:val="es-ES" w:eastAsia="es-ES" w:bidi="ar-SA"/>
+                  </w:rPr>
                   <w:t>Escriba el nombre de los programa(s) académico(s).</w:t>
                 </w:r>
               </w:sdtContent>
@@ -712,6 +742,7 @@
             <w:pPr>
               <w:pStyle w:val="Normal"/>
               <w:widowControl/>
+              <w:suppressAutoHyphens w:val="true"/>
               <w:spacing w:before="0" w:after="0"/>
               <w:jc w:val="left"/>
               <w:rPr>
@@ -750,6 +781,7 @@
             <w:pPr>
               <w:pStyle w:val="Normal"/>
               <w:widowControl/>
+              <w:suppressAutoHyphens w:val="true"/>
               <w:spacing w:before="0" w:after="0"/>
               <w:jc w:val="left"/>
               <w:rPr>
@@ -770,6 +802,14 @@
                     <w:szCs w:val="20"/>
                     <w:lang w:val="es-ES" w:eastAsia="es-ES" w:bidi="ar-SA"/>
                   </w:rPr>
+                </w:r>
+                <w:r>
+                  <w:rPr>
+                    <w:rFonts w:eastAsia="Times New Roman" w:cs="Times New Roman"/>
+                    <w:kern w:val="0"/>
+                    <w:szCs w:val="20"/>
+                    <w:lang w:val="es-ES" w:eastAsia="es-ES" w:bidi="ar-SA"/>
+                  </w:rPr>
                   <w:t>Periodo académico o Cohorte.</w:t>
                 </w:r>
               </w:sdtContent>
@@ -792,6 +832,7 @@
             <w:pPr>
               <w:pStyle w:val="Normal"/>
               <w:widowControl/>
+              <w:suppressAutoHyphens w:val="true"/>
               <w:spacing w:before="0" w:after="0"/>
               <w:jc w:val="left"/>
               <w:rPr>
@@ -809,7 +850,7 @@
                 <w:szCs w:val="20"/>
                 <w:lang w:val="es-ES" w:eastAsia="es-ES" w:bidi="ar-SA"/>
               </w:rPr>
-              <w:t xml:space="preserve">Código curso: </w:t>
+              <w:t>Código curso:</w:t>
             </w:r>
           </w:p>
         </w:tc>
@@ -829,6 +870,7 @@
             <w:pPr>
               <w:pStyle w:val="Normal"/>
               <w:widowControl/>
+              <w:suppressAutoHyphens w:val="true"/>
               <w:spacing w:before="0" w:after="0"/>
               <w:jc w:val="left"/>
               <w:rPr>
@@ -849,6 +891,14 @@
                     <w:szCs w:val="20"/>
                     <w:lang w:val="es-ES" w:eastAsia="es-ES" w:bidi="ar-SA"/>
                   </w:rPr>
+                </w:r>
+                <w:r>
+                  <w:rPr>
+                    <w:rFonts w:eastAsia="Times New Roman" w:cs="Times New Roman"/>
+                    <w:kern w:val="0"/>
+                    <w:szCs w:val="20"/>
+                    <w:lang w:val="es-ES" w:eastAsia="es-ES" w:bidi="ar-SA"/>
+                  </w:rPr>
                   <w:t>Código del curso en MARES.</w:t>
                 </w:r>
               </w:sdtContent>
@@ -877,6 +927,7 @@
             <w:pPr>
               <w:pStyle w:val="Normal"/>
               <w:widowControl/>
+              <w:suppressAutoHyphens w:val="true"/>
               <w:spacing w:before="0" w:after="0"/>
               <w:jc w:val="left"/>
               <w:rPr>
@@ -894,13 +945,25 @@
                 <w:szCs w:val="20"/>
                 <w:lang w:val="es-ES" w:eastAsia="es-ES" w:bidi="ar-SA"/>
               </w:rPr>
-              <w:t>Tipo de curso:</w:t>
-            </w:r>
-          </w:p>
-          <w:p>
-            <w:pPr>
-              <w:pStyle w:val="Normal"/>
-              <w:widowControl/>
+              <w:t xml:space="preserve">Tipo de curso: </w:t>
+            </w:r>
+            <w:r>
+              <w:rPr>
+                <w:rFonts w:eastAsia="Times New Roman" w:cs="Times New Roman" w:ascii="Calibri" w:hAnsi="Calibri" w:asciiTheme="minorHAnsi" w:hAnsiTheme="minorHAnsi"/>
+                <w:b/>
+                <w:kern w:val="0"/>
+                <w:sz w:val="22"/>
+                <w:szCs w:val="20"/>
+                <w:lang w:val="es-ES" w:eastAsia="es-ES" w:bidi="ar-SA"/>
+              </w:rPr>
+              <w:t>Teorico - práctico</w:t>
+            </w:r>
+          </w:p>
+          <w:p>
+            <w:pPr>
+              <w:pStyle w:val="Normal"/>
+              <w:widowControl/>
+              <w:suppressAutoHyphens w:val="true"/>
               <w:spacing w:before="0" w:after="0"/>
               <w:jc w:val="left"/>
               <w:rPr>
@@ -975,6 +1038,7 @@
             <w:pPr>
               <w:pStyle w:val="Normal"/>
               <w:widowControl/>
+              <w:suppressAutoHyphens w:val="true"/>
               <w:spacing w:before="0" w:after="0"/>
               <w:jc w:val="left"/>
               <w:rPr>
@@ -984,18 +1048,16 @@
             </w:pPr>
             <w:r>
               <w:rPr>
-                <w:rFonts w:eastAsia="Times New Roman" w:cs="Times New Roman" w:ascii="Calibri" w:hAnsi="Calibri"/>
-                <w:kern w:val="0"/>
-                <w:sz w:val="22"/>
-                <w:szCs w:val="20"/>
-                <w:lang w:val="es-ES" w:eastAsia="es-ES" w:bidi="ar-SA"/>
-              </w:rPr>
-            </w:r>
-          </w:p>
-          <w:p>
-            <w:pPr>
-              <w:pStyle w:val="Normal"/>
-              <w:widowControl/>
+                <w:rFonts w:ascii="Calibri" w:hAnsi="Calibri"/>
+                <w:sz w:val="22"/>
+              </w:rPr>
+            </w:r>
+          </w:p>
+          <w:p>
+            <w:pPr>
+              <w:pStyle w:val="Normal"/>
+              <w:widowControl/>
+              <w:suppressAutoHyphens w:val="true"/>
               <w:spacing w:before="0" w:after="0"/>
               <w:jc w:val="left"/>
               <w:rPr>
@@ -1005,11 +1067,8 @@
             </w:pPr>
             <w:r>
               <w:rPr>
-                <w:rFonts w:eastAsia="Times New Roman" w:cs="Times New Roman" w:ascii="Calibri" w:hAnsi="Calibri"/>
-                <w:kern w:val="0"/>
-                <w:sz w:val="22"/>
-                <w:szCs w:val="20"/>
-                <w:lang w:val="es-ES" w:eastAsia="es-ES" w:bidi="ar-SA"/>
+                <w:rFonts w:ascii="Calibri" w:hAnsi="Calibri"/>
+                <w:sz w:val="22"/>
               </w:rPr>
             </w:r>
           </w:p>
@@ -1031,6 +1090,7 @@
             <w:pPr>
               <w:pStyle w:val="Normal"/>
               <w:widowControl/>
+              <w:suppressAutoHyphens w:val="true"/>
               <w:spacing w:before="0" w:after="0"/>
               <w:jc w:val="left"/>
               <w:rPr>
@@ -1057,6 +1117,7 @@
             <w:pPr>
               <w:pStyle w:val="Normal"/>
               <w:widowControl/>
+              <w:suppressAutoHyphens w:val="true"/>
               <w:spacing w:before="0" w:after="0"/>
               <w:jc w:val="left"/>
               <w:rPr>
@@ -1121,6 +1182,7 @@
             <w:pPr>
               <w:pStyle w:val="Normal"/>
               <w:widowControl/>
+              <w:suppressAutoHyphens w:val="true"/>
               <w:spacing w:before="0" w:after="0"/>
               <w:contextualSpacing/>
               <w:jc w:val="left"/>
@@ -1153,6 +1215,15 @@
                     <w:szCs w:val="20"/>
                     <w:lang w:val="es-ES" w:eastAsia="es-ES" w:bidi="ar-SA"/>
                   </w:rPr>
+                </w:r>
+                <w:r>
+                  <w:rPr>
+                    <w:rFonts w:eastAsia="Times New Roman" w:cs="Times New Roman" w:ascii="Calibri" w:hAnsi="Calibri"/>
+                    <w:kern w:val="0"/>
+                    <w:sz w:val="22"/>
+                    <w:szCs w:val="20"/>
+                    <w:lang w:val="es-ES" w:eastAsia="es-ES" w:bidi="ar-SA"/>
+                  </w:rPr>
                   <w:t xml:space="preserve">En caso de elegir “Otro”, indique cuál. </w:t>
                 </w:r>
               </w:sdtContent>
@@ -1162,6 +1233,7 @@
             <w:pPr>
               <w:pStyle w:val="Normal"/>
               <w:widowControl/>
+              <w:suppressAutoHyphens w:val="true"/>
               <w:spacing w:before="0" w:after="160"/>
               <w:contextualSpacing/>
               <w:jc w:val="left"/>
@@ -1180,10 +1252,8 @@
                 <w:b/>
                 <w:bCs/>
                 <w:color w:themeColor="text1" w:val="000000"/>
-                <w:kern w:val="0"/>
                 <w:sz w:val="20"/>
-                <w:szCs w:val="20"/>
-                <w:lang w:val="es-CO" w:eastAsia="es-ES" w:bidi="ar-SA"/>
+                <w:lang w:val="es-CO"/>
               </w:rPr>
             </w:r>
           </w:p>
@@ -1210,6 +1280,7 @@
             <w:pPr>
               <w:pStyle w:val="Normal"/>
               <w:widowControl/>
+              <w:suppressAutoHyphens w:val="true"/>
               <w:spacing w:before="0" w:after="0"/>
               <w:jc w:val="left"/>
               <w:rPr>
@@ -1440,6 +1511,7 @@
             <w:pPr>
               <w:pStyle w:val="Normal"/>
               <w:widowControl/>
+              <w:suppressAutoHyphens w:val="true"/>
               <w:spacing w:before="0" w:after="0"/>
               <w:jc w:val="left"/>
               <w:rPr>
@@ -1492,13 +1564,23 @@
                 <w:r>
                   <w:rPr>
                     <w:rFonts w:eastAsia="Times New Roman" w:cs="Times New Roman" w:ascii="Calibri" w:hAnsi="Calibri"/>
+                    <w:b/>
+                    <w:kern w:val="0"/>
+                    <w:sz w:val="22"/>
+                    <w:szCs w:val="22"/>
+                    <w:lang w:val="es-ES" w:eastAsia="es-ES" w:bidi="ar-SA"/>
+                  </w:rPr>
+                  <w:t>Presencial</w:t>
+                </w:r>
+                <w:r>
+                  <w:rPr>
+                    <w:rFonts w:eastAsia="Times New Roman" w:cs="Times New Roman" w:ascii="Calibri" w:hAnsi="Calibri"/>
                     <w:color w:themeColor="background1" w:themeShade="80" w:val="808080"/>
                     <w:kern w:val="0"/>
                     <w:sz w:val="20"/>
                     <w:szCs w:val="20"/>
                     <w:lang w:val="es-ES" w:eastAsia="es-ES" w:bidi="ar-SA"/>
                   </w:rPr>
-                  <w:t>Elija un elemento.</w:t>
                 </w:r>
               </w:sdtContent>
             </w:sdt>
@@ -1507,6 +1589,7 @@
             <w:pPr>
               <w:pStyle w:val="Normal"/>
               <w:widowControl/>
+              <w:suppressAutoHyphens w:val="true"/>
               <w:spacing w:before="0" w:after="0"/>
               <w:jc w:val="left"/>
               <w:rPr>
@@ -1570,6 +1653,7 @@
             <w:pPr>
               <w:pStyle w:val="Normal"/>
               <w:widowControl/>
+              <w:suppressAutoHyphens w:val="true"/>
               <w:spacing w:before="0" w:after="0"/>
               <w:jc w:val="left"/>
               <w:rPr>
@@ -1587,13 +1671,14 @@
                 <w:szCs w:val="20"/>
                 <w:lang w:val="es-ES" w:eastAsia="es-ES" w:bidi="ar-SA"/>
               </w:rPr>
-              <w:t xml:space="preserve">Nombre del área, núcleo o componente de la organización curricular a la que pertenece el curso:   </w:t>
-            </w:r>
-          </w:p>
-          <w:p>
-            <w:pPr>
-              <w:pStyle w:val="Normal"/>
-              <w:widowControl/>
+              <w:t>Nombre del área, núcleo o componente de la organización curricular a la que pertenece el curso:</w:t>
+            </w:r>
+          </w:p>
+          <w:p>
+            <w:pPr>
+              <w:pStyle w:val="Normal"/>
+              <w:widowControl/>
+              <w:suppressAutoHyphens w:val="true"/>
               <w:spacing w:before="0" w:after="0"/>
               <w:jc w:val="left"/>
               <w:rPr>
@@ -1602,10 +1687,7 @@
             </w:pPr>
             <w:r>
               <w:rPr>
-                <w:rFonts w:eastAsia="Times New Roman" w:cs="Times New Roman" w:ascii="Calibri" w:hAnsi="Calibri"/>
-                <w:kern w:val="0"/>
-                <w:szCs w:val="20"/>
-                <w:lang w:val="es-ES" w:eastAsia="es-ES" w:bidi="ar-SA"/>
+                <w:rFonts w:asciiTheme="minorHAnsi" w:hAnsiTheme="minorHAnsi" w:ascii="Calibri" w:hAnsi="Calibri"/>
               </w:rPr>
             </w:r>
           </w:p>
@@ -1632,6 +1714,7 @@
             <w:pPr>
               <w:pStyle w:val="Normal"/>
               <w:widowControl/>
+              <w:suppressAutoHyphens w:val="true"/>
               <w:spacing w:before="0" w:after="0"/>
               <w:jc w:val="left"/>
               <w:rPr>
@@ -1671,6 +1754,7 @@
             <w:pPr>
               <w:pStyle w:val="Normal"/>
               <w:widowControl/>
+              <w:suppressAutoHyphens w:val="true"/>
               <w:spacing w:before="0" w:after="0"/>
               <w:jc w:val="left"/>
               <w:rPr>
@@ -1691,6 +1775,14 @@
                     <w:szCs w:val="20"/>
                     <w:lang w:val="es-ES" w:eastAsia="es-ES" w:bidi="ar-SA"/>
                   </w:rPr>
+                </w:r>
+                <w:r>
+                  <w:rPr>
+                    <w:rFonts w:eastAsia="Times New Roman" w:cs="Times New Roman"/>
+                    <w:kern w:val="0"/>
+                    <w:szCs w:val="20"/>
+                    <w:lang w:val="es-ES" w:eastAsia="es-ES" w:bidi="ar-SA"/>
+                  </w:rPr>
                   <w:t>Prerrequisitos con nombre y código en MARES.</w:t>
                 </w:r>
               </w:sdtContent>
@@ -1719,6 +1811,7 @@
             <w:pPr>
               <w:pStyle w:val="Normal"/>
               <w:widowControl/>
+              <w:suppressAutoHyphens w:val="true"/>
               <w:spacing w:before="0" w:after="0"/>
               <w:jc w:val="left"/>
               <w:rPr>
@@ -1758,6 +1851,7 @@
             <w:pPr>
               <w:pStyle w:val="Normal"/>
               <w:widowControl/>
+              <w:suppressAutoHyphens w:val="true"/>
               <w:spacing w:before="0" w:after="0"/>
               <w:jc w:val="left"/>
               <w:rPr>
@@ -1778,6 +1872,14 @@
                     <w:szCs w:val="20"/>
                     <w:lang w:val="es-ES" w:eastAsia="es-ES" w:bidi="ar-SA"/>
                   </w:rPr>
+                </w:r>
+                <w:r>
+                  <w:rPr>
+                    <w:rFonts w:eastAsia="Times New Roman" w:cs="Times New Roman"/>
+                    <w:kern w:val="0"/>
+                    <w:szCs w:val="20"/>
+                    <w:lang w:val="es-ES" w:eastAsia="es-ES" w:bidi="ar-SA"/>
+                  </w:rPr>
                   <w:t>Correquisitos con nombre y código en MARES.</w:t>
                 </w:r>
               </w:sdtContent>
@@ -1806,6 +1908,7 @@
             <w:pPr>
               <w:pStyle w:val="Normal"/>
               <w:widowControl/>
+              <w:suppressAutoHyphens w:val="true"/>
               <w:spacing w:before="0" w:after="0"/>
               <w:jc w:val="left"/>
               <w:rPr>
@@ -1902,6 +2005,7 @@
             <w:pPr>
               <w:pStyle w:val="Normal"/>
               <w:widowControl/>
+              <w:suppressAutoHyphens w:val="true"/>
               <w:spacing w:before="0" w:after="0"/>
               <w:jc w:val="both"/>
               <w:rPr>
@@ -1989,6 +2093,7 @@
             <w:pPr>
               <w:pStyle w:val="Normal"/>
               <w:widowControl/>
+              <w:suppressAutoHyphens w:val="true"/>
               <w:spacing w:before="0" w:after="0"/>
               <w:jc w:val="left"/>
               <w:rPr>
@@ -2014,6 +2119,7 @@
             <w:pPr>
               <w:pStyle w:val="Normal"/>
               <w:widowControl/>
+              <w:suppressAutoHyphens w:val="true"/>
               <w:spacing w:before="0" w:after="0"/>
               <w:jc w:val="left"/>
               <w:rPr>
@@ -2037,6 +2143,16 @@
                     <w:szCs w:val="20"/>
                     <w:lang w:val="es-ES" w:eastAsia="es-ES" w:bidi="ar-SA"/>
                   </w:rPr>
+                </w:r>
+                <w:r>
+                  <w:rPr>
+                    <w:rStyle w:val="PlaceholderText"/>
+                    <w:rFonts w:eastAsia="Times New Roman" w:cs="Times New Roman" w:ascii="Calibri" w:hAnsi="Calibri"/>
+                    <w:kern w:val="0"/>
+                    <w:sz w:val="20"/>
+                    <w:szCs w:val="20"/>
+                    <w:lang w:val="es-ES" w:eastAsia="es-ES" w:bidi="ar-SA"/>
+                  </w:rPr>
                   <w:t>Número</w:t>
                 </w:r>
               </w:sdtContent>
@@ -2065,6 +2181,7 @@
             <w:pPr>
               <w:pStyle w:val="Normal"/>
               <w:widowControl/>
+              <w:suppressAutoHyphens w:val="true"/>
               <w:spacing w:before="0" w:after="0"/>
               <w:jc w:val="left"/>
               <w:rPr>
@@ -2147,6 +2264,7 @@
             <w:pPr>
               <w:pStyle w:val="Normal"/>
               <w:widowControl/>
+              <w:suppressAutoHyphens w:val="true"/>
               <w:spacing w:before="0" w:after="0"/>
               <w:jc w:val="both"/>
               <w:rPr>
@@ -2245,6 +2363,7 @@
             <w:pPr>
               <w:pStyle w:val="Normal"/>
               <w:widowControl/>
+              <w:suppressAutoHyphens w:val="true"/>
               <w:spacing w:before="0" w:after="0"/>
               <w:jc w:val="left"/>
               <w:rPr>
@@ -2270,6 +2389,7 @@
             <w:pPr>
               <w:pStyle w:val="Normal"/>
               <w:widowControl/>
+              <w:suppressAutoHyphens w:val="true"/>
               <w:spacing w:before="0" w:after="0"/>
               <w:jc w:val="left"/>
               <w:rPr>
@@ -2293,6 +2413,16 @@
                     <w:szCs w:val="20"/>
                     <w:lang w:val="es-ES" w:eastAsia="es-ES" w:bidi="ar-SA"/>
                   </w:rPr>
+                </w:r>
+                <w:r>
+                  <w:rPr>
+                    <w:rStyle w:val="PlaceholderText"/>
+                    <w:rFonts w:eastAsia="Times New Roman" w:cs="Times New Roman" w:ascii="Calibri" w:hAnsi="Calibri"/>
+                    <w:kern w:val="0"/>
+                    <w:sz w:val="20"/>
+                    <w:szCs w:val="20"/>
+                    <w:lang w:val="es-ES" w:eastAsia="es-ES" w:bidi="ar-SA"/>
+                  </w:rPr>
                   <w:t>Número</w:t>
                 </w:r>
               </w:sdtContent>
@@ -2321,6 +2451,7 @@
             <w:pPr>
               <w:pStyle w:val="Normal"/>
               <w:widowControl/>
+              <w:suppressAutoHyphens w:val="true"/>
               <w:spacing w:before="0" w:after="0"/>
               <w:jc w:val="both"/>
               <w:rPr>
@@ -2501,6 +2632,7 @@
                 <w:ilvl w:val="0"/>
                 <w:numId w:val="1"/>
               </w:numPr>
+              <w:suppressAutoHyphens w:val="true"/>
               <w:spacing w:before="0" w:after="0"/>
               <w:jc w:val="left"/>
               <w:rPr>
@@ -2515,7 +2647,7 @@
                 <w:kern w:val="0"/>
                 <w:lang w:val="es-ES" w:eastAsia="es-ES" w:bidi="ar-SA"/>
               </w:rPr>
-              <w:t xml:space="preserve">RELACIONES CON EL PERFIL </w:t>
+              <w:t>RELACIONES CON EL PERFIL</w:t>
             </w:r>
           </w:p>
         </w:tc>
@@ -2540,6 +2672,7 @@
             <w:pPr>
               <w:pStyle w:val="Normal"/>
               <w:widowControl/>
+              <w:suppressAutoHyphens w:val="true"/>
               <w:spacing w:before="0" w:after="0"/>
               <w:jc w:val="both"/>
               <w:rPr>
@@ -2581,6 +2714,7 @@
             <w:pPr>
               <w:pStyle w:val="Normal"/>
               <w:widowControl/>
+              <w:suppressAutoHyphens w:val="true"/>
               <w:spacing w:before="0" w:after="0"/>
               <w:jc w:val="both"/>
               <w:rPr>
@@ -2591,18 +2725,17 @@
             </w:pPr>
             <w:r>
               <w:rPr>
-                <w:rFonts w:eastAsia="Times New Roman" w:cs="Times New Roman" w:ascii="Calibri" w:hAnsi="Calibri"/>
-                <w:kern w:val="0"/>
-                <w:sz w:val="22"/>
-                <w:szCs w:val="22"/>
-                <w:lang w:val="es-ES" w:eastAsia="es-ES" w:bidi="ar-SA"/>
-              </w:rPr>
-            </w:r>
-          </w:p>
-          <w:p>
-            <w:pPr>
-              <w:pStyle w:val="Normal"/>
-              <w:widowControl/>
+                <w:rFonts w:asciiTheme="minorHAnsi" w:hAnsiTheme="minorHAnsi" w:ascii="Calibri" w:hAnsi="Calibri"/>
+                <w:sz w:val="22"/>
+                <w:szCs w:val="22"/>
+              </w:rPr>
+            </w:r>
+          </w:p>
+          <w:p>
+            <w:pPr>
+              <w:pStyle w:val="Normal"/>
+              <w:widowControl/>
+              <w:suppressAutoHyphens w:val="true"/>
               <w:spacing w:before="0" w:after="0"/>
               <w:jc w:val="both"/>
               <w:rPr>
@@ -2613,11 +2746,9 @@
             </w:pPr>
             <w:r>
               <w:rPr>
-                <w:rFonts w:eastAsia="Times New Roman" w:cs="Times New Roman" w:ascii="Calibri" w:hAnsi="Calibri"/>
-                <w:kern w:val="0"/>
-                <w:sz w:val="22"/>
-                <w:szCs w:val="22"/>
-                <w:lang w:val="es-ES" w:eastAsia="es-ES" w:bidi="ar-SA"/>
+                <w:rFonts w:asciiTheme="minorHAnsi" w:hAnsiTheme="minorHAnsi" w:ascii="Calibri" w:hAnsi="Calibri"/>
+                <w:sz w:val="22"/>
+                <w:szCs w:val="22"/>
               </w:rPr>
             </w:r>
           </w:p>
@@ -2647,6 +2778,7 @@
                 <w:ilvl w:val="0"/>
                 <w:numId w:val="1"/>
               </w:numPr>
+              <w:suppressAutoHyphens w:val="true"/>
               <w:spacing w:before="0" w:after="0"/>
               <w:jc w:val="left"/>
               <w:rPr>
@@ -2661,7 +2793,7 @@
                 <w:kern w:val="0"/>
                 <w:lang w:val="es-ES" w:eastAsia="es-ES" w:bidi="ar-SA"/>
               </w:rPr>
-              <w:t xml:space="preserve">INTENCIONALIDADES FORMATIVAS </w:t>
+              <w:t>INTENCIONALIDADES FORMATIVAS</w:t>
             </w:r>
           </w:p>
         </w:tc>
@@ -2686,6 +2818,7 @@
             <w:pPr>
               <w:pStyle w:val="Normal"/>
               <w:widowControl/>
+              <w:suppressAutoHyphens w:val="true"/>
               <w:spacing w:before="0" w:after="0"/>
               <w:jc w:val="both"/>
               <w:rPr>
@@ -2727,6 +2860,7 @@
             <w:pPr>
               <w:pStyle w:val="Normal"/>
               <w:widowControl/>
+              <w:suppressAutoHyphens w:val="true"/>
               <w:spacing w:before="0" w:after="0"/>
               <w:jc w:val="both"/>
               <w:rPr>
@@ -2736,18 +2870,16 @@
             </w:pPr>
             <w:r>
               <w:rPr>
-                <w:rFonts w:eastAsia="Times New Roman" w:cs="Times New Roman" w:ascii="Calibri" w:hAnsi="Calibri"/>
-                <w:kern w:val="0"/>
-                <w:sz w:val="22"/>
-                <w:szCs w:val="20"/>
-                <w:lang w:val="es-ES" w:eastAsia="es-ES" w:bidi="ar-SA"/>
-              </w:rPr>
-            </w:r>
-          </w:p>
-          <w:p>
-            <w:pPr>
-              <w:pStyle w:val="Normal"/>
-              <w:widowControl/>
+                <w:rFonts w:ascii="Calibri" w:hAnsi="Calibri"/>
+                <w:sz w:val="22"/>
+              </w:rPr>
+            </w:r>
+          </w:p>
+          <w:p>
+            <w:pPr>
+              <w:pStyle w:val="Normal"/>
+              <w:widowControl/>
+              <w:suppressAutoHyphens w:val="true"/>
               <w:spacing w:before="0" w:after="0"/>
               <w:jc w:val="both"/>
               <w:rPr>
@@ -2758,11 +2890,9 @@
             </w:pPr>
             <w:r>
               <w:rPr>
-                <w:rFonts w:eastAsia="Times New Roman" w:cs="Times New Roman" w:ascii="Calibri" w:hAnsi="Calibri"/>
-                <w:kern w:val="0"/>
-                <w:sz w:val="22"/>
-                <w:szCs w:val="22"/>
-                <w:lang w:val="es-ES" w:eastAsia="es-ES" w:bidi="ar-SA"/>
+                <w:rFonts w:asciiTheme="minorHAnsi" w:hAnsiTheme="minorHAnsi" w:ascii="Calibri" w:hAnsi="Calibri"/>
+                <w:sz w:val="22"/>
+                <w:szCs w:val="22"/>
               </w:rPr>
             </w:r>
           </w:p>
@@ -2824,6 +2954,7 @@
                 <w:ilvl w:val="0"/>
                 <w:numId w:val="1"/>
               </w:numPr>
+              <w:suppressAutoHyphens w:val="true"/>
               <w:spacing w:before="0" w:after="0"/>
               <w:jc w:val="left"/>
               <w:rPr>
@@ -2863,6 +2994,7 @@
             <w:pPr>
               <w:pStyle w:val="Normal"/>
               <w:widowControl/>
+              <w:suppressAutoHyphens w:val="true"/>
               <w:spacing w:before="0" w:after="0"/>
               <w:jc w:val="both"/>
               <w:rPr>
@@ -2904,6 +3036,7 @@
             <w:pPr>
               <w:pStyle w:val="Normal"/>
               <w:widowControl/>
+              <w:suppressAutoHyphens w:val="true"/>
               <w:spacing w:before="0" w:after="0"/>
               <w:jc w:val="both"/>
               <w:rPr>
@@ -2913,18 +3046,16 @@
             </w:pPr>
             <w:r>
               <w:rPr>
-                <w:rFonts w:eastAsia="Times New Roman" w:cs="Times New Roman" w:ascii="Calibri" w:hAnsi="Calibri"/>
-                <w:kern w:val="0"/>
-                <w:sz w:val="22"/>
-                <w:szCs w:val="20"/>
-                <w:lang w:val="es-ES" w:eastAsia="es-ES" w:bidi="ar-SA"/>
-              </w:rPr>
-            </w:r>
-          </w:p>
-          <w:p>
-            <w:pPr>
-              <w:pStyle w:val="Normal"/>
-              <w:widowControl/>
+                <w:rFonts w:ascii="Calibri" w:hAnsi="Calibri"/>
+                <w:sz w:val="22"/>
+              </w:rPr>
+            </w:r>
+          </w:p>
+          <w:p>
+            <w:pPr>
+              <w:pStyle w:val="Normal"/>
+              <w:widowControl/>
+              <w:suppressAutoHyphens w:val="true"/>
               <w:spacing w:before="0" w:after="0"/>
               <w:jc w:val="both"/>
               <w:rPr>
@@ -2935,11 +3066,9 @@
             </w:pPr>
             <w:r>
               <w:rPr>
-                <w:rFonts w:eastAsia="Times New Roman" w:cs="Times New Roman" w:ascii="Calibri" w:hAnsi="Calibri"/>
-                <w:kern w:val="0"/>
-                <w:sz w:val="22"/>
-                <w:szCs w:val="22"/>
-                <w:lang w:val="es-ES" w:eastAsia="es-ES" w:bidi="ar-SA"/>
+                <w:rFonts w:asciiTheme="minorHAnsi" w:hAnsiTheme="minorHAnsi" w:ascii="Calibri" w:hAnsi="Calibri"/>
+                <w:sz w:val="22"/>
+                <w:szCs w:val="22"/>
               </w:rPr>
             </w:r>
           </w:p>
@@ -3001,6 +3130,7 @@
                 <w:ilvl w:val="0"/>
                 <w:numId w:val="1"/>
               </w:numPr>
+              <w:suppressAutoHyphens w:val="true"/>
               <w:spacing w:before="0" w:after="0"/>
               <w:jc w:val="left"/>
               <w:rPr>
@@ -3040,6 +3170,7 @@
             <w:pPr>
               <w:pStyle w:val="Normal"/>
               <w:widowControl/>
+              <w:suppressAutoHyphens w:val="true"/>
               <w:spacing w:before="0" w:after="0"/>
               <w:jc w:val="both"/>
               <w:rPr>
@@ -3081,6 +3212,7 @@
             <w:pPr>
               <w:pStyle w:val="Normal"/>
               <w:widowControl/>
+              <w:suppressAutoHyphens w:val="true"/>
               <w:spacing w:before="0" w:after="0"/>
               <w:jc w:val="both"/>
               <w:rPr>
@@ -3090,18 +3222,16 @@
             </w:pPr>
             <w:r>
               <w:rPr>
-                <w:rFonts w:eastAsia="Times New Roman" w:cs="Times New Roman" w:ascii="Calibri" w:hAnsi="Calibri"/>
-                <w:kern w:val="0"/>
-                <w:sz w:val="22"/>
-                <w:szCs w:val="20"/>
-                <w:lang w:val="es-ES" w:eastAsia="es-ES" w:bidi="ar-SA"/>
-              </w:rPr>
-            </w:r>
-          </w:p>
-          <w:p>
-            <w:pPr>
-              <w:pStyle w:val="Normal"/>
-              <w:widowControl/>
+                <w:rFonts w:ascii="Calibri" w:hAnsi="Calibri"/>
+                <w:sz w:val="22"/>
+              </w:rPr>
+            </w:r>
+          </w:p>
+          <w:p>
+            <w:pPr>
+              <w:pStyle w:val="Normal"/>
+              <w:widowControl/>
+              <w:suppressAutoHyphens w:val="true"/>
               <w:spacing w:before="0" w:after="0"/>
               <w:jc w:val="both"/>
               <w:rPr>
@@ -3112,11 +3242,9 @@
             </w:pPr>
             <w:r>
               <w:rPr>
-                <w:rFonts w:eastAsia="Times New Roman" w:cs="Times New Roman" w:ascii="Calibri" w:hAnsi="Calibri"/>
-                <w:kern w:val="0"/>
-                <w:sz w:val="22"/>
-                <w:szCs w:val="22"/>
-                <w:lang w:val="es-ES" w:eastAsia="es-ES" w:bidi="ar-SA"/>
+                <w:rFonts w:asciiTheme="minorHAnsi" w:hAnsiTheme="minorHAnsi" w:ascii="Calibri" w:hAnsi="Calibri"/>
+                <w:sz w:val="22"/>
+                <w:szCs w:val="22"/>
               </w:rPr>
             </w:r>
           </w:p>
@@ -3178,6 +3306,7 @@
                 <w:ilvl w:val="0"/>
                 <w:numId w:val="1"/>
               </w:numPr>
+              <w:suppressAutoHyphens w:val="true"/>
               <w:spacing w:before="0" w:after="0"/>
               <w:jc w:val="left"/>
               <w:rPr>
@@ -3227,6 +3356,7 @@
             <w:pPr>
               <w:pStyle w:val="Normal"/>
               <w:widowControl/>
+              <w:suppressAutoHyphens w:val="true"/>
               <w:spacing w:before="0" w:after="0"/>
               <w:jc w:val="left"/>
               <w:rPr>
@@ -3268,6 +3398,7 @@
             <w:pPr>
               <w:pStyle w:val="Normal"/>
               <w:widowControl/>
+              <w:suppressAutoHyphens w:val="true"/>
               <w:spacing w:before="0" w:after="0"/>
               <w:contextualSpacing/>
               <w:jc w:val="both"/>
@@ -3733,21 +3864,12 @@
                 </w:r>
               </w:sdtContent>
             </w:sdt>
-            <w:r>
-              <w:rPr>
-                <w:rFonts w:eastAsia="Times New Roman" w:cs="Verdana" w:ascii="Calibri" w:hAnsi="Calibri" w:asciiTheme="minorHAnsi" w:hAnsiTheme="minorHAnsi"/>
-                <w:kern w:val="0"/>
-                <w:sz w:val="22"/>
-                <w:szCs w:val="22"/>
-                <w:lang w:val="es-ES" w:eastAsia="es-ES" w:bidi="ar-SA"/>
-              </w:rPr>
-              <w:t xml:space="preserve"> </w:t>
-            </w:r>
-          </w:p>
-          <w:p>
-            <w:pPr>
-              <w:pStyle w:val="Normal"/>
-              <w:widowControl/>
+          </w:p>
+          <w:p>
+            <w:pPr>
+              <w:pStyle w:val="Normal"/>
+              <w:widowControl/>
+              <w:suppressAutoHyphens w:val="true"/>
               <w:spacing w:before="0" w:after="0"/>
               <w:contextualSpacing/>
               <w:jc w:val="both"/>
@@ -3759,18 +3881,17 @@
             </w:pPr>
             <w:r>
               <w:rPr>
-                <w:rFonts w:eastAsia="Times New Roman" w:cs="Calibri" w:cstheme="minorHAnsi" w:ascii="Calibri" w:hAnsi="Calibri"/>
-                <w:kern w:val="0"/>
-                <w:sz w:val="22"/>
-                <w:szCs w:val="22"/>
-                <w:lang w:val="es-ES" w:eastAsia="es-ES" w:bidi="ar-SA"/>
-              </w:rPr>
-            </w:r>
-          </w:p>
-          <w:p>
-            <w:pPr>
-              <w:pStyle w:val="Normal"/>
-              <w:widowControl/>
+                <w:rFonts w:cs="Calibri" w:cstheme="minorHAnsi" w:ascii="Calibri" w:hAnsi="Calibri"/>
+                <w:sz w:val="22"/>
+                <w:szCs w:val="22"/>
+              </w:rPr>
+            </w:r>
+          </w:p>
+          <w:p>
+            <w:pPr>
+              <w:pStyle w:val="Normal"/>
+              <w:widowControl/>
+              <w:suppressAutoHyphens w:val="true"/>
               <w:spacing w:before="0" w:after="0"/>
               <w:contextualSpacing/>
               <w:jc w:val="both"/>
@@ -3795,6 +3916,7 @@
             <w:pPr>
               <w:pStyle w:val="Normal"/>
               <w:widowControl/>
+              <w:suppressAutoHyphens w:val="true"/>
               <w:spacing w:before="0" w:after="0"/>
               <w:contextualSpacing/>
               <w:jc w:val="both"/>
@@ -3806,18 +3928,17 @@
             </w:pPr>
             <w:r>
               <w:rPr>
-                <w:rFonts w:eastAsia="Times New Roman" w:cs="Calibri" w:cstheme="minorHAnsi" w:ascii="Calibri" w:hAnsi="Calibri"/>
+                <w:rFonts w:cs="Calibri" w:cstheme="minorHAnsi" w:ascii="Calibri" w:hAnsi="Calibri"/>
                 <w:color w:themeColor="text1" w:val="000000"/>
-                <w:kern w:val="0"/>
                 <w:szCs w:val="24"/>
-                <w:lang w:val="es-ES" w:eastAsia="es-ES" w:bidi="ar-SA"/>
-              </w:rPr>
-            </w:r>
-          </w:p>
-          <w:p>
-            <w:pPr>
-              <w:pStyle w:val="Normal"/>
-              <w:widowControl/>
+              </w:rPr>
+            </w:r>
+          </w:p>
+          <w:p>
+            <w:pPr>
+              <w:pStyle w:val="Normal"/>
+              <w:widowControl/>
+              <w:suppressAutoHyphens w:val="true"/>
               <w:spacing w:before="0" w:after="0"/>
               <w:contextualSpacing/>
               <w:jc w:val="both"/>
@@ -3829,11 +3950,9 @@
             </w:pPr>
             <w:r>
               <w:rPr>
-                <w:rFonts w:eastAsia="Times New Roman" w:cs="Times New Roman" w:ascii="Times New Roman" w:hAnsi="Times New Roman"/>
+                <w:rFonts w:ascii="Times New Roman" w:hAnsi="Times New Roman"/>
                 <w:color w:themeColor="text1" w:val="000000"/>
-                <w:kern w:val="0"/>
                 <w:szCs w:val="24"/>
-                <w:lang w:val="es-ES" w:eastAsia="es-ES" w:bidi="ar-SA"/>
               </w:rPr>
             </w:r>
           </w:p>
@@ -3859,6 +3978,7 @@
             <w:pPr>
               <w:pStyle w:val="Normal"/>
               <w:widowControl/>
+              <w:suppressAutoHyphens w:val="true"/>
               <w:spacing w:before="0" w:after="0"/>
               <w:jc w:val="both"/>
               <w:rPr>
@@ -3872,13 +3992,14 @@
                 <w:szCs w:val="20"/>
                 <w:lang w:val="es-ES" w:eastAsia="es-ES" w:bidi="ar-SA"/>
               </w:rPr>
-              <w:t xml:space="preserve">Medios y recursos didácticos: </w:t>
+              <w:t>Medios y recursos didácticos:</w:t>
             </w:r>
           </w:p>
           <w:p>
             <w:pPr>
               <w:pStyle w:val="ListParagraph"/>
               <w:widowControl/>
+              <w:suppressAutoHyphens w:val="true"/>
               <w:spacing w:before="0" w:after="0"/>
               <w:ind w:left="360"/>
               <w:jc w:val="both"/>
@@ -3888,9 +4009,7 @@
             </w:pPr>
             <w:r>
               <w:rPr>
-                <w:rFonts w:eastAsia="Times New Roman" w:ascii="Calibri" w:hAnsi="Calibri"/>
-                <w:kern w:val="0"/>
-                <w:lang w:val="es-ES" w:eastAsia="es-ES" w:bidi="ar-SA"/>
+                <w:rFonts w:asciiTheme="minorHAnsi" w:hAnsiTheme="minorHAnsi" w:ascii="Calibri" w:hAnsi="Calibri"/>
               </w:rPr>
             </w:r>
           </w:p>
@@ -3916,6 +4035,7 @@
             <w:pPr>
               <w:pStyle w:val="Normal"/>
               <w:widowControl/>
+              <w:suppressAutoHyphens w:val="true"/>
               <w:spacing w:before="0" w:after="0"/>
               <w:jc w:val="both"/>
               <w:rPr>
@@ -3929,13 +4049,14 @@
                 <w:szCs w:val="20"/>
                 <w:lang w:val="es-ES" w:eastAsia="es-ES" w:bidi="ar-SA"/>
               </w:rPr>
-              <w:t xml:space="preserve">Formas de interacción en los ambientes de aprendizaje y de acompañamiento del trabajo independiente del estudiante: </w:t>
+              <w:t>Formas de interacción en los ambientes de aprendizaje y de acompañamiento del trabajo independiente del estudiante:</w:t>
             </w:r>
           </w:p>
           <w:p>
             <w:pPr>
               <w:pStyle w:val="ListParagraph"/>
               <w:widowControl/>
+              <w:suppressAutoHyphens w:val="true"/>
               <w:spacing w:before="0" w:after="0"/>
               <w:ind w:left="360"/>
               <w:jc w:val="both"/>
@@ -3945,9 +4066,7 @@
             </w:pPr>
             <w:r>
               <w:rPr>
-                <w:rFonts w:eastAsia="Times New Roman" w:ascii="Calibri" w:hAnsi="Calibri"/>
-                <w:kern w:val="0"/>
-                <w:lang w:val="es-ES" w:eastAsia="es-ES" w:bidi="ar-SA"/>
+                <w:rFonts w:asciiTheme="minorHAnsi" w:hAnsiTheme="minorHAnsi" w:ascii="Calibri" w:hAnsi="Calibri"/>
               </w:rPr>
             </w:r>
           </w:p>
@@ -3973,6 +4092,7 @@
             <w:pPr>
               <w:pStyle w:val="Normal"/>
               <w:widowControl/>
+              <w:suppressAutoHyphens w:val="true"/>
               <w:spacing w:before="0" w:after="0"/>
               <w:jc w:val="both"/>
               <w:rPr>
@@ -3993,6 +4113,7 @@
             <w:pPr>
               <w:pStyle w:val="Normal"/>
               <w:widowControl/>
+              <w:suppressAutoHyphens w:val="true"/>
               <w:spacing w:before="0" w:after="0"/>
               <w:jc w:val="both"/>
               <w:rPr>
@@ -4001,10 +4122,7 @@
             </w:pPr>
             <w:r>
               <w:rPr>
-                <w:rFonts w:eastAsia="Times New Roman" w:cs="Times New Roman" w:ascii="Calibri" w:hAnsi="Calibri"/>
-                <w:kern w:val="0"/>
-                <w:szCs w:val="20"/>
-                <w:lang w:val="es-ES" w:eastAsia="es-ES" w:bidi="ar-SA"/>
+                <w:rFonts w:asciiTheme="minorHAnsi" w:hAnsiTheme="minorHAnsi" w:ascii="Calibri" w:hAnsi="Calibri"/>
               </w:rPr>
             </w:r>
           </w:p>
@@ -4012,6 +4130,7 @@
             <w:pPr>
               <w:pStyle w:val="ListParagraph"/>
               <w:widowControl/>
+              <w:suppressAutoHyphens w:val="true"/>
               <w:spacing w:before="0" w:after="0"/>
               <w:ind w:left="360"/>
               <w:jc w:val="both"/>
@@ -4021,9 +4140,7 @@
             </w:pPr>
             <w:r>
               <w:rPr>
-                <w:rFonts w:eastAsia="Times New Roman" w:ascii="Calibri" w:hAnsi="Calibri"/>
-                <w:kern w:val="0"/>
-                <w:lang w:val="es-ES" w:eastAsia="es-ES" w:bidi="ar-SA"/>
+                <w:rFonts w:asciiTheme="minorHAnsi" w:hAnsiTheme="minorHAnsi" w:ascii="Calibri" w:hAnsi="Calibri"/>
               </w:rPr>
             </w:r>
           </w:p>
@@ -4049,6 +4166,7 @@
             <w:pPr>
               <w:pStyle w:val="Normal"/>
               <w:widowControl/>
+              <w:suppressAutoHyphens w:val="true"/>
               <w:spacing w:before="0" w:after="0"/>
               <w:jc w:val="both"/>
               <w:rPr>
@@ -4069,6 +4187,7 @@
             <w:pPr>
               <w:pStyle w:val="ListParagraph"/>
               <w:widowControl/>
+              <w:suppressAutoHyphens w:val="true"/>
               <w:spacing w:before="0" w:after="0"/>
               <w:ind w:left="360"/>
               <w:jc w:val="both"/>
@@ -4078,9 +4197,7 @@
             </w:pPr>
             <w:r>
               <w:rPr>
-                <w:rFonts w:eastAsia="Times New Roman" w:ascii="Calibri" w:hAnsi="Calibri"/>
-                <w:kern w:val="0"/>
-                <w:lang w:val="es-ES" w:eastAsia="es-ES" w:bidi="ar-SA"/>
+                <w:rFonts w:asciiTheme="minorHAnsi" w:hAnsiTheme="minorHAnsi" w:ascii="Calibri" w:hAnsi="Calibri"/>
               </w:rPr>
             </w:r>
           </w:p>
@@ -4144,6 +4261,7 @@
                 <w:ilvl w:val="0"/>
                 <w:numId w:val="1"/>
               </w:numPr>
+              <w:suppressAutoHyphens w:val="true"/>
               <w:spacing w:before="0" w:after="0"/>
               <w:jc w:val="left"/>
               <w:rPr>
@@ -4193,6 +4311,7 @@
             <w:pPr>
               <w:pStyle w:val="Normal"/>
               <w:widowControl/>
+              <w:suppressAutoHyphens w:val="true"/>
               <w:spacing w:before="0" w:after="0"/>
               <w:jc w:val="both"/>
               <w:rPr>
@@ -4233,6 +4352,7 @@
             <w:pPr>
               <w:pStyle w:val="Normal"/>
               <w:widowControl/>
+              <w:suppressAutoHyphens w:val="true"/>
               <w:spacing w:before="0" w:after="0"/>
               <w:jc w:val="both"/>
               <w:rPr>
@@ -4253,6 +4373,7 @@
             <w:pPr>
               <w:pStyle w:val="ListParagraph"/>
               <w:widowControl/>
+              <w:suppressAutoHyphens w:val="true"/>
               <w:spacing w:before="0" w:after="0"/>
               <w:ind w:left="360"/>
               <w:jc w:val="both"/>
@@ -4262,9 +4383,7 @@
             </w:pPr>
             <w:r>
               <w:rPr>
-                <w:rFonts w:eastAsia="Times New Roman" w:ascii="Calibri" w:hAnsi="Calibri"/>
-                <w:kern w:val="0"/>
-                <w:lang w:val="es-ES" w:eastAsia="es-ES" w:bidi="ar-SA"/>
+                <w:rFonts w:ascii="Calibri" w:hAnsi="Calibri"/>
               </w:rPr>
             </w:r>
           </w:p>
@@ -4289,6 +4408,7 @@
             <w:pPr>
               <w:pStyle w:val="Normal"/>
               <w:widowControl/>
+              <w:suppressAutoHyphens w:val="true"/>
               <w:spacing w:before="0" w:after="0"/>
               <w:jc w:val="both"/>
               <w:rPr>
@@ -4338,6 +4458,7 @@
             <w:pPr>
               <w:pStyle w:val="ListParagraph"/>
               <w:widowControl/>
+              <w:suppressAutoHyphens w:val="true"/>
               <w:spacing w:before="0" w:after="0"/>
               <w:ind w:left="360"/>
               <w:jc w:val="both"/>
@@ -4347,9 +4468,7 @@
             </w:pPr>
             <w:r>
               <w:rPr>
-                <w:rFonts w:eastAsia="Times New Roman" w:ascii="Calibri" w:hAnsi="Calibri"/>
-                <w:kern w:val="0"/>
-                <w:lang w:val="es-ES" w:eastAsia="es-ES" w:bidi="ar-SA"/>
+                <w:rFonts w:ascii="Calibri" w:hAnsi="Calibri"/>
               </w:rPr>
             </w:r>
           </w:p>
@@ -4375,6 +4494,7 @@
             <w:pPr>
               <w:pStyle w:val="Normal"/>
               <w:widowControl/>
+              <w:suppressAutoHyphens w:val="true"/>
               <w:spacing w:before="0" w:after="0"/>
               <w:jc w:val="both"/>
               <w:rPr>
@@ -4423,6 +4543,7 @@
             <w:pPr>
               <w:pStyle w:val="Normal"/>
               <w:widowControl/>
+              <w:suppressAutoHyphens w:val="true"/>
               <w:spacing w:before="0" w:after="0"/>
               <w:jc w:val="center"/>
               <w:rPr>
@@ -4461,6 +4582,7 @@
             <w:pPr>
               <w:pStyle w:val="Normal"/>
               <w:widowControl/>
+              <w:suppressAutoHyphens w:val="true"/>
               <w:spacing w:before="0" w:after="0"/>
               <w:jc w:val="center"/>
               <w:rPr>
@@ -4504,6 +4626,7 @@
             <w:pPr>
               <w:pStyle w:val="Normal"/>
               <w:widowControl/>
+              <w:suppressAutoHyphens w:val="true"/>
               <w:spacing w:before="0" w:after="0"/>
               <w:jc w:val="left"/>
               <w:rPr>
@@ -4512,10 +4635,7 @@
             </w:pPr>
             <w:r>
               <w:rPr>
-                <w:rFonts w:eastAsia="Times New Roman" w:cs="Times New Roman" w:ascii="Calibri" w:hAnsi="Calibri"/>
-                <w:kern w:val="0"/>
-                <w:szCs w:val="20"/>
-                <w:lang w:val="es-ES" w:eastAsia="es-ES" w:bidi="ar-SA"/>
+                <w:rFonts w:asciiTheme="minorHAnsi" w:hAnsiTheme="minorHAnsi" w:ascii="Calibri" w:hAnsi="Calibri"/>
               </w:rPr>
             </w:r>
           </w:p>
@@ -4536,6 +4656,7 @@
             <w:pPr>
               <w:pStyle w:val="Normal"/>
               <w:widowControl/>
+              <w:suppressAutoHyphens w:val="true"/>
               <w:spacing w:before="0" w:after="0"/>
               <w:jc w:val="left"/>
               <w:rPr>
@@ -4546,11 +4667,9 @@
             </w:pPr>
             <w:r>
               <w:rPr>
-                <w:rFonts w:eastAsia="Times New Roman" w:cs="Arial" w:ascii="Calibri" w:hAnsi="Calibri"/>
-                <w:kern w:val="0"/>
+                <w:rFonts w:cs="Arial" w:ascii="Calibri" w:hAnsi="Calibri"/>
                 <w:sz w:val="20"/>
                 <w:szCs w:val="18"/>
-                <w:lang w:val="es-ES" w:eastAsia="es-ES" w:bidi="ar-SA"/>
               </w:rPr>
             </w:r>
           </w:p>
@@ -4576,6 +4695,7 @@
             <w:pPr>
               <w:pStyle w:val="Normal"/>
               <w:widowControl/>
+              <w:suppressAutoHyphens w:val="true"/>
               <w:spacing w:before="0" w:after="0"/>
               <w:jc w:val="left"/>
               <w:rPr>
@@ -4584,10 +4704,7 @@
             </w:pPr>
             <w:r>
               <w:rPr>
-                <w:rFonts w:eastAsia="Times New Roman" w:cs="Times New Roman" w:ascii="Calibri" w:hAnsi="Calibri"/>
-                <w:kern w:val="0"/>
-                <w:szCs w:val="20"/>
-                <w:lang w:val="es-ES" w:eastAsia="es-ES" w:bidi="ar-SA"/>
+                <w:rFonts w:asciiTheme="minorHAnsi" w:hAnsiTheme="minorHAnsi" w:ascii="Calibri" w:hAnsi="Calibri"/>
               </w:rPr>
             </w:r>
           </w:p>
@@ -4608,6 +4725,7 @@
             <w:pPr>
               <w:pStyle w:val="Normal"/>
               <w:widowControl/>
+              <w:suppressAutoHyphens w:val="true"/>
               <w:spacing w:before="0" w:after="0"/>
               <w:jc w:val="left"/>
               <w:rPr>
@@ -4618,11 +4736,9 @@
             </w:pPr>
             <w:r>
               <w:rPr>
-                <w:rFonts w:eastAsia="Times New Roman" w:cs="Arial" w:ascii="Calibri" w:hAnsi="Calibri"/>
-                <w:kern w:val="0"/>
+                <w:rFonts w:cs="Arial" w:ascii="Calibri" w:hAnsi="Calibri"/>
                 <w:sz w:val="20"/>
                 <w:szCs w:val="18"/>
-                <w:lang w:val="es-ES" w:eastAsia="es-ES" w:bidi="ar-SA"/>
               </w:rPr>
             </w:r>
           </w:p>
@@ -4648,6 +4764,7 @@
             <w:pPr>
               <w:pStyle w:val="Normal"/>
               <w:widowControl/>
+              <w:suppressAutoHyphens w:val="true"/>
               <w:spacing w:before="0" w:after="0"/>
               <w:jc w:val="left"/>
               <w:rPr>
@@ -4656,10 +4773,7 @@
             </w:pPr>
             <w:r>
               <w:rPr>
-                <w:rFonts w:eastAsia="Times New Roman" w:cs="Times New Roman" w:ascii="Calibri" w:hAnsi="Calibri"/>
-                <w:kern w:val="0"/>
-                <w:szCs w:val="20"/>
-                <w:lang w:val="es-ES" w:eastAsia="es-ES" w:bidi="ar-SA"/>
+                <w:rFonts w:asciiTheme="minorHAnsi" w:hAnsiTheme="minorHAnsi" w:ascii="Calibri" w:hAnsi="Calibri"/>
               </w:rPr>
             </w:r>
           </w:p>
@@ -4680,6 +4794,7 @@
             <w:pPr>
               <w:pStyle w:val="Normal"/>
               <w:widowControl/>
+              <w:suppressAutoHyphens w:val="true"/>
               <w:spacing w:before="0" w:after="0"/>
               <w:jc w:val="left"/>
               <w:rPr>
@@ -4690,11 +4805,9 @@
             </w:pPr>
             <w:r>
               <w:rPr>
-                <w:rFonts w:eastAsia="Times New Roman" w:cs="Arial" w:ascii="Calibri" w:hAnsi="Calibri"/>
-                <w:kern w:val="0"/>
+                <w:rFonts w:cs="Arial" w:ascii="Calibri" w:hAnsi="Calibri"/>
                 <w:sz w:val="20"/>
                 <w:szCs w:val="18"/>
-                <w:lang w:val="es-ES" w:eastAsia="es-ES" w:bidi="ar-SA"/>
               </w:rPr>
             </w:r>
           </w:p>
@@ -4720,6 +4833,7 @@
             <w:pPr>
               <w:pStyle w:val="Normal"/>
               <w:widowControl/>
+              <w:suppressAutoHyphens w:val="true"/>
               <w:spacing w:before="0" w:after="0"/>
               <w:jc w:val="left"/>
               <w:rPr>
@@ -4728,10 +4842,7 @@
             </w:pPr>
             <w:r>
               <w:rPr>
-                <w:rFonts w:eastAsia="Times New Roman" w:cs="Times New Roman" w:ascii="Calibri" w:hAnsi="Calibri"/>
-                <w:kern w:val="0"/>
-                <w:szCs w:val="20"/>
-                <w:lang w:val="es-ES" w:eastAsia="es-ES" w:bidi="ar-SA"/>
+                <w:rFonts w:asciiTheme="minorHAnsi" w:hAnsiTheme="minorHAnsi" w:ascii="Calibri" w:hAnsi="Calibri"/>
               </w:rPr>
             </w:r>
           </w:p>
@@ -4752,6 +4863,7 @@
             <w:pPr>
               <w:pStyle w:val="Normal"/>
               <w:widowControl/>
+              <w:suppressAutoHyphens w:val="true"/>
               <w:spacing w:before="0" w:after="0"/>
               <w:jc w:val="left"/>
               <w:rPr>
@@ -4762,11 +4874,9 @@
             </w:pPr>
             <w:r>
               <w:rPr>
-                <w:rFonts w:eastAsia="Times New Roman" w:cs="Arial" w:ascii="Calibri" w:hAnsi="Calibri"/>
-                <w:kern w:val="0"/>
+                <w:rFonts w:cs="Arial" w:ascii="Calibri" w:hAnsi="Calibri"/>
                 <w:sz w:val="20"/>
                 <w:szCs w:val="18"/>
-                <w:lang w:val="es-ES" w:eastAsia="es-ES" w:bidi="ar-SA"/>
               </w:rPr>
             </w:r>
           </w:p>
@@ -4792,6 +4902,7 @@
             <w:pPr>
               <w:pStyle w:val="Normal"/>
               <w:widowControl/>
+              <w:suppressAutoHyphens w:val="true"/>
               <w:spacing w:before="0" w:after="0"/>
               <w:jc w:val="left"/>
               <w:rPr>
@@ -4800,10 +4911,7 @@
             </w:pPr>
             <w:r>
               <w:rPr>
-                <w:rFonts w:eastAsia="Times New Roman" w:cs="Times New Roman" w:ascii="Calibri" w:hAnsi="Calibri"/>
-                <w:kern w:val="0"/>
-                <w:szCs w:val="20"/>
-                <w:lang w:val="es-ES" w:eastAsia="es-ES" w:bidi="ar-SA"/>
+                <w:rFonts w:asciiTheme="minorHAnsi" w:hAnsiTheme="minorHAnsi" w:ascii="Calibri" w:hAnsi="Calibri"/>
               </w:rPr>
             </w:r>
           </w:p>
@@ -4824,6 +4932,7 @@
             <w:pPr>
               <w:pStyle w:val="Normal"/>
               <w:widowControl/>
+              <w:suppressAutoHyphens w:val="true"/>
               <w:spacing w:before="0" w:after="0"/>
               <w:jc w:val="left"/>
               <w:rPr>
@@ -4834,11 +4943,9 @@
             </w:pPr>
             <w:r>
               <w:rPr>
-                <w:rFonts w:eastAsia="Times New Roman" w:cs="Arial" w:ascii="Calibri" w:hAnsi="Calibri"/>
-                <w:kern w:val="0"/>
+                <w:rFonts w:cs="Arial" w:ascii="Calibri" w:hAnsi="Calibri"/>
                 <w:sz w:val="20"/>
                 <w:szCs w:val="18"/>
-                <w:lang w:val="es-ES" w:eastAsia="es-ES" w:bidi="ar-SA"/>
               </w:rPr>
             </w:r>
           </w:p>
@@ -4903,6 +5010,7 @@
                 <w:ilvl w:val="0"/>
                 <w:numId w:val="1"/>
               </w:numPr>
+              <w:suppressAutoHyphens w:val="true"/>
               <w:spacing w:before="0" w:after="0"/>
               <w:jc w:val="left"/>
               <w:rPr>
@@ -4943,6 +5051,7 @@
             <w:pPr>
               <w:pStyle w:val="Normal"/>
               <w:widowControl/>
+              <w:suppressAutoHyphens w:val="true"/>
               <w:spacing w:before="0" w:after="0"/>
               <w:jc w:val="both"/>
               <w:rPr>
@@ -4984,6 +5093,7 @@
             <w:pPr>
               <w:pStyle w:val="Normal"/>
               <w:widowControl/>
+              <w:suppressAutoHyphens w:val="true"/>
               <w:spacing w:before="0" w:after="0"/>
               <w:jc w:val="center"/>
               <w:rPr>
@@ -5022,6 +5132,7 @@
             <w:pPr>
               <w:pStyle w:val="Normal"/>
               <w:widowControl/>
+              <w:suppressAutoHyphens w:val="true"/>
               <w:spacing w:before="0" w:after="0"/>
               <w:jc w:val="center"/>
               <w:rPr>
@@ -5060,6 +5171,7 @@
             <w:pPr>
               <w:pStyle w:val="Normal"/>
               <w:widowControl/>
+              <w:suppressAutoHyphens w:val="true"/>
               <w:spacing w:before="0" w:after="0"/>
               <w:jc w:val="center"/>
               <w:rPr>
@@ -5103,6 +5215,7 @@
             <w:pPr>
               <w:pStyle w:val="Normal"/>
               <w:widowControl/>
+              <w:suppressAutoHyphens w:val="true"/>
               <w:spacing w:before="0" w:after="0"/>
               <w:jc w:val="left"/>
               <w:rPr>
@@ -5113,11 +5226,9 @@
             </w:pPr>
             <w:r>
               <w:rPr>
-                <w:rFonts w:eastAsia="Times New Roman" w:cs="Calibri" w:cstheme="minorHAnsi" w:ascii="Calibri" w:hAnsi="Calibri"/>
-                <w:kern w:val="0"/>
-                <w:sz w:val="22"/>
-                <w:szCs w:val="22"/>
-                <w:lang w:val="es-ES" w:eastAsia="es-ES" w:bidi="ar-SA"/>
+                <w:rFonts w:cs="Calibri" w:cstheme="minorHAnsi" w:ascii="Calibri" w:hAnsi="Calibri"/>
+                <w:sz w:val="22"/>
+                <w:szCs w:val="22"/>
               </w:rPr>
             </w:r>
           </w:p>
@@ -5138,6 +5249,7 @@
             <w:pPr>
               <w:pStyle w:val="Normal"/>
               <w:widowControl/>
+              <w:suppressAutoHyphens w:val="true"/>
               <w:spacing w:before="0" w:after="0"/>
               <w:jc w:val="center"/>
               <w:rPr>
@@ -5148,11 +5260,9 @@
             </w:pPr>
             <w:r>
               <w:rPr>
-                <w:rFonts w:eastAsia="Times New Roman" w:cs="Calibri" w:cstheme="minorHAnsi" w:ascii="Calibri" w:hAnsi="Calibri"/>
-                <w:kern w:val="0"/>
-                <w:sz w:val="22"/>
-                <w:szCs w:val="22"/>
-                <w:lang w:val="es-ES" w:eastAsia="es-ES" w:bidi="ar-SA"/>
+                <w:rFonts w:cs="Calibri" w:cstheme="minorHAnsi" w:ascii="Calibri" w:hAnsi="Calibri"/>
+                <w:sz w:val="22"/>
+                <w:szCs w:val="22"/>
               </w:rPr>
             </w:r>
           </w:p>
@@ -5172,6 +5282,7 @@
             <w:pPr>
               <w:pStyle w:val="Normal"/>
               <w:widowControl/>
+              <w:suppressAutoHyphens w:val="true"/>
               <w:spacing w:before="0" w:after="0"/>
               <w:jc w:val="center"/>
               <w:rPr>
@@ -5182,11 +5293,9 @@
             </w:pPr>
             <w:r>
               <w:rPr>
-                <w:rFonts w:eastAsia="Times New Roman" w:cs="Calibri" w:cstheme="minorHAnsi" w:ascii="Calibri" w:hAnsi="Calibri"/>
-                <w:kern w:val="0"/>
-                <w:sz w:val="22"/>
-                <w:szCs w:val="22"/>
-                <w:lang w:val="es-ES" w:eastAsia="es-ES" w:bidi="ar-SA"/>
+                <w:rFonts w:cs="Calibri" w:cstheme="minorHAnsi" w:ascii="Calibri" w:hAnsi="Calibri"/>
+                <w:sz w:val="22"/>
+                <w:szCs w:val="22"/>
               </w:rPr>
             </w:r>
           </w:p>
@@ -5212,6 +5321,7 @@
             <w:pPr>
               <w:pStyle w:val="Normal"/>
               <w:widowControl/>
+              <w:suppressAutoHyphens w:val="true"/>
               <w:spacing w:before="0" w:after="0"/>
               <w:jc w:val="left"/>
               <w:rPr>
@@ -5222,11 +5332,9 @@
             </w:pPr>
             <w:r>
               <w:rPr>
-                <w:rFonts w:eastAsia="Times New Roman" w:cs="Calibri" w:cstheme="minorHAnsi" w:ascii="Calibri" w:hAnsi="Calibri"/>
-                <w:kern w:val="0"/>
-                <w:sz w:val="22"/>
-                <w:szCs w:val="22"/>
-                <w:lang w:val="es-ES" w:eastAsia="es-ES" w:bidi="ar-SA"/>
+                <w:rFonts w:cs="Calibri" w:cstheme="minorHAnsi" w:ascii="Calibri" w:hAnsi="Calibri"/>
+                <w:sz w:val="22"/>
+                <w:szCs w:val="22"/>
               </w:rPr>
             </w:r>
           </w:p>
@@ -5247,6 +5355,7 @@
             <w:pPr>
               <w:pStyle w:val="Normal"/>
               <w:widowControl/>
+              <w:suppressAutoHyphens w:val="true"/>
               <w:spacing w:before="0" w:after="0"/>
               <w:jc w:val="center"/>
               <w:rPr>
@@ -5257,11 +5366,9 @@
             </w:pPr>
             <w:r>
               <w:rPr>
-                <w:rFonts w:eastAsia="Times New Roman" w:cs="Calibri" w:cstheme="minorHAnsi" w:ascii="Calibri" w:hAnsi="Calibri"/>
-                <w:kern w:val="0"/>
-                <w:sz w:val="22"/>
-                <w:szCs w:val="22"/>
-                <w:lang w:val="es-ES" w:eastAsia="es-ES" w:bidi="ar-SA"/>
+                <w:rFonts w:cs="Calibri" w:cstheme="minorHAnsi" w:ascii="Calibri" w:hAnsi="Calibri"/>
+                <w:sz w:val="22"/>
+                <w:szCs w:val="22"/>
               </w:rPr>
             </w:r>
           </w:p>
@@ -5281,6 +5388,7 @@
             <w:pPr>
               <w:pStyle w:val="Normal"/>
               <w:widowControl/>
+              <w:suppressAutoHyphens w:val="true"/>
               <w:spacing w:before="0" w:after="0"/>
               <w:jc w:val="center"/>
               <w:rPr>
@@ -5291,11 +5399,9 @@
             </w:pPr>
             <w:r>
               <w:rPr>
-                <w:rFonts w:eastAsia="Times New Roman" w:cs="Calibri" w:cstheme="minorHAnsi" w:ascii="Calibri" w:hAnsi="Calibri"/>
-                <w:kern w:val="0"/>
-                <w:sz w:val="22"/>
-                <w:szCs w:val="22"/>
-                <w:lang w:val="es-ES" w:eastAsia="es-ES" w:bidi="ar-SA"/>
+                <w:rFonts w:cs="Calibri" w:cstheme="minorHAnsi" w:ascii="Calibri" w:hAnsi="Calibri"/>
+                <w:sz w:val="22"/>
+                <w:szCs w:val="22"/>
               </w:rPr>
             </w:r>
           </w:p>
@@ -5321,6 +5427,7 @@
             <w:pPr>
               <w:pStyle w:val="Normal"/>
               <w:widowControl/>
+              <w:suppressAutoHyphens w:val="true"/>
               <w:spacing w:before="0" w:after="0"/>
               <w:jc w:val="left"/>
               <w:rPr>
@@ -5331,11 +5438,9 @@
             </w:pPr>
             <w:r>
               <w:rPr>
-                <w:rFonts w:eastAsia="Times New Roman" w:cs="Calibri" w:cstheme="minorHAnsi" w:ascii="Calibri" w:hAnsi="Calibri"/>
-                <w:kern w:val="0"/>
-                <w:sz w:val="22"/>
-                <w:szCs w:val="22"/>
-                <w:lang w:val="es-ES" w:eastAsia="es-ES" w:bidi="ar-SA"/>
+                <w:rFonts w:cs="Calibri" w:cstheme="minorHAnsi" w:ascii="Calibri" w:hAnsi="Calibri"/>
+                <w:sz w:val="22"/>
+                <w:szCs w:val="22"/>
               </w:rPr>
             </w:r>
           </w:p>
@@ -5356,6 +5461,7 @@
             <w:pPr>
               <w:pStyle w:val="Normal"/>
               <w:widowControl/>
+              <w:suppressAutoHyphens w:val="true"/>
               <w:spacing w:before="0" w:after="0"/>
               <w:jc w:val="center"/>
               <w:rPr>
@@ -5366,11 +5472,9 @@
             </w:pPr>
             <w:r>
               <w:rPr>
-                <w:rFonts w:eastAsia="Times New Roman" w:cs="Calibri" w:cstheme="minorHAnsi" w:ascii="Calibri" w:hAnsi="Calibri"/>
-                <w:kern w:val="0"/>
-                <w:sz w:val="22"/>
-                <w:szCs w:val="22"/>
-                <w:lang w:val="es-ES" w:eastAsia="es-ES" w:bidi="ar-SA"/>
+                <w:rFonts w:cs="Calibri" w:cstheme="minorHAnsi" w:ascii="Calibri" w:hAnsi="Calibri"/>
+                <w:sz w:val="22"/>
+                <w:szCs w:val="22"/>
               </w:rPr>
             </w:r>
           </w:p>
@@ -5390,6 +5494,7 @@
             <w:pPr>
               <w:pStyle w:val="Normal"/>
               <w:widowControl/>
+              <w:suppressAutoHyphens w:val="true"/>
               <w:spacing w:before="0" w:after="0"/>
               <w:jc w:val="center"/>
               <w:rPr>
@@ -5400,11 +5505,9 @@
             </w:pPr>
             <w:r>
               <w:rPr>
-                <w:rFonts w:eastAsia="Times New Roman" w:cs="Calibri" w:cstheme="minorHAnsi" w:ascii="Calibri" w:hAnsi="Calibri"/>
-                <w:kern w:val="0"/>
-                <w:sz w:val="22"/>
-                <w:szCs w:val="22"/>
-                <w:lang w:val="es-ES" w:eastAsia="es-ES" w:bidi="ar-SA"/>
+                <w:rFonts w:cs="Calibri" w:cstheme="minorHAnsi" w:ascii="Calibri" w:hAnsi="Calibri"/>
+                <w:sz w:val="22"/>
+                <w:szCs w:val="22"/>
               </w:rPr>
             </w:r>
           </w:p>
@@ -5469,6 +5572,7 @@
                 <w:ilvl w:val="0"/>
                 <w:numId w:val="1"/>
               </w:numPr>
+              <w:suppressAutoHyphens w:val="true"/>
               <w:spacing w:before="0" w:after="0"/>
               <w:jc w:val="left"/>
               <w:rPr>
@@ -5508,6 +5612,7 @@
             <w:pPr>
               <w:pStyle w:val="Normal"/>
               <w:widowControl/>
+              <w:suppressAutoHyphens w:val="true"/>
               <w:spacing w:before="0" w:after="0"/>
               <w:jc w:val="center"/>
               <w:rPr>
@@ -5546,6 +5651,7 @@
             <w:pPr>
               <w:pStyle w:val="Normal"/>
               <w:widowControl/>
+              <w:suppressAutoHyphens w:val="true"/>
               <w:spacing w:before="0" w:after="0"/>
               <w:jc w:val="center"/>
               <w:rPr>
@@ -5584,6 +5690,7 @@
             <w:pPr>
               <w:pStyle w:val="Normal"/>
               <w:widowControl/>
+              <w:suppressAutoHyphens w:val="true"/>
               <w:spacing w:before="0" w:after="0"/>
               <w:jc w:val="center"/>
               <w:rPr>
@@ -5629,6 +5736,7 @@
             <w:pPr>
               <w:pStyle w:val="Normal"/>
               <w:widowControl/>
+              <w:suppressAutoHyphens w:val="true"/>
               <w:spacing w:before="0" w:after="0"/>
               <w:jc w:val="left"/>
               <w:rPr>
@@ -5637,10 +5745,7 @@
             </w:pPr>
             <w:r>
               <w:rPr>
-                <w:rFonts w:eastAsia="Times New Roman" w:cs="Times New Roman" w:ascii="Calibri" w:hAnsi="Calibri"/>
-                <w:kern w:val="0"/>
-                <w:szCs w:val="20"/>
-                <w:lang w:val="es-ES" w:eastAsia="es-ES" w:bidi="ar-SA"/>
+                <w:rFonts w:asciiTheme="minorHAnsi" w:hAnsiTheme="minorHAnsi" w:ascii="Calibri" w:hAnsi="Calibri"/>
               </w:rPr>
             </w:r>
           </w:p>
@@ -5661,6 +5766,7 @@
             <w:pPr>
               <w:pStyle w:val="Normal"/>
               <w:widowControl/>
+              <w:suppressAutoHyphens w:val="true"/>
               <w:spacing w:before="0" w:after="0"/>
               <w:jc w:val="center"/>
               <w:rPr>
@@ -5669,10 +5775,7 @@
             </w:pPr>
             <w:r>
               <w:rPr>
-                <w:rFonts w:eastAsia="Times New Roman" w:cs="Times New Roman" w:ascii="Calibri" w:hAnsi="Calibri"/>
-                <w:kern w:val="0"/>
-                <w:szCs w:val="20"/>
-                <w:lang w:val="es-ES" w:eastAsia="es-ES" w:bidi="ar-SA"/>
+                <w:rFonts w:asciiTheme="minorHAnsi" w:hAnsiTheme="minorHAnsi" w:ascii="Calibri" w:hAnsi="Calibri"/>
               </w:rPr>
             </w:r>
           </w:p>
@@ -5693,6 +5796,7 @@
             <w:pPr>
               <w:pStyle w:val="Normal"/>
               <w:widowControl/>
+              <w:suppressAutoHyphens w:val="true"/>
               <w:spacing w:before="0" w:after="0"/>
               <w:jc w:val="center"/>
               <w:rPr>
@@ -5701,10 +5805,7 @@
             </w:pPr>
             <w:r>
               <w:rPr>
-                <w:rFonts w:eastAsia="Times New Roman" w:cs="Times New Roman" w:ascii="Calibri" w:hAnsi="Calibri"/>
-                <w:kern w:val="0"/>
-                <w:szCs w:val="20"/>
-                <w:lang w:val="es-ES" w:eastAsia="es-ES" w:bidi="ar-SA"/>
+                <w:rFonts w:asciiTheme="minorHAnsi" w:hAnsiTheme="minorHAnsi" w:ascii="Calibri" w:hAnsi="Calibri"/>
               </w:rPr>
             </w:r>
           </w:p>
@@ -5730,6 +5831,7 @@
             <w:pPr>
               <w:pStyle w:val="Normal"/>
               <w:widowControl/>
+              <w:suppressAutoHyphens w:val="true"/>
               <w:spacing w:before="0" w:after="0"/>
               <w:jc w:val="left"/>
               <w:rPr>
@@ -5738,10 +5840,7 @@
             </w:pPr>
             <w:r>
               <w:rPr>
-                <w:rFonts w:eastAsia="Times New Roman" w:cs="Times New Roman" w:ascii="Calibri" w:hAnsi="Calibri"/>
-                <w:kern w:val="0"/>
-                <w:szCs w:val="20"/>
-                <w:lang w:val="es-ES" w:eastAsia="es-ES" w:bidi="ar-SA"/>
+                <w:rFonts w:asciiTheme="minorHAnsi" w:hAnsiTheme="minorHAnsi" w:ascii="Calibri" w:hAnsi="Calibri"/>
               </w:rPr>
             </w:r>
           </w:p>
@@ -5762,6 +5861,7 @@
             <w:pPr>
               <w:pStyle w:val="Normal"/>
               <w:widowControl/>
+              <w:suppressAutoHyphens w:val="true"/>
               <w:spacing w:before="0" w:after="0"/>
               <w:jc w:val="center"/>
               <w:rPr>
@@ -5770,10 +5870,7 @@
             </w:pPr>
             <w:r>
               <w:rPr>
-                <w:rFonts w:eastAsia="Times New Roman" w:cs="Times New Roman" w:ascii="Calibri" w:hAnsi="Calibri"/>
-                <w:kern w:val="0"/>
-                <w:szCs w:val="20"/>
-                <w:lang w:val="es-ES" w:eastAsia="es-ES" w:bidi="ar-SA"/>
+                <w:rFonts w:asciiTheme="minorHAnsi" w:hAnsiTheme="minorHAnsi" w:ascii="Calibri" w:hAnsi="Calibri"/>
               </w:rPr>
             </w:r>
           </w:p>
@@ -5794,6 +5891,7 @@
             <w:pPr>
               <w:pStyle w:val="Normal"/>
               <w:widowControl/>
+              <w:suppressAutoHyphens w:val="true"/>
               <w:spacing w:before="0" w:after="0"/>
               <w:jc w:val="center"/>
               <w:rPr>
@@ -5802,10 +5900,7 @@
             </w:pPr>
             <w:r>
               <w:rPr>
-                <w:rFonts w:eastAsia="Times New Roman" w:cs="Times New Roman" w:ascii="Calibri" w:hAnsi="Calibri"/>
-                <w:kern w:val="0"/>
-                <w:szCs w:val="20"/>
-                <w:lang w:val="es-ES" w:eastAsia="es-ES" w:bidi="ar-SA"/>
+                <w:rFonts w:asciiTheme="minorHAnsi" w:hAnsiTheme="minorHAnsi" w:ascii="Calibri" w:hAnsi="Calibri"/>
               </w:rPr>
             </w:r>
           </w:p>
@@ -5831,6 +5926,7 @@
             <w:pPr>
               <w:pStyle w:val="Normal"/>
               <w:widowControl/>
+              <w:suppressAutoHyphens w:val="true"/>
               <w:spacing w:before="0" w:after="0"/>
               <w:jc w:val="left"/>
               <w:rPr>
@@ -5839,10 +5935,7 @@
             </w:pPr>
             <w:r>
               <w:rPr>
-                <w:rFonts w:eastAsia="Times New Roman" w:cs="Times New Roman" w:ascii="Calibri" w:hAnsi="Calibri"/>
-                <w:kern w:val="0"/>
-                <w:szCs w:val="20"/>
-                <w:lang w:val="es-ES" w:eastAsia="es-ES" w:bidi="ar-SA"/>
+                <w:rFonts w:asciiTheme="minorHAnsi" w:hAnsiTheme="minorHAnsi" w:ascii="Calibri" w:hAnsi="Calibri"/>
               </w:rPr>
             </w:r>
           </w:p>
@@ -5863,6 +5956,7 @@
             <w:pPr>
               <w:pStyle w:val="Normal"/>
               <w:widowControl/>
+              <w:suppressAutoHyphens w:val="true"/>
               <w:spacing w:before="0" w:after="0"/>
               <w:jc w:val="center"/>
               <w:rPr>
@@ -5871,10 +5965,7 @@
             </w:pPr>
             <w:r>
               <w:rPr>
-                <w:rFonts w:eastAsia="Times New Roman" w:cs="Times New Roman" w:ascii="Calibri" w:hAnsi="Calibri"/>
-                <w:kern w:val="0"/>
-                <w:szCs w:val="20"/>
-                <w:lang w:val="es-ES" w:eastAsia="es-ES" w:bidi="ar-SA"/>
+                <w:rFonts w:asciiTheme="minorHAnsi" w:hAnsiTheme="minorHAnsi" w:ascii="Calibri" w:hAnsi="Calibri"/>
               </w:rPr>
             </w:r>
           </w:p>
@@ -5895,6 +5986,7 @@
             <w:pPr>
               <w:pStyle w:val="Normal"/>
               <w:widowControl/>
+              <w:suppressAutoHyphens w:val="true"/>
               <w:spacing w:before="0" w:after="0"/>
               <w:jc w:val="center"/>
               <w:rPr>
@@ -5903,10 +5995,7 @@
             </w:pPr>
             <w:r>
               <w:rPr>
-                <w:rFonts w:eastAsia="Times New Roman" w:cs="Times New Roman" w:ascii="Calibri" w:hAnsi="Calibri"/>
-                <w:kern w:val="0"/>
-                <w:szCs w:val="20"/>
-                <w:lang w:val="es-ES" w:eastAsia="es-ES" w:bidi="ar-SA"/>
+                <w:rFonts w:asciiTheme="minorHAnsi" w:hAnsiTheme="minorHAnsi" w:ascii="Calibri" w:hAnsi="Calibri"/>
               </w:rPr>
             </w:r>
           </w:p>
@@ -5932,6 +6021,7 @@
             <w:pPr>
               <w:pStyle w:val="Normal"/>
               <w:widowControl/>
+              <w:suppressAutoHyphens w:val="true"/>
               <w:spacing w:before="0" w:after="0"/>
               <w:jc w:val="left"/>
               <w:rPr>
@@ -5940,10 +6030,7 @@
             </w:pPr>
             <w:r>
               <w:rPr>
-                <w:rFonts w:eastAsia="Times New Roman" w:cs="Times New Roman" w:ascii="Calibri" w:hAnsi="Calibri"/>
-                <w:kern w:val="0"/>
-                <w:szCs w:val="20"/>
-                <w:lang w:val="es-ES" w:eastAsia="es-ES" w:bidi="ar-SA"/>
+                <w:rFonts w:asciiTheme="minorHAnsi" w:hAnsiTheme="minorHAnsi" w:ascii="Calibri" w:hAnsi="Calibri"/>
               </w:rPr>
             </w:r>
           </w:p>
@@ -5964,6 +6051,7 @@
             <w:pPr>
               <w:pStyle w:val="Normal"/>
               <w:widowControl/>
+              <w:suppressAutoHyphens w:val="true"/>
               <w:spacing w:before="0" w:after="0"/>
               <w:jc w:val="center"/>
               <w:rPr>
@@ -5972,10 +6060,7 @@
             </w:pPr>
             <w:r>
               <w:rPr>
-                <w:rFonts w:eastAsia="Times New Roman" w:cs="Times New Roman" w:ascii="Calibri" w:hAnsi="Calibri"/>
-                <w:kern w:val="0"/>
-                <w:szCs w:val="20"/>
-                <w:lang w:val="es-ES" w:eastAsia="es-ES" w:bidi="ar-SA"/>
+                <w:rFonts w:asciiTheme="minorHAnsi" w:hAnsiTheme="minorHAnsi" w:ascii="Calibri" w:hAnsi="Calibri"/>
               </w:rPr>
             </w:r>
           </w:p>
@@ -5996,6 +6081,7 @@
             <w:pPr>
               <w:pStyle w:val="Normal"/>
               <w:widowControl/>
+              <w:suppressAutoHyphens w:val="true"/>
               <w:spacing w:before="0" w:after="0"/>
               <w:jc w:val="center"/>
               <w:rPr>
@@ -6004,10 +6090,7 @@
             </w:pPr>
             <w:r>
               <w:rPr>
-                <w:rFonts w:eastAsia="Times New Roman" w:cs="Times New Roman" w:ascii="Calibri" w:hAnsi="Calibri"/>
-                <w:kern w:val="0"/>
-                <w:szCs w:val="20"/>
-                <w:lang w:val="es-ES" w:eastAsia="es-ES" w:bidi="ar-SA"/>
+                <w:rFonts w:asciiTheme="minorHAnsi" w:hAnsiTheme="minorHAnsi" w:ascii="Calibri" w:hAnsi="Calibri"/>
               </w:rPr>
             </w:r>
           </w:p>
@@ -6043,8 +6126,8 @@
         <w:tblLook w:val="06a0" w:noHBand="1" w:noVBand="1" w:firstColumn="1" w:lastRow="0" w:lastColumn="0" w:firstRow="1"/>
       </w:tblPr>
       <w:tblGrid>
-        <w:gridCol w:w="288"/>
-        <w:gridCol w:w="3261"/>
+        <w:gridCol w:w="287"/>
+        <w:gridCol w:w="3262"/>
         <w:gridCol w:w="283"/>
         <w:gridCol w:w="709"/>
         <w:gridCol w:w="942"/>
@@ -6078,6 +6161,7 @@
                 <w:ilvl w:val="0"/>
                 <w:numId w:val="1"/>
               </w:numPr>
+              <w:suppressAutoHyphens w:val="true"/>
               <w:spacing w:before="0" w:after="0"/>
               <w:jc w:val="left"/>
               <w:rPr>
@@ -6116,6 +6200,7 @@
             <w:pPr>
               <w:pStyle w:val="Normal"/>
               <w:widowControl/>
+              <w:suppressAutoHyphens w:val="true"/>
               <w:spacing w:before="0" w:after="0"/>
               <w:jc w:val="left"/>
               <w:rPr>
@@ -6126,18 +6211,17 @@
             </w:pPr>
             <w:r>
               <w:rPr>
-                <w:rFonts w:eastAsia="Times New Roman" w:cs="Times New Roman" w:ascii="Calibri" w:hAnsi="Calibri"/>
-                <w:kern w:val="0"/>
-                <w:sz w:val="22"/>
-                <w:szCs w:val="22"/>
-                <w:lang w:val="es-ES" w:eastAsia="es-ES" w:bidi="ar-SA"/>
-              </w:rPr>
-            </w:r>
-          </w:p>
-          <w:p>
-            <w:pPr>
-              <w:pStyle w:val="Normal"/>
-              <w:widowControl/>
+                <w:rFonts w:ascii="Calibri" w:hAnsi="Calibri"/>
+                <w:sz w:val="22"/>
+                <w:szCs w:val="22"/>
+              </w:rPr>
+            </w:r>
+          </w:p>
+          <w:p>
+            <w:pPr>
+              <w:pStyle w:val="Normal"/>
+              <w:widowControl/>
+              <w:suppressAutoHyphens w:val="true"/>
               <w:spacing w:before="0" w:after="0"/>
               <w:jc w:val="left"/>
               <w:rPr>
@@ -6246,6 +6330,7 @@
             <w:pPr>
               <w:pStyle w:val="Normal"/>
               <w:widowControl/>
+              <w:suppressAutoHyphens w:val="true"/>
               <w:spacing w:before="0" w:after="0"/>
               <w:jc w:val="left"/>
               <w:rPr>
@@ -6256,18 +6341,17 @@
             </w:pPr>
             <w:r>
               <w:rPr>
-                <w:rFonts w:eastAsia="Times New Roman" w:cs="Times New Roman" w:ascii="Calibri" w:hAnsi="Calibri"/>
-                <w:kern w:val="0"/>
-                <w:sz w:val="22"/>
-                <w:szCs w:val="22"/>
-                <w:lang w:val="es-ES" w:eastAsia="es-ES" w:bidi="ar-SA"/>
-              </w:rPr>
-            </w:r>
-          </w:p>
-          <w:p>
-            <w:pPr>
-              <w:pStyle w:val="Normal"/>
-              <w:widowControl/>
+                <w:rFonts w:ascii="Calibri" w:hAnsi="Calibri"/>
+                <w:sz w:val="22"/>
+                <w:szCs w:val="22"/>
+              </w:rPr>
+            </w:r>
+          </w:p>
+          <w:p>
+            <w:pPr>
+              <w:pStyle w:val="Normal"/>
+              <w:widowControl/>
+              <w:suppressAutoHyphens w:val="true"/>
               <w:spacing w:before="0" w:after="0"/>
               <w:jc w:val="left"/>
               <w:rPr>
@@ -6278,11 +6362,9 @@
             </w:pPr>
             <w:r>
               <w:rPr>
-                <w:rFonts w:eastAsia="Times New Roman" w:cs="Times New Roman" w:ascii="Calibri" w:hAnsi="Calibri"/>
-                <w:kern w:val="0"/>
-                <w:sz w:val="22"/>
-                <w:szCs w:val="22"/>
-                <w:lang w:val="es-ES" w:eastAsia="es-ES" w:bidi="ar-SA"/>
+                <w:rFonts w:ascii="Calibri" w:hAnsi="Calibri"/>
+                <w:sz w:val="22"/>
+                <w:szCs w:val="22"/>
               </w:rPr>
             </w:r>
           </w:p>
@@ -6294,7 +6376,7 @@
         </w:trPr>
         <w:tc>
           <w:tcPr>
-            <w:tcW w:w="288" w:type="dxa"/>
+            <w:tcW w:w="287" w:type="dxa"/>
             <w:tcBorders>
               <w:top w:val="nil"/>
               <w:left w:val="single" w:sz="4" w:space="0" w:color="7F7F7F"/>
@@ -6308,6 +6390,7 @@
             <w:pPr>
               <w:pStyle w:val="Normal"/>
               <w:widowControl/>
+              <w:suppressAutoHyphens w:val="true"/>
               <w:spacing w:before="0" w:after="0"/>
               <w:jc w:val="both"/>
               <w:rPr>
@@ -6316,17 +6399,14 @@
             </w:pPr>
             <w:r>
               <w:rPr>
-                <w:rFonts w:eastAsia="Times New Roman" w:cs="Arial" w:ascii="Calibri" w:hAnsi="Calibri"/>
-                <w:kern w:val="0"/>
-                <w:szCs w:val="20"/>
-                <w:lang w:val="es-ES" w:eastAsia="es-ES" w:bidi="ar-SA"/>
-              </w:rPr>
-            </w:r>
-          </w:p>
-        </w:tc>
-        <w:tc>
-          <w:tcPr>
-            <w:tcW w:w="3261" w:type="dxa"/>
+                <w:rFonts w:cs="Arial" w:ascii="Calibri" w:hAnsi="Calibri"/>
+              </w:rPr>
+            </w:r>
+          </w:p>
+        </w:tc>
+        <w:tc>
+          <w:tcPr>
+            <w:tcW w:w="3262" w:type="dxa"/>
             <w:tcBorders>
               <w:top w:val="nil"/>
               <w:left w:val="nil"/>
@@ -6340,6 +6420,7 @@
             <w:pPr>
               <w:pStyle w:val="Normal"/>
               <w:widowControl/>
+              <w:suppressAutoHyphens w:val="true"/>
               <w:spacing w:before="0" w:after="0"/>
               <w:jc w:val="both"/>
               <w:rPr>
@@ -6350,11 +6431,9 @@
             </w:pPr>
             <w:r>
               <w:rPr>
-                <w:rFonts w:eastAsia="Times New Roman" w:cs="Arial" w:ascii="Calibri" w:hAnsi="Calibri"/>
-                <w:kern w:val="0"/>
-                <w:sz w:val="22"/>
-                <w:szCs w:val="22"/>
-                <w:lang w:val="es-ES" w:eastAsia="es-ES" w:bidi="ar-SA"/>
+                <w:rFonts w:cs="Arial" w:ascii="Calibri" w:hAnsi="Calibri"/>
+                <w:sz w:val="22"/>
+                <w:szCs w:val="22"/>
               </w:rPr>
             </w:r>
           </w:p>
@@ -6375,6 +6454,7 @@
             <w:pPr>
               <w:pStyle w:val="Normal"/>
               <w:widowControl/>
+              <w:suppressAutoHyphens w:val="true"/>
               <w:spacing w:before="0" w:after="0"/>
               <w:jc w:val="both"/>
               <w:rPr>
@@ -6385,11 +6465,9 @@
             </w:pPr>
             <w:r>
               <w:rPr>
-                <w:rFonts w:eastAsia="Times New Roman" w:cs="Arial" w:ascii="Calibri" w:hAnsi="Calibri"/>
-                <w:kern w:val="0"/>
-                <w:sz w:val="22"/>
-                <w:szCs w:val="22"/>
-                <w:lang w:val="es-ES" w:eastAsia="es-ES" w:bidi="ar-SA"/>
+                <w:rFonts w:cs="Arial" w:ascii="Calibri" w:hAnsi="Calibri"/>
+                <w:sz w:val="22"/>
+                <w:szCs w:val="22"/>
               </w:rPr>
             </w:r>
           </w:p>
@@ -6411,6 +6489,7 @@
             <w:pPr>
               <w:pStyle w:val="Normal"/>
               <w:widowControl/>
+              <w:suppressAutoHyphens w:val="true"/>
               <w:spacing w:before="0" w:after="0"/>
               <w:jc w:val="both"/>
               <w:rPr>
@@ -6421,11 +6500,9 @@
             </w:pPr>
             <w:r>
               <w:rPr>
-                <w:rFonts w:eastAsia="Times New Roman" w:cs="Arial" w:ascii="Calibri" w:hAnsi="Calibri"/>
-                <w:kern w:val="0"/>
-                <w:sz w:val="22"/>
-                <w:szCs w:val="22"/>
-                <w:lang w:val="es-ES" w:eastAsia="es-ES" w:bidi="ar-SA"/>
+                <w:rFonts w:cs="Arial" w:ascii="Calibri" w:hAnsi="Calibri"/>
+                <w:sz w:val="22"/>
+                <w:szCs w:val="22"/>
               </w:rPr>
             </w:r>
           </w:p>
@@ -6446,6 +6523,7 @@
             <w:pPr>
               <w:pStyle w:val="Normal"/>
               <w:widowControl/>
+              <w:suppressAutoHyphens w:val="true"/>
               <w:spacing w:before="0" w:after="0"/>
               <w:jc w:val="both"/>
               <w:rPr>
@@ -6456,11 +6534,9 @@
             </w:pPr>
             <w:r>
               <w:rPr>
-                <w:rFonts w:eastAsia="Times New Roman" w:cs="Arial" w:ascii="Calibri" w:hAnsi="Calibri"/>
-                <w:kern w:val="0"/>
-                <w:sz w:val="22"/>
-                <w:szCs w:val="22"/>
-                <w:lang w:val="es-ES" w:eastAsia="es-ES" w:bidi="ar-SA"/>
+                <w:rFonts w:cs="Arial" w:ascii="Calibri" w:hAnsi="Calibri"/>
+                <w:sz w:val="22"/>
+                <w:szCs w:val="22"/>
               </w:rPr>
             </w:r>
           </w:p>
@@ -6481,6 +6557,7 @@
             <w:pPr>
               <w:pStyle w:val="Normal"/>
               <w:widowControl/>
+              <w:suppressAutoHyphens w:val="true"/>
               <w:spacing w:before="0" w:after="0"/>
               <w:jc w:val="both"/>
               <w:rPr>
@@ -6491,11 +6568,9 @@
             </w:pPr>
             <w:r>
               <w:rPr>
-                <w:rFonts w:eastAsia="Times New Roman" w:cs="Arial" w:ascii="Calibri" w:hAnsi="Calibri"/>
-                <w:kern w:val="0"/>
-                <w:sz w:val="22"/>
-                <w:szCs w:val="22"/>
-                <w:lang w:val="es-ES" w:eastAsia="es-ES" w:bidi="ar-SA"/>
+                <w:rFonts w:cs="Arial" w:ascii="Calibri" w:hAnsi="Calibri"/>
+                <w:sz w:val="22"/>
+                <w:szCs w:val="22"/>
               </w:rPr>
             </w:r>
           </w:p>
@@ -6516,6 +6591,7 @@
             <w:pPr>
               <w:pStyle w:val="Normal"/>
               <w:widowControl/>
+              <w:suppressAutoHyphens w:val="true"/>
               <w:spacing w:before="0" w:after="0"/>
               <w:jc w:val="both"/>
               <w:rPr>
@@ -6526,11 +6602,9 @@
             </w:pPr>
             <w:r>
               <w:rPr>
-                <w:rFonts w:eastAsia="Times New Roman" w:cs="Arial" w:ascii="Calibri" w:hAnsi="Calibri"/>
-                <w:kern w:val="0"/>
-                <w:sz w:val="22"/>
-                <w:szCs w:val="22"/>
-                <w:lang w:val="es-ES" w:eastAsia="es-ES" w:bidi="ar-SA"/>
+                <w:rFonts w:cs="Arial" w:ascii="Calibri" w:hAnsi="Calibri"/>
+                <w:sz w:val="22"/>
+                <w:szCs w:val="22"/>
               </w:rPr>
             </w:r>
           </w:p>
@@ -6542,7 +6616,7 @@
         </w:trPr>
         <w:tc>
           <w:tcPr>
-            <w:tcW w:w="288" w:type="dxa"/>
+            <w:tcW w:w="287" w:type="dxa"/>
             <w:tcBorders>
               <w:top w:val="nil"/>
               <w:left w:val="single" w:sz="4" w:space="0" w:color="7F7F7F"/>
@@ -6556,6 +6630,7 @@
             <w:pPr>
               <w:pStyle w:val="Normal"/>
               <w:widowControl/>
+              <w:suppressAutoHyphens w:val="true"/>
               <w:spacing w:before="0" w:after="0"/>
               <w:jc w:val="left"/>
               <w:rPr>
@@ -6564,17 +6639,14 @@
             </w:pPr>
             <w:r>
               <w:rPr>
-                <w:rFonts w:eastAsia="Times New Roman" w:cs="Arial" w:ascii="Calibri" w:hAnsi="Calibri"/>
-                <w:kern w:val="0"/>
-                <w:szCs w:val="20"/>
-                <w:lang w:val="es-ES" w:eastAsia="es-ES" w:bidi="ar-SA"/>
-              </w:rPr>
-            </w:r>
-          </w:p>
-        </w:tc>
-        <w:tc>
-          <w:tcPr>
-            <w:tcW w:w="3261" w:type="dxa"/>
+                <w:rFonts w:cs="Arial" w:ascii="Calibri" w:hAnsi="Calibri"/>
+              </w:rPr>
+            </w:r>
+          </w:p>
+        </w:tc>
+        <w:tc>
+          <w:tcPr>
+            <w:tcW w:w="3262" w:type="dxa"/>
             <w:tcBorders>
               <w:top w:val="single" w:sz="4" w:space="0" w:color="7F7F7F"/>
               <w:left w:val="nil"/>
@@ -6588,6 +6660,7 @@
             <w:pPr>
               <w:pStyle w:val="Normal"/>
               <w:widowControl/>
+              <w:suppressAutoHyphens w:val="true"/>
               <w:spacing w:before="0" w:after="0"/>
               <w:jc w:val="center"/>
               <w:rPr>
@@ -6626,6 +6699,7 @@
             <w:pPr>
               <w:pStyle w:val="Normal"/>
               <w:widowControl/>
+              <w:suppressAutoHyphens w:val="true"/>
               <w:spacing w:before="0" w:after="0"/>
               <w:jc w:val="center"/>
               <w:rPr>
@@ -6637,12 +6711,10 @@
             </w:pPr>
             <w:r>
               <w:rPr>
-                <w:rFonts w:eastAsia="Times New Roman" w:cs="Arial" w:ascii="Calibri" w:hAnsi="Calibri"/>
+                <w:rFonts w:cs="Arial" w:ascii="Calibri" w:hAnsi="Calibri"/>
                 <w:b/>
-                <w:kern w:val="0"/>
-                <w:sz w:val="22"/>
-                <w:szCs w:val="22"/>
-                <w:lang w:val="es-ES" w:eastAsia="es-ES" w:bidi="ar-SA"/>
+                <w:sz w:val="22"/>
+                <w:szCs w:val="22"/>
               </w:rPr>
             </w:r>
           </w:p>
@@ -6664,6 +6736,7 @@
             <w:pPr>
               <w:pStyle w:val="Normal"/>
               <w:widowControl/>
+              <w:suppressAutoHyphens w:val="true"/>
               <w:spacing w:before="0" w:after="0"/>
               <w:jc w:val="center"/>
               <w:rPr>
@@ -6702,6 +6775,7 @@
             <w:pPr>
               <w:pStyle w:val="Normal"/>
               <w:widowControl/>
+              <w:suppressAutoHyphens w:val="true"/>
               <w:spacing w:before="0" w:after="0"/>
               <w:jc w:val="center"/>
               <w:rPr>
@@ -6713,12 +6787,10 @@
             </w:pPr>
             <w:r>
               <w:rPr>
-                <w:rFonts w:eastAsia="Times New Roman" w:cs="Arial" w:ascii="Calibri" w:hAnsi="Calibri"/>
+                <w:rFonts w:cs="Arial" w:ascii="Calibri" w:hAnsi="Calibri"/>
                 <w:b/>
-                <w:kern w:val="0"/>
-                <w:sz w:val="22"/>
-                <w:szCs w:val="22"/>
-                <w:lang w:val="es-ES" w:eastAsia="es-ES" w:bidi="ar-SA"/>
+                <w:sz w:val="22"/>
+                <w:szCs w:val="22"/>
               </w:rPr>
             </w:r>
           </w:p>
@@ -6739,6 +6811,7 @@
             <w:pPr>
               <w:pStyle w:val="Normal"/>
               <w:widowControl/>
+              <w:suppressAutoHyphens w:val="true"/>
               <w:spacing w:before="0" w:after="0"/>
               <w:jc w:val="center"/>
               <w:rPr>
@@ -6777,6 +6850,7 @@
             <w:pPr>
               <w:pStyle w:val="Normal"/>
               <w:widowControl/>
+              <w:suppressAutoHyphens w:val="true"/>
               <w:spacing w:before="0" w:after="0"/>
               <w:jc w:val="center"/>
               <w:rPr>
@@ -6787,11 +6861,9 @@
             </w:pPr>
             <w:r>
               <w:rPr>
-                <w:rFonts w:eastAsia="Times New Roman" w:cs="Arial" w:ascii="Calibri" w:hAnsi="Calibri"/>
-                <w:kern w:val="0"/>
-                <w:sz w:val="22"/>
-                <w:szCs w:val="22"/>
-                <w:lang w:val="es-ES" w:eastAsia="es-ES" w:bidi="ar-SA"/>
+                <w:rFonts w:cs="Arial" w:ascii="Calibri" w:hAnsi="Calibri"/>
+                <w:sz w:val="22"/>
+                <w:szCs w:val="22"/>
               </w:rPr>
             </w:r>
           </w:p>
@@ -6818,6 +6890,7 @@
             <w:pPr>
               <w:pStyle w:val="Normal"/>
               <w:widowControl/>
+              <w:suppressAutoHyphens w:val="true"/>
               <w:spacing w:before="0" w:after="0"/>
               <w:jc w:val="both"/>
               <w:rPr>
@@ -6828,11 +6901,9 @@
             </w:pPr>
             <w:r>
               <w:rPr>
-                <w:rFonts w:eastAsia="Times New Roman" w:cs="Arial" w:ascii="Calibri" w:hAnsi="Calibri"/>
-                <w:kern w:val="0"/>
-                <w:sz w:val="22"/>
-                <w:szCs w:val="22"/>
-                <w:lang w:val="es-ES" w:eastAsia="es-ES" w:bidi="ar-SA"/>
+                <w:rFonts w:cs="Arial" w:ascii="Calibri" w:hAnsi="Calibri"/>
+                <w:sz w:val="22"/>
+                <w:szCs w:val="22"/>
               </w:rPr>
             </w:r>
           </w:p>
@@ -6853,6 +6924,7 @@
             <w:pPr>
               <w:pStyle w:val="Normal"/>
               <w:widowControl/>
+              <w:suppressAutoHyphens w:val="true"/>
               <w:spacing w:before="0" w:after="0"/>
               <w:jc w:val="both"/>
               <w:rPr>
@@ -6863,11 +6935,9 @@
             </w:pPr>
             <w:r>
               <w:rPr>
-                <w:rFonts w:eastAsia="Times New Roman" w:cs="Arial" w:ascii="Calibri" w:hAnsi="Calibri"/>
-                <w:kern w:val="0"/>
-                <w:sz w:val="22"/>
-                <w:szCs w:val="22"/>
-                <w:lang w:val="es-ES" w:eastAsia="es-ES" w:bidi="ar-SA"/>
+                <w:rFonts w:cs="Arial" w:ascii="Calibri" w:hAnsi="Calibri"/>
+                <w:sz w:val="22"/>
+                <w:szCs w:val="22"/>
               </w:rPr>
             </w:r>
           </w:p>
@@ -6889,6 +6959,7 @@
             <w:pPr>
               <w:pStyle w:val="Normal"/>
               <w:widowControl/>
+              <w:suppressAutoHyphens w:val="true"/>
               <w:spacing w:before="0" w:after="0"/>
               <w:jc w:val="both"/>
               <w:rPr>
@@ -6899,11 +6970,9 @@
             </w:pPr>
             <w:r>
               <w:rPr>
-                <w:rFonts w:eastAsia="Times New Roman" w:cs="Arial" w:ascii="Calibri" w:hAnsi="Calibri"/>
-                <w:kern w:val="0"/>
-                <w:sz w:val="22"/>
-                <w:szCs w:val="22"/>
-                <w:lang w:val="es-ES" w:eastAsia="es-ES" w:bidi="ar-SA"/>
+                <w:rFonts w:cs="Arial" w:ascii="Calibri" w:hAnsi="Calibri"/>
+                <w:sz w:val="22"/>
+                <w:szCs w:val="22"/>
               </w:rPr>
             </w:r>
           </w:p>
@@ -7165,14 +7234,6 @@
           <w:t>https://www.udea.edu.co/wps/portal/udea/web/inicio/docencia</w:t>
         </w:r>
       </w:hyperlink>
-      <w:r>
-        <w:rPr>
-          <w:rFonts w:cs="Calibri" w:ascii="Calibri" w:hAnsi="Calibri" w:asciiTheme="minorHAnsi" w:cstheme="minorHAnsi" w:hAnsiTheme="minorHAnsi"/>
-          <w:sz w:val="16"/>
-          <w:szCs w:val="16"/>
-        </w:rPr>
-        <w:t xml:space="preserve"> </w:t>
-      </w:r>
     </w:p>
   </w:footnote>
   <w:footnote w:id="3">
@@ -7348,14 +7409,6 @@
           <w:t>https://bit.ly/3S47HDV</w:t>
         </w:r>
       </w:hyperlink>
-      <w:r>
-        <w:rPr>
-          <w:rFonts w:cs="Calibri" w:ascii="Calibri" w:hAnsi="Calibri" w:asciiTheme="minorHAnsi" w:cstheme="minorHAnsi" w:hAnsiTheme="minorHAnsi"/>
-          <w:sz w:val="16"/>
-          <w:szCs w:val="16"/>
-        </w:rPr>
-        <w:t xml:space="preserve"> </w:t>
-      </w:r>
     </w:p>
   </w:footnote>
   <w:footnote w:id="8">
@@ -8157,6 +8210,7 @@
     <w:qFormat/>
     <w:pPr>
       <w:widowControl/>
+      <w:suppressAutoHyphens w:val="true"/>
       <w:bidi w:val="0"/>
       <w:spacing w:before="0" w:after="0"/>
       <w:jc w:val="left"/>
@@ -8344,7 +8398,6 @@
   </w:style>
   <w:style w:type="character" w:styleId="FootnoteCharacters">
     <w:name w:val="Footnote Characters"/>
-    <w:basedOn w:val="DefaultParagraphFont"/>
     <w:uiPriority w:val="99"/>
     <w:semiHidden/>
     <w:unhideWhenUsed/>
@@ -8498,6 +8551,7 @@
     <w:rsid w:val="00835be4"/>
     <w:pPr>
       <w:widowControl/>
+      <w:suppressAutoHyphens w:val="true"/>
       <w:bidi w:val="0"/>
       <w:spacing w:before="0" w:after="0"/>
       <w:jc w:val="left"/>
@@ -8574,6 +8628,7 @@
     <w:rsid w:val="00820c97"/>
     <w:pPr>
       <w:widowControl w:val="false"/>
+      <w:suppressAutoHyphens w:val="true"/>
       <w:bidi w:val="0"/>
       <w:spacing w:before="0" w:after="0"/>
       <w:jc w:val="left"/>
@@ -8648,7 +8703,6 @@
     <w:basedOn w:val="Tablanormal"/>
     <w:uiPriority w:val="59"/>
     <w:rsid w:val="00265ffb"/>
-    <w:rPr/>
     <w:tblPr>
       <w:tblBorders>
         <w:top w:val="single" w:color="auto" w:sz="4" w:space="0"/>

</xml_diff>

<commit_message>
foto de estefani en downsampling
</commit_message>
<xml_diff>
--- a/1_curso_machine_learning/0_plan_del_curso/plan_curso_machine_learning_Formato oficial de curso v4_14_08_2023.docx
+++ b/1_curso_machine_learning/0_plan_del_curso/plan_curso_machine_learning_Formato oficial de curso v4_14_08_2023.docx
@@ -394,6 +394,15 @@
                 <w:szCs w:val="20"/>
                 <w:lang w:val="es-ES" w:eastAsia="es-ES" w:bidi="ar-SA"/>
               </w:rPr>
+              <w:t xml:space="preserve">Introducción a la </w:t>
+            </w:r>
+            <w:r>
+              <w:rPr>
+                <w:rFonts w:eastAsia="Times New Roman" w:cs="Times New Roman"/>
+                <w:kern w:val="0"/>
+                <w:szCs w:val="20"/>
+                <w:lang w:val="es-ES" w:eastAsia="es-ES" w:bidi="ar-SA"/>
+              </w:rPr>
               <w:t>Ciencia de datos con python</w:t>
             </w:r>
           </w:p>
@@ -945,7 +954,7 @@
                 <w:szCs w:val="20"/>
                 <w:lang w:val="es-ES" w:eastAsia="es-ES" w:bidi="ar-SA"/>
               </w:rPr>
-              <w:t xml:space="preserve">Tipo de curso: </w:t>
+              <w:t>Tipo de curso:</w:t>
             </w:r>
           </w:p>
           <w:p>
@@ -1005,16 +1014,6 @@
                     <w:lang w:val="es-ES" w:eastAsia="es-ES" w:bidi="ar-SA"/>
                   </w:rPr>
                   <w:t>Electivo</w:t>
-                </w:r>
-                <w:r>
-                  <w:rPr>
-                    <w:rFonts w:eastAsia="Times New Roman" w:cs="Times New Roman" w:ascii="Calibri" w:hAnsi="Calibri"/>
-                    <w:color w:themeColor="background1" w:themeShade="80" w:val="808080"/>
-                    <w:kern w:val="0"/>
-                    <w:sz w:val="20"/>
-                    <w:szCs w:val="20"/>
-                    <w:lang w:val="es-ES" w:eastAsia="es-ES" w:bidi="ar-SA"/>
-                  </w:rPr>
                 </w:r>
               </w:sdtContent>
             </w:sdt>
@@ -1174,16 +1173,6 @@
                   </w:rPr>
                   <w:t>Complementario</w:t>
                 </w:r>
-                <w:r>
-                  <w:rPr>
-                    <w:rFonts w:eastAsia="Times New Roman" w:cs="Times New Roman" w:ascii="Calibri" w:hAnsi="Calibri"/>
-                    <w:color w:themeColor="background1" w:themeShade="80" w:val="808080"/>
-                    <w:kern w:val="0"/>
-                    <w:sz w:val="20"/>
-                    <w:szCs w:val="20"/>
-                    <w:lang w:val="es-ES" w:eastAsia="es-ES" w:bidi="ar-SA"/>
-                  </w:rPr>
-                </w:r>
               </w:sdtContent>
             </w:sdt>
           </w:p>
@@ -1358,15 +1347,6 @@
                   </w:rPr>
                   <w:t>☒</w:t>
                 </w:r>
-                <w:r>
-                  <w:rPr>
-                    <w:rFonts w:eastAsia="MS Gothic" w:cs="Segoe UI Symbol" w:ascii="Segoe UI Symbol" w:hAnsi="Segoe UI Symbol"/>
-                    <w:kern w:val="0"/>
-                    <w:sz w:val="22"/>
-                    <w:szCs w:val="22"/>
-                    <w:lang w:val="es-ES" w:eastAsia="es-ES" w:bidi="ar-SA"/>
-                  </w:rPr>
-                </w:r>
               </w:sdtContent>
             </w:sdt>
             <w:r>
@@ -1407,15 +1387,6 @@
                     <w:lang w:val="es-ES" w:eastAsia="es-ES" w:bidi="ar-SA"/>
                   </w:rPr>
                   <w:t>☒</w:t>
-                </w:r>
-                <w:r>
-                  <w:rPr>
-                    <w:rFonts w:eastAsia="MS Gothic" w:cs="Calibri" w:ascii="MS Gothic" w:hAnsi="MS Gothic"/>
-                    <w:kern w:val="0"/>
-                    <w:sz w:val="22"/>
-                    <w:szCs w:val="22"/>
-                    <w:lang w:val="es-ES" w:eastAsia="es-ES" w:bidi="ar-SA"/>
-                  </w:rPr>
                 </w:r>
               </w:sdtContent>
             </w:sdt>
@@ -2086,16 +2057,6 @@
                   </w:rPr>
                   <w:t>16</w:t>
                 </w:r>
-                <w:r>
-                  <w:rPr>
-                    <w:rStyle w:val="PlaceholderText"/>
-                    <w:rFonts w:eastAsia="Times New Roman" w:cs="Times New Roman" w:ascii="Calibri" w:hAnsi="Calibri"/>
-                    <w:kern w:val="0"/>
-                    <w:sz w:val="20"/>
-                    <w:szCs w:val="20"/>
-                    <w:lang w:val="es-ES" w:eastAsia="es-ES" w:bidi="ar-SA"/>
-                  </w:rPr>
-                </w:r>
               </w:sdtContent>
             </w:sdt>
           </w:p>
@@ -2177,16 +2138,6 @@
                     <w:lang w:val="es-ES" w:eastAsia="es-ES" w:bidi="ar-SA"/>
                   </w:rPr>
                   <w:t>16</w:t>
-                </w:r>
-                <w:r>
-                  <w:rPr>
-                    <w:rStyle w:val="PlaceholderText"/>
-                    <w:rFonts w:eastAsia="Times New Roman" w:cs="Times New Roman" w:ascii="Calibri" w:hAnsi="Calibri"/>
-                    <w:kern w:val="0"/>
-                    <w:sz w:val="20"/>
-                    <w:szCs w:val="20"/>
-                    <w:lang w:val="es-ES" w:eastAsia="es-ES" w:bidi="ar-SA"/>
-                  </w:rPr>
                 </w:r>
               </w:sdtContent>
             </w:sdt>
@@ -2372,16 +2323,6 @@
                   </w:rPr>
                   <w:t>8</w:t>
                 </w:r>
-                <w:r>
-                  <w:rPr>
-                    <w:rStyle w:val="PlaceholderText"/>
-                    <w:rFonts w:eastAsia="Times New Roman" w:cs="Times New Roman" w:ascii="Calibri" w:hAnsi="Calibri"/>
-                    <w:kern w:val="0"/>
-                    <w:sz w:val="20"/>
-                    <w:szCs w:val="20"/>
-                    <w:lang w:val="es-ES" w:eastAsia="es-ES" w:bidi="ar-SA"/>
-                  </w:rPr>
-                </w:r>
               </w:sdtContent>
             </w:sdt>
           </w:p>
@@ -2464,16 +2405,6 @@
                   </w:rPr>
                   <w:t>8</w:t>
                 </w:r>
-                <w:r>
-                  <w:rPr>
-                    <w:rStyle w:val="PlaceholderText"/>
-                    <w:rFonts w:eastAsia="Times New Roman" w:cs="Times New Roman" w:ascii="Calibri" w:hAnsi="Calibri"/>
-                    <w:kern w:val="0"/>
-                    <w:sz w:val="20"/>
-                    <w:szCs w:val="20"/>
-                    <w:lang w:val="es-ES" w:eastAsia="es-ES" w:bidi="ar-SA"/>
-                  </w:rPr>
-                </w:r>
               </w:sdtContent>
             </w:sdt>
           </w:p>
@@ -2551,16 +2482,6 @@
                     <w:lang w:val="es-ES" w:eastAsia="es-ES" w:bidi="ar-SA"/>
                   </w:rPr>
                   <w:t>32</w:t>
-                </w:r>
-                <w:r>
-                  <w:rPr>
-                    <w:rStyle w:val="PlaceholderText"/>
-                    <w:rFonts w:eastAsia="Times New Roman" w:cs="Times New Roman" w:ascii="Calibri" w:hAnsi="Calibri"/>
-                    <w:kern w:val="0"/>
-                    <w:sz w:val="20"/>
-                    <w:szCs w:val="20"/>
-                    <w:lang w:val="es-ES" w:eastAsia="es-ES" w:bidi="ar-SA"/>
-                  </w:rPr>
                 </w:r>
               </w:sdtContent>
             </w:sdt>
@@ -2802,11 +2723,70 @@
             </w:pPr>
             <w:r>
               <w:rPr>
+                <w:rFonts w:ascii="Calibri" w:hAnsi="Calibri" w:asciiTheme="minorHAnsi" w:hAnsiTheme="minorHAnsi"/>
+                <w:sz w:val="22"/>
+                <w:szCs w:val="22"/>
+              </w:rPr>
+              <w:t xml:space="preserve">**Propósito del Curso de </w:t>
+            </w:r>
+            <w:r>
+              <w:rPr>
+                <w:rFonts w:ascii="Calibri" w:hAnsi="Calibri" w:asciiTheme="minorHAnsi" w:hAnsiTheme="minorHAnsi"/>
+                <w:sz w:val="22"/>
+                <w:szCs w:val="22"/>
+              </w:rPr>
+              <w:t xml:space="preserve">Introducción al </w:t>
+            </w:r>
+            <w:r>
+              <w:rPr>
+                <w:rFonts w:ascii="Calibri" w:hAnsi="Calibri" w:asciiTheme="minorHAnsi" w:hAnsiTheme="minorHAnsi"/>
+                <w:sz w:val="22"/>
+                <w:szCs w:val="22"/>
+              </w:rPr>
+              <w:t>Machine Learning con Python en la Universidad de Antioquia, Colombia:**</w:t>
+            </w:r>
+          </w:p>
+          <w:p>
+            <w:pPr>
+              <w:pStyle w:val="Normal"/>
+              <w:widowControl/>
+              <w:suppressAutoHyphens w:val="true"/>
+              <w:spacing w:before="0" w:after="0"/>
+              <w:jc w:val="both"/>
+              <w:rPr>
+                <w:rFonts w:ascii="Calibri" w:hAnsi="Calibri" w:asciiTheme="minorHAnsi" w:hAnsiTheme="minorHAnsi"/>
+                <w:sz w:val="22"/>
+                <w:szCs w:val="22"/>
+              </w:rPr>
+            </w:pPr>
+            <w:r>
+              <w:rPr>
                 <w:rFonts w:asciiTheme="minorHAnsi" w:hAnsiTheme="minorHAnsi" w:ascii="Calibri" w:hAnsi="Calibri"/>
                 <w:sz w:val="22"/>
                 <w:szCs w:val="22"/>
               </w:rPr>
-              <w:t>**Propósito del Curso de Machine Learning con Python en la Universidad de Antioquia, Colombia:**</w:t>
+            </w:r>
+          </w:p>
+          <w:p>
+            <w:pPr>
+              <w:pStyle w:val="Normal"/>
+              <w:widowControl/>
+              <w:suppressAutoHyphens w:val="true"/>
+              <w:spacing w:before="0" w:after="0"/>
+              <w:jc w:val="both"/>
+              <w:rPr>
+                <w:rFonts w:ascii="Calibri" w:hAnsi="Calibri" w:asciiTheme="minorHAnsi" w:hAnsiTheme="minorHAnsi"/>
+                <w:sz w:val="22"/>
+                <w:szCs w:val="22"/>
+              </w:rPr>
+            </w:pPr>
+            <w:r>
+              <w:rPr>
+                <w:rFonts w:ascii="Calibri" w:hAnsi="Calibri" w:asciiTheme="minorHAnsi" w:hAnsiTheme="minorHAnsi"/>
+                <w:sz w:val="22"/>
+                <w:szCs w:val="22"/>
+              </w:rPr>
+              <w:t>El curso de Machine Learning con Python tiene como objetivo principal proporcionar a los estudiantes de la Universidad de Antioquia los conocimientos y habilidades necesarios para comprender, aplicar y desarrollar soluciones basadas en machine learning, específicamente utilizando el lenguaje de programación Python. Este curso se alinea con los perfiles de los programas académicos de la universidad y busca potenciar las capacidades de los estudiantes en el ámbito científico, tecnológico y de comunicación.</w:t>
             </w:r>
           </w:p>
           <w:p>
@@ -2845,11 +2825,114 @@
             </w:pPr>
             <w:r>
               <w:rPr>
+                <w:rFonts w:ascii="Calibri" w:hAnsi="Calibri" w:asciiTheme="minorHAnsi" w:hAnsiTheme="minorHAnsi"/>
+                <w:sz w:val="22"/>
+                <w:szCs w:val="22"/>
+              </w:rPr>
+              <w:t>**Aportes del Espacio de Formación:**</w:t>
+            </w:r>
+          </w:p>
+          <w:p>
+            <w:pPr>
+              <w:pStyle w:val="Normal"/>
+              <w:widowControl/>
+              <w:suppressAutoHyphens w:val="true"/>
+              <w:spacing w:before="0" w:after="0"/>
+              <w:jc w:val="both"/>
+              <w:rPr>
+                <w:rFonts w:ascii="Calibri" w:hAnsi="Calibri" w:asciiTheme="minorHAnsi" w:hAnsiTheme="minorHAnsi"/>
+                <w:sz w:val="22"/>
+                <w:szCs w:val="22"/>
+              </w:rPr>
+            </w:pPr>
+            <w:r>
+              <w:rPr>
                 <w:rFonts w:asciiTheme="minorHAnsi" w:hAnsiTheme="minorHAnsi" w:ascii="Calibri" w:hAnsi="Calibri"/>
                 <w:sz w:val="22"/>
                 <w:szCs w:val="22"/>
               </w:rPr>
-              <w:t>El curso de Machine Learning con Python tiene como objetivo principal proporcionar a los estudiantes de la Universidad de Antioquia los conocimientos y habilidades necesarios para comprender, aplicar y desarrollar soluciones basadas en machine learning, específicamente utilizando el lenguaje de programación Python. Este curso se alinea con los perfiles de los programas académicos de la universidad y busca potenciar las capacidades de los estudiantes en el ámbito científico, tecnológico y de comunicación.</w:t>
+            </w:r>
+          </w:p>
+          <w:p>
+            <w:pPr>
+              <w:pStyle w:val="Normal"/>
+              <w:widowControl/>
+              <w:suppressAutoHyphens w:val="true"/>
+              <w:spacing w:before="0" w:after="0"/>
+              <w:jc w:val="both"/>
+              <w:rPr>
+                <w:rFonts w:ascii="Calibri" w:hAnsi="Calibri" w:asciiTheme="minorHAnsi" w:hAnsiTheme="minorHAnsi"/>
+                <w:sz w:val="22"/>
+                <w:szCs w:val="22"/>
+              </w:rPr>
+            </w:pPr>
+            <w:r>
+              <w:rPr>
+                <w:rFonts w:ascii="Calibri" w:hAnsi="Calibri" w:asciiTheme="minorHAnsi" w:hAnsiTheme="minorHAnsi"/>
+                <w:sz w:val="22"/>
+                <w:szCs w:val="22"/>
+              </w:rPr>
+              <w:t>1. **Enfoque Pedagógico Flipped Learning:**</w:t>
+            </w:r>
+          </w:p>
+          <w:p>
+            <w:pPr>
+              <w:pStyle w:val="Normal"/>
+              <w:widowControl/>
+              <w:suppressAutoHyphens w:val="true"/>
+              <w:spacing w:before="0" w:after="0"/>
+              <w:jc w:val="both"/>
+              <w:rPr>
+                <w:rFonts w:ascii="Calibri" w:hAnsi="Calibri" w:asciiTheme="minorHAnsi" w:hAnsiTheme="minorHAnsi"/>
+                <w:sz w:val="22"/>
+                <w:szCs w:val="22"/>
+              </w:rPr>
+            </w:pPr>
+            <w:r>
+              <w:rPr>
+                <w:rFonts w:ascii="Calibri" w:hAnsi="Calibri" w:asciiTheme="minorHAnsi" w:hAnsiTheme="minorHAnsi"/>
+                <w:sz w:val="22"/>
+                <w:szCs w:val="22"/>
+              </w:rPr>
+              <w:t xml:space="preserve">   </w:t>
+            </w:r>
+            <w:r>
+              <w:rPr>
+                <w:rFonts w:ascii="Calibri" w:hAnsi="Calibri" w:asciiTheme="minorHAnsi" w:hAnsiTheme="minorHAnsi"/>
+                <w:sz w:val="22"/>
+                <w:szCs w:val="22"/>
+              </w:rPr>
+              <w:t>- **Cómo Aporta:** Proporciona a los estudiantes la oportunidad de aprender los fundamentos teóricos del machine learning de manera autónoma antes de las clases presenciales. Durante las clases, se enfoca en la aplicación práctica, resolución de problemas y discusiones más avanzadas.</w:t>
+            </w:r>
+          </w:p>
+          <w:p>
+            <w:pPr>
+              <w:pStyle w:val="Normal"/>
+              <w:widowControl/>
+              <w:suppressAutoHyphens w:val="true"/>
+              <w:spacing w:before="0" w:after="0"/>
+              <w:jc w:val="both"/>
+              <w:rPr>
+                <w:rFonts w:ascii="Calibri" w:hAnsi="Calibri" w:asciiTheme="minorHAnsi" w:hAnsiTheme="minorHAnsi"/>
+                <w:sz w:val="22"/>
+                <w:szCs w:val="22"/>
+              </w:rPr>
+            </w:pPr>
+            <w:r>
+              <w:rPr>
+                <w:rFonts w:ascii="Calibri" w:hAnsi="Calibri" w:asciiTheme="minorHAnsi" w:hAnsiTheme="minorHAnsi"/>
+                <w:sz w:val="22"/>
+                <w:szCs w:val="22"/>
+              </w:rPr>
+              <w:t xml:space="preserve">   </w:t>
+            </w:r>
+            <w:r>
+              <w:rPr>
+                <w:rFonts w:ascii="Calibri" w:hAnsi="Calibri" w:asciiTheme="minorHAnsi" w:hAnsiTheme="minorHAnsi"/>
+                <w:sz w:val="22"/>
+                <w:szCs w:val="22"/>
+              </w:rPr>
+              <w:t>- **Beneficios para los Perfiles Académicos:** Desarrolla habilidades de autodirección y autonomía en el aprendizaje, promoviendo un enfoque más activo y participativo.</w:t>
             </w:r>
           </w:p>
           <w:p>
@@ -2888,11 +2971,174 @@
             </w:pPr>
             <w:r>
               <w:rPr>
+                <w:rFonts w:ascii="Calibri" w:hAnsi="Calibri" w:asciiTheme="minorHAnsi" w:hAnsiTheme="minorHAnsi"/>
+                <w:sz w:val="22"/>
+                <w:szCs w:val="22"/>
+              </w:rPr>
+              <w:t>2. **Metodología de Enseñanza Basada en Problemas (ABP):**</w:t>
+            </w:r>
+          </w:p>
+          <w:p>
+            <w:pPr>
+              <w:pStyle w:val="Normal"/>
+              <w:widowControl/>
+              <w:suppressAutoHyphens w:val="true"/>
+              <w:spacing w:before="0" w:after="0"/>
+              <w:jc w:val="both"/>
+              <w:rPr>
+                <w:rFonts w:ascii="Calibri" w:hAnsi="Calibri" w:asciiTheme="minorHAnsi" w:hAnsiTheme="minorHAnsi"/>
+                <w:sz w:val="22"/>
+                <w:szCs w:val="22"/>
+              </w:rPr>
+            </w:pPr>
+            <w:r>
+              <w:rPr>
+                <w:rFonts w:ascii="Calibri" w:hAnsi="Calibri" w:asciiTheme="minorHAnsi" w:hAnsiTheme="minorHAnsi"/>
+                <w:sz w:val="22"/>
+                <w:szCs w:val="22"/>
+              </w:rPr>
+              <w:t xml:space="preserve">   </w:t>
+            </w:r>
+            <w:r>
+              <w:rPr>
+                <w:rFonts w:ascii="Calibri" w:hAnsi="Calibri" w:asciiTheme="minorHAnsi" w:hAnsiTheme="minorHAnsi"/>
+                <w:sz w:val="22"/>
+                <w:szCs w:val="22"/>
+              </w:rPr>
+              <w:t>- **Cómo Aporta:** A través de problemas y casos de estudio reales, los estudiantes aplican conceptos teóricos a situaciones prácticas. Se fomenta la resolución de problemas y el pensamiento crítico.</w:t>
+            </w:r>
+          </w:p>
+          <w:p>
+            <w:pPr>
+              <w:pStyle w:val="Normal"/>
+              <w:widowControl/>
+              <w:suppressAutoHyphens w:val="true"/>
+              <w:spacing w:before="0" w:after="0"/>
+              <w:jc w:val="both"/>
+              <w:rPr>
+                <w:rFonts w:ascii="Calibri" w:hAnsi="Calibri" w:asciiTheme="minorHAnsi" w:hAnsiTheme="minorHAnsi"/>
+                <w:sz w:val="22"/>
+                <w:szCs w:val="22"/>
+              </w:rPr>
+            </w:pPr>
+            <w:r>
+              <w:rPr>
+                <w:rFonts w:ascii="Calibri" w:hAnsi="Calibri" w:asciiTheme="minorHAnsi" w:hAnsiTheme="minorHAnsi"/>
+                <w:sz w:val="22"/>
+                <w:szCs w:val="22"/>
+              </w:rPr>
+              <w:t xml:space="preserve">   </w:t>
+            </w:r>
+            <w:r>
+              <w:rPr>
+                <w:rFonts w:ascii="Calibri" w:hAnsi="Calibri" w:asciiTheme="minorHAnsi" w:hAnsiTheme="minorHAnsi"/>
+                <w:sz w:val="22"/>
+                <w:szCs w:val="22"/>
+              </w:rPr>
+              <w:t>- **Beneficios para los Perfiles Académicos:** Desarrolla habilidades de resolución de problemas, análisis crítico y aplicación práctica de los conocimientos, alineándose con las demandas del entorno laboral.</w:t>
+            </w:r>
+          </w:p>
+          <w:p>
+            <w:pPr>
+              <w:pStyle w:val="Normal"/>
+              <w:widowControl/>
+              <w:suppressAutoHyphens w:val="true"/>
+              <w:spacing w:before="0" w:after="0"/>
+              <w:jc w:val="both"/>
+              <w:rPr>
+                <w:rFonts w:ascii="Calibri" w:hAnsi="Calibri" w:asciiTheme="minorHAnsi" w:hAnsiTheme="minorHAnsi"/>
+                <w:sz w:val="22"/>
+                <w:szCs w:val="22"/>
+              </w:rPr>
+            </w:pPr>
+            <w:r>
+              <w:rPr>
                 <w:rFonts w:asciiTheme="minorHAnsi" w:hAnsiTheme="minorHAnsi" w:ascii="Calibri" w:hAnsi="Calibri"/>
                 <w:sz w:val="22"/>
                 <w:szCs w:val="22"/>
               </w:rPr>
-              <w:t>**Aportes del Espacio de Formación:**</w:t>
+            </w:r>
+          </w:p>
+          <w:p>
+            <w:pPr>
+              <w:pStyle w:val="Normal"/>
+              <w:widowControl/>
+              <w:suppressAutoHyphens w:val="true"/>
+              <w:spacing w:before="0" w:after="0"/>
+              <w:jc w:val="both"/>
+              <w:rPr>
+                <w:rFonts w:ascii="Calibri" w:hAnsi="Calibri" w:asciiTheme="minorHAnsi" w:hAnsiTheme="minorHAnsi"/>
+                <w:sz w:val="22"/>
+                <w:szCs w:val="22"/>
+              </w:rPr>
+            </w:pPr>
+            <w:r>
+              <w:rPr>
+                <w:rFonts w:ascii="Calibri" w:hAnsi="Calibri" w:asciiTheme="minorHAnsi" w:hAnsiTheme="minorHAnsi"/>
+                <w:sz w:val="22"/>
+                <w:szCs w:val="22"/>
+              </w:rPr>
+              <w:t>3. **Promoción de Políticas de Ciencia Libre:**</w:t>
+            </w:r>
+          </w:p>
+          <w:p>
+            <w:pPr>
+              <w:pStyle w:val="Normal"/>
+              <w:widowControl/>
+              <w:suppressAutoHyphens w:val="true"/>
+              <w:spacing w:before="0" w:after="0"/>
+              <w:jc w:val="both"/>
+              <w:rPr>
+                <w:rFonts w:ascii="Calibri" w:hAnsi="Calibri" w:asciiTheme="minorHAnsi" w:hAnsiTheme="minorHAnsi"/>
+                <w:sz w:val="22"/>
+                <w:szCs w:val="22"/>
+              </w:rPr>
+            </w:pPr>
+            <w:r>
+              <w:rPr>
+                <w:rFonts w:ascii="Calibri" w:hAnsi="Calibri" w:asciiTheme="minorHAnsi" w:hAnsiTheme="minorHAnsi"/>
+                <w:sz w:val="22"/>
+                <w:szCs w:val="22"/>
+              </w:rPr>
+              <w:t xml:space="preserve">   </w:t>
+            </w:r>
+            <w:r>
+              <w:rPr>
+                <w:rFonts w:ascii="Calibri" w:hAnsi="Calibri" w:asciiTheme="minorHAnsi" w:hAnsiTheme="minorHAnsi"/>
+                <w:sz w:val="22"/>
+                <w:szCs w:val="22"/>
+              </w:rPr>
+              <w:t>- **Cómo Aporta:** Se enfoca en el uso de recursos de código abierto, bibliotecas y herramientas de machine learning disponibles gratuitamente. Incentiva el acceso libre y la colaboración en la comunidad científica.</w:t>
+            </w:r>
+          </w:p>
+          <w:p>
+            <w:pPr>
+              <w:pStyle w:val="Normal"/>
+              <w:widowControl/>
+              <w:suppressAutoHyphens w:val="true"/>
+              <w:spacing w:before="0" w:after="0"/>
+              <w:jc w:val="both"/>
+              <w:rPr>
+                <w:rFonts w:ascii="Calibri" w:hAnsi="Calibri" w:asciiTheme="minorHAnsi" w:hAnsiTheme="minorHAnsi"/>
+                <w:sz w:val="22"/>
+                <w:szCs w:val="22"/>
+              </w:rPr>
+            </w:pPr>
+            <w:r>
+              <w:rPr>
+                <w:rFonts w:ascii="Calibri" w:hAnsi="Calibri" w:asciiTheme="minorHAnsi" w:hAnsiTheme="minorHAnsi"/>
+                <w:sz w:val="22"/>
+                <w:szCs w:val="22"/>
+              </w:rPr>
+              <w:t xml:space="preserve">   </w:t>
+            </w:r>
+            <w:r>
+              <w:rPr>
+                <w:rFonts w:ascii="Calibri" w:hAnsi="Calibri" w:asciiTheme="minorHAnsi" w:hAnsiTheme="minorHAnsi"/>
+                <w:sz w:val="22"/>
+                <w:szCs w:val="22"/>
+              </w:rPr>
+              <w:t>- **Beneficios para los Perfiles Académicos:** Fomenta la ética científica y la colaboración abierta, promoviendo la transparencia y la accesibilidad en la investigación.</w:t>
             </w:r>
           </w:p>
           <w:p>
@@ -2931,419 +3177,110 @@
             </w:pPr>
             <w:r>
               <w:rPr>
+                <w:rFonts w:ascii="Calibri" w:hAnsi="Calibri" w:asciiTheme="minorHAnsi" w:hAnsiTheme="minorHAnsi"/>
+                <w:sz w:val="22"/>
+                <w:szCs w:val="22"/>
+              </w:rPr>
+              <w:t>4. **Desarrollo de Habilidades de Comunicación Científica:**</w:t>
+            </w:r>
+          </w:p>
+          <w:p>
+            <w:pPr>
+              <w:pStyle w:val="Normal"/>
+              <w:widowControl/>
+              <w:suppressAutoHyphens w:val="true"/>
+              <w:spacing w:before="0" w:after="0"/>
+              <w:jc w:val="both"/>
+              <w:rPr>
+                <w:rFonts w:ascii="Calibri" w:hAnsi="Calibri" w:asciiTheme="minorHAnsi" w:hAnsiTheme="minorHAnsi"/>
+                <w:sz w:val="22"/>
+                <w:szCs w:val="22"/>
+              </w:rPr>
+            </w:pPr>
+            <w:r>
+              <w:rPr>
+                <w:rFonts w:ascii="Calibri" w:hAnsi="Calibri" w:asciiTheme="minorHAnsi" w:hAnsiTheme="minorHAnsi"/>
+                <w:sz w:val="22"/>
+                <w:szCs w:val="22"/>
+              </w:rPr>
+              <w:t xml:space="preserve">   </w:t>
+            </w:r>
+            <w:r>
+              <w:rPr>
+                <w:rFonts w:ascii="Calibri" w:hAnsi="Calibri" w:asciiTheme="minorHAnsi" w:hAnsiTheme="minorHAnsi"/>
+                <w:sz w:val="22"/>
+                <w:szCs w:val="22"/>
+              </w:rPr>
+              <w:t>- **Cómo Aporta:** Incorpora actividades que requieren la presentación y explicación de resultados de manera clara y comprensible. Incluye la redacción de informes, la elaboración de presentaciones y la comunicación efectiva de hallazgos.</w:t>
+            </w:r>
+          </w:p>
+          <w:p>
+            <w:pPr>
+              <w:pStyle w:val="Normal"/>
+              <w:widowControl/>
+              <w:suppressAutoHyphens w:val="true"/>
+              <w:spacing w:before="0" w:after="0"/>
+              <w:jc w:val="both"/>
+              <w:rPr>
+                <w:rFonts w:ascii="Calibri" w:hAnsi="Calibri" w:asciiTheme="minorHAnsi" w:hAnsiTheme="minorHAnsi"/>
+                <w:sz w:val="22"/>
+                <w:szCs w:val="22"/>
+              </w:rPr>
+            </w:pPr>
+            <w:r>
+              <w:rPr>
+                <w:rFonts w:ascii="Calibri" w:hAnsi="Calibri" w:asciiTheme="minorHAnsi" w:hAnsiTheme="minorHAnsi"/>
+                <w:sz w:val="22"/>
+                <w:szCs w:val="22"/>
+              </w:rPr>
+              <w:t xml:space="preserve">   </w:t>
+            </w:r>
+            <w:r>
+              <w:rPr>
+                <w:rFonts w:ascii="Calibri" w:hAnsi="Calibri" w:asciiTheme="minorHAnsi" w:hAnsiTheme="minorHAnsi"/>
+                <w:sz w:val="22"/>
+                <w:szCs w:val="22"/>
+              </w:rPr>
+              <w:t>- **Beneficios para los Perfiles Académicos:** Mejora las habilidades de comunicación escrita y oral, esenciales para compartir resultados de investigación y colaborar de manera efectiva en el ámbito científico.</w:t>
+            </w:r>
+          </w:p>
+          <w:p>
+            <w:pPr>
+              <w:pStyle w:val="Normal"/>
+              <w:widowControl/>
+              <w:suppressAutoHyphens w:val="true"/>
+              <w:spacing w:before="0" w:after="0"/>
+              <w:jc w:val="both"/>
+              <w:rPr>
+                <w:rFonts w:ascii="Calibri" w:hAnsi="Calibri" w:asciiTheme="minorHAnsi" w:hAnsiTheme="minorHAnsi"/>
+                <w:sz w:val="22"/>
+                <w:szCs w:val="22"/>
+              </w:rPr>
+            </w:pPr>
+            <w:r>
+              <w:rPr>
                 <w:rFonts w:asciiTheme="minorHAnsi" w:hAnsiTheme="minorHAnsi" w:ascii="Calibri" w:hAnsi="Calibri"/>
                 <w:sz w:val="22"/>
                 <w:szCs w:val="22"/>
               </w:rPr>
-              <w:t>1. **Enfoque Pedagógico Flipped Learning:**</w:t>
-            </w:r>
-          </w:p>
-          <w:p>
-            <w:pPr>
-              <w:pStyle w:val="Normal"/>
-              <w:widowControl/>
-              <w:suppressAutoHyphens w:val="true"/>
-              <w:spacing w:before="0" w:after="0"/>
-              <w:jc w:val="both"/>
-              <w:rPr>
-                <w:rFonts w:ascii="Calibri" w:hAnsi="Calibri" w:asciiTheme="minorHAnsi" w:hAnsiTheme="minorHAnsi"/>
-                <w:sz w:val="22"/>
-                <w:szCs w:val="22"/>
-              </w:rPr>
-            </w:pPr>
-            <w:r>
-              <w:rPr>
-                <w:rFonts w:asciiTheme="minorHAnsi" w:hAnsiTheme="minorHAnsi" w:ascii="Calibri" w:hAnsi="Calibri"/>
-                <w:sz w:val="22"/>
-                <w:szCs w:val="22"/>
-              </w:rPr>
-              <w:t xml:space="preserve">   </w:t>
-            </w:r>
-            <w:r>
-              <w:rPr>
-                <w:rFonts w:asciiTheme="minorHAnsi" w:hAnsiTheme="minorHAnsi" w:ascii="Calibri" w:hAnsi="Calibri"/>
-                <w:sz w:val="22"/>
-                <w:szCs w:val="22"/>
-              </w:rPr>
-              <w:t>- **Cómo Aporta:** Proporciona a los estudiantes la oportunidad de aprender los fundamentos teóricos del machine learning de manera autónoma antes de las clases presenciales. Durante las clases, se enfoca en la aplicación práctica, resolución de problemas y discusiones más avanzadas.</w:t>
-            </w:r>
-          </w:p>
-          <w:p>
-            <w:pPr>
-              <w:pStyle w:val="Normal"/>
-              <w:widowControl/>
-              <w:suppressAutoHyphens w:val="true"/>
-              <w:spacing w:before="0" w:after="0"/>
-              <w:jc w:val="both"/>
-              <w:rPr>
-                <w:rFonts w:ascii="Calibri" w:hAnsi="Calibri" w:asciiTheme="minorHAnsi" w:hAnsiTheme="minorHAnsi"/>
-                <w:sz w:val="22"/>
-                <w:szCs w:val="22"/>
-              </w:rPr>
-            </w:pPr>
-            <w:r>
-              <w:rPr>
-                <w:rFonts w:asciiTheme="minorHAnsi" w:hAnsiTheme="minorHAnsi" w:ascii="Calibri" w:hAnsi="Calibri"/>
-                <w:sz w:val="22"/>
-                <w:szCs w:val="22"/>
-              </w:rPr>
-              <w:t xml:space="preserve">   </w:t>
-            </w:r>
-            <w:r>
-              <w:rPr>
-                <w:rFonts w:asciiTheme="minorHAnsi" w:hAnsiTheme="minorHAnsi" w:ascii="Calibri" w:hAnsi="Calibri"/>
-                <w:sz w:val="22"/>
-                <w:szCs w:val="22"/>
-              </w:rPr>
-              <w:t>- **Beneficios para los Perfiles Académicos:** Desarrolla habilidades de autodirección y autonomía en el aprendizaje, promoviendo un enfoque más activo y participativo.</w:t>
-            </w:r>
-          </w:p>
-          <w:p>
-            <w:pPr>
-              <w:pStyle w:val="Normal"/>
-              <w:widowControl/>
-              <w:suppressAutoHyphens w:val="true"/>
-              <w:spacing w:before="0" w:after="0"/>
-              <w:jc w:val="both"/>
-              <w:rPr>
-                <w:rFonts w:ascii="Calibri" w:hAnsi="Calibri" w:asciiTheme="minorHAnsi" w:hAnsiTheme="minorHAnsi"/>
-                <w:sz w:val="22"/>
-                <w:szCs w:val="22"/>
-              </w:rPr>
-            </w:pPr>
-            <w:r>
-              <w:rPr>
-                <w:rFonts w:asciiTheme="minorHAnsi" w:hAnsiTheme="minorHAnsi" w:ascii="Calibri" w:hAnsi="Calibri"/>
-                <w:sz w:val="22"/>
-                <w:szCs w:val="22"/>
-              </w:rPr>
-            </w:r>
-          </w:p>
-          <w:p>
-            <w:pPr>
-              <w:pStyle w:val="Normal"/>
-              <w:widowControl/>
-              <w:suppressAutoHyphens w:val="true"/>
-              <w:spacing w:before="0" w:after="0"/>
-              <w:jc w:val="both"/>
-              <w:rPr>
-                <w:rFonts w:ascii="Calibri" w:hAnsi="Calibri" w:asciiTheme="minorHAnsi" w:hAnsiTheme="minorHAnsi"/>
-                <w:sz w:val="22"/>
-                <w:szCs w:val="22"/>
-              </w:rPr>
-            </w:pPr>
-            <w:r>
-              <w:rPr>
-                <w:rFonts w:asciiTheme="minorHAnsi" w:hAnsiTheme="minorHAnsi" w:ascii="Calibri" w:hAnsi="Calibri"/>
-                <w:sz w:val="22"/>
-                <w:szCs w:val="22"/>
-              </w:rPr>
-              <w:t>2. **Metodología de Enseñanza Basada en Problemas (ABP):**</w:t>
-            </w:r>
-          </w:p>
-          <w:p>
-            <w:pPr>
-              <w:pStyle w:val="Normal"/>
-              <w:widowControl/>
-              <w:suppressAutoHyphens w:val="true"/>
-              <w:spacing w:before="0" w:after="0"/>
-              <w:jc w:val="both"/>
-              <w:rPr>
-                <w:rFonts w:ascii="Calibri" w:hAnsi="Calibri" w:asciiTheme="minorHAnsi" w:hAnsiTheme="minorHAnsi"/>
-                <w:sz w:val="22"/>
-                <w:szCs w:val="22"/>
-              </w:rPr>
-            </w:pPr>
-            <w:r>
-              <w:rPr>
-                <w:rFonts w:asciiTheme="minorHAnsi" w:hAnsiTheme="minorHAnsi" w:ascii="Calibri" w:hAnsi="Calibri"/>
-                <w:sz w:val="22"/>
-                <w:szCs w:val="22"/>
-              </w:rPr>
-              <w:t xml:space="preserve">   </w:t>
-            </w:r>
-            <w:r>
-              <w:rPr>
-                <w:rFonts w:asciiTheme="minorHAnsi" w:hAnsiTheme="minorHAnsi" w:ascii="Calibri" w:hAnsi="Calibri"/>
-                <w:sz w:val="22"/>
-                <w:szCs w:val="22"/>
-              </w:rPr>
-              <w:t>- **Cómo Aporta:** A través de problemas y casos de estudio reales, los estudiantes aplican conceptos teóricos a situaciones prácticas. Se fomenta la resolución de problemas y el pensamiento crítico.</w:t>
-            </w:r>
-          </w:p>
-          <w:p>
-            <w:pPr>
-              <w:pStyle w:val="Normal"/>
-              <w:widowControl/>
-              <w:suppressAutoHyphens w:val="true"/>
-              <w:spacing w:before="0" w:after="0"/>
-              <w:jc w:val="both"/>
-              <w:rPr>
-                <w:rFonts w:ascii="Calibri" w:hAnsi="Calibri" w:asciiTheme="minorHAnsi" w:hAnsiTheme="minorHAnsi"/>
-                <w:sz w:val="22"/>
-                <w:szCs w:val="22"/>
-              </w:rPr>
-            </w:pPr>
-            <w:r>
-              <w:rPr>
-                <w:rFonts w:asciiTheme="minorHAnsi" w:hAnsiTheme="minorHAnsi" w:ascii="Calibri" w:hAnsi="Calibri"/>
-                <w:sz w:val="22"/>
-                <w:szCs w:val="22"/>
-              </w:rPr>
-              <w:t xml:space="preserve">   </w:t>
-            </w:r>
-            <w:r>
-              <w:rPr>
-                <w:rFonts w:asciiTheme="minorHAnsi" w:hAnsiTheme="minorHAnsi" w:ascii="Calibri" w:hAnsi="Calibri"/>
-                <w:sz w:val="22"/>
-                <w:szCs w:val="22"/>
-              </w:rPr>
-              <w:t>- **Beneficios para los Perfiles Académicos:** Desarrolla habilidades de resolución de problemas, análisis crítico y aplicación práctica de los conocimientos, alineándose con las demandas del entorno laboral.</w:t>
-            </w:r>
-          </w:p>
-          <w:p>
-            <w:pPr>
-              <w:pStyle w:val="Normal"/>
-              <w:widowControl/>
-              <w:suppressAutoHyphens w:val="true"/>
-              <w:spacing w:before="0" w:after="0"/>
-              <w:jc w:val="both"/>
-              <w:rPr>
-                <w:rFonts w:ascii="Calibri" w:hAnsi="Calibri" w:asciiTheme="minorHAnsi" w:hAnsiTheme="minorHAnsi"/>
-                <w:sz w:val="22"/>
-                <w:szCs w:val="22"/>
-              </w:rPr>
-            </w:pPr>
-            <w:r>
-              <w:rPr>
-                <w:rFonts w:asciiTheme="minorHAnsi" w:hAnsiTheme="minorHAnsi" w:ascii="Calibri" w:hAnsi="Calibri"/>
-                <w:sz w:val="22"/>
-                <w:szCs w:val="22"/>
-              </w:rPr>
-            </w:r>
-          </w:p>
-          <w:p>
-            <w:pPr>
-              <w:pStyle w:val="Normal"/>
-              <w:widowControl/>
-              <w:suppressAutoHyphens w:val="true"/>
-              <w:spacing w:before="0" w:after="0"/>
-              <w:jc w:val="both"/>
-              <w:rPr>
-                <w:rFonts w:ascii="Calibri" w:hAnsi="Calibri" w:asciiTheme="minorHAnsi" w:hAnsiTheme="minorHAnsi"/>
-                <w:sz w:val="22"/>
-                <w:szCs w:val="22"/>
-              </w:rPr>
-            </w:pPr>
-            <w:r>
-              <w:rPr>
-                <w:rFonts w:asciiTheme="minorHAnsi" w:hAnsiTheme="minorHAnsi" w:ascii="Calibri" w:hAnsi="Calibri"/>
-                <w:sz w:val="22"/>
-                <w:szCs w:val="22"/>
-              </w:rPr>
-              <w:t>3. **Promoción de Políticas de Ciencia Libre:**</w:t>
-            </w:r>
-          </w:p>
-          <w:p>
-            <w:pPr>
-              <w:pStyle w:val="Normal"/>
-              <w:widowControl/>
-              <w:suppressAutoHyphens w:val="true"/>
-              <w:spacing w:before="0" w:after="0"/>
-              <w:jc w:val="both"/>
-              <w:rPr>
-                <w:rFonts w:ascii="Calibri" w:hAnsi="Calibri" w:asciiTheme="minorHAnsi" w:hAnsiTheme="minorHAnsi"/>
-                <w:sz w:val="22"/>
-                <w:szCs w:val="22"/>
-              </w:rPr>
-            </w:pPr>
-            <w:r>
-              <w:rPr>
-                <w:rFonts w:asciiTheme="minorHAnsi" w:hAnsiTheme="minorHAnsi" w:ascii="Calibri" w:hAnsi="Calibri"/>
-                <w:sz w:val="22"/>
-                <w:szCs w:val="22"/>
-              </w:rPr>
-              <w:t xml:space="preserve">   </w:t>
-            </w:r>
-            <w:r>
-              <w:rPr>
-                <w:rFonts w:asciiTheme="minorHAnsi" w:hAnsiTheme="minorHAnsi" w:ascii="Calibri" w:hAnsi="Calibri"/>
-                <w:sz w:val="22"/>
-                <w:szCs w:val="22"/>
-              </w:rPr>
-              <w:t>- **Cómo Aporta:** Se enfoca en el uso de recursos de código abierto, bibliotecas y herramientas de machine learning disponibles gratuitamente. Incentiva el acceso libre y la colaboración en la comunidad científica.</w:t>
-            </w:r>
-          </w:p>
-          <w:p>
-            <w:pPr>
-              <w:pStyle w:val="Normal"/>
-              <w:widowControl/>
-              <w:suppressAutoHyphens w:val="true"/>
-              <w:spacing w:before="0" w:after="0"/>
-              <w:jc w:val="both"/>
-              <w:rPr>
-                <w:rFonts w:ascii="Calibri" w:hAnsi="Calibri" w:asciiTheme="minorHAnsi" w:hAnsiTheme="minorHAnsi"/>
-                <w:sz w:val="22"/>
-                <w:szCs w:val="22"/>
-              </w:rPr>
-            </w:pPr>
-            <w:r>
-              <w:rPr>
-                <w:rFonts w:asciiTheme="minorHAnsi" w:hAnsiTheme="minorHAnsi" w:ascii="Calibri" w:hAnsi="Calibri"/>
-                <w:sz w:val="22"/>
-                <w:szCs w:val="22"/>
-              </w:rPr>
-              <w:t xml:space="preserve">   </w:t>
-            </w:r>
-            <w:r>
-              <w:rPr>
-                <w:rFonts w:asciiTheme="minorHAnsi" w:hAnsiTheme="minorHAnsi" w:ascii="Calibri" w:hAnsi="Calibri"/>
-                <w:sz w:val="22"/>
-                <w:szCs w:val="22"/>
-              </w:rPr>
-              <w:t>- **Beneficios para los Perfiles Académicos:** Fomenta la ética científica y la colaboración abierta, promoviendo la transparencia y la accesibilidad en la investigación.</w:t>
-            </w:r>
-          </w:p>
-          <w:p>
-            <w:pPr>
-              <w:pStyle w:val="Normal"/>
-              <w:widowControl/>
-              <w:suppressAutoHyphens w:val="true"/>
-              <w:spacing w:before="0" w:after="0"/>
-              <w:jc w:val="both"/>
-              <w:rPr>
-                <w:rFonts w:ascii="Calibri" w:hAnsi="Calibri" w:asciiTheme="minorHAnsi" w:hAnsiTheme="minorHAnsi"/>
-                <w:sz w:val="22"/>
-                <w:szCs w:val="22"/>
-              </w:rPr>
-            </w:pPr>
-            <w:r>
-              <w:rPr>
-                <w:rFonts w:asciiTheme="minorHAnsi" w:hAnsiTheme="minorHAnsi" w:ascii="Calibri" w:hAnsi="Calibri"/>
-                <w:sz w:val="22"/>
-                <w:szCs w:val="22"/>
-              </w:rPr>
-            </w:r>
-          </w:p>
-          <w:p>
-            <w:pPr>
-              <w:pStyle w:val="Normal"/>
-              <w:widowControl/>
-              <w:suppressAutoHyphens w:val="true"/>
-              <w:spacing w:before="0" w:after="0"/>
-              <w:jc w:val="both"/>
-              <w:rPr>
-                <w:rFonts w:ascii="Calibri" w:hAnsi="Calibri" w:asciiTheme="minorHAnsi" w:hAnsiTheme="minorHAnsi"/>
-                <w:sz w:val="22"/>
-                <w:szCs w:val="22"/>
-              </w:rPr>
-            </w:pPr>
-            <w:r>
-              <w:rPr>
-                <w:rFonts w:asciiTheme="minorHAnsi" w:hAnsiTheme="minorHAnsi" w:ascii="Calibri" w:hAnsi="Calibri"/>
-                <w:sz w:val="22"/>
-                <w:szCs w:val="22"/>
-              </w:rPr>
-              <w:t>4. **Desarrollo de Habilidades de Comunicación Científica:**</w:t>
-            </w:r>
-          </w:p>
-          <w:p>
-            <w:pPr>
-              <w:pStyle w:val="Normal"/>
-              <w:widowControl/>
-              <w:suppressAutoHyphens w:val="true"/>
-              <w:spacing w:before="0" w:after="0"/>
-              <w:jc w:val="both"/>
-              <w:rPr>
-                <w:rFonts w:ascii="Calibri" w:hAnsi="Calibri" w:asciiTheme="minorHAnsi" w:hAnsiTheme="minorHAnsi"/>
-                <w:sz w:val="22"/>
-                <w:szCs w:val="22"/>
-              </w:rPr>
-            </w:pPr>
-            <w:r>
-              <w:rPr>
-                <w:rFonts w:asciiTheme="minorHAnsi" w:hAnsiTheme="minorHAnsi" w:ascii="Calibri" w:hAnsi="Calibri"/>
-                <w:sz w:val="22"/>
-                <w:szCs w:val="22"/>
-              </w:rPr>
-              <w:t xml:space="preserve">   </w:t>
-            </w:r>
-            <w:r>
-              <w:rPr>
-                <w:rFonts w:asciiTheme="minorHAnsi" w:hAnsiTheme="minorHAnsi" w:ascii="Calibri" w:hAnsi="Calibri"/>
-                <w:sz w:val="22"/>
-                <w:szCs w:val="22"/>
-              </w:rPr>
-              <w:t>- **Cómo Aporta:** Incorpora actividades que requieren la presentación y explicación de resultados de manera clara y comprensible. Incluye la redacción de informes, la elaboración de presentaciones y la comunicación efectiva de hallazgos.</w:t>
-            </w:r>
-          </w:p>
-          <w:p>
-            <w:pPr>
-              <w:pStyle w:val="Normal"/>
-              <w:widowControl/>
-              <w:suppressAutoHyphens w:val="true"/>
-              <w:spacing w:before="0" w:after="0"/>
-              <w:jc w:val="both"/>
-              <w:rPr>
-                <w:rFonts w:ascii="Calibri" w:hAnsi="Calibri" w:asciiTheme="minorHAnsi" w:hAnsiTheme="minorHAnsi"/>
-                <w:sz w:val="22"/>
-                <w:szCs w:val="22"/>
-              </w:rPr>
-            </w:pPr>
-            <w:r>
-              <w:rPr>
-                <w:rFonts w:asciiTheme="minorHAnsi" w:hAnsiTheme="minorHAnsi" w:ascii="Calibri" w:hAnsi="Calibri"/>
-                <w:sz w:val="22"/>
-                <w:szCs w:val="22"/>
-              </w:rPr>
-              <w:t xml:space="preserve">   </w:t>
-            </w:r>
-            <w:r>
-              <w:rPr>
-                <w:rFonts w:asciiTheme="minorHAnsi" w:hAnsiTheme="minorHAnsi" w:ascii="Calibri" w:hAnsi="Calibri"/>
-                <w:sz w:val="22"/>
-                <w:szCs w:val="22"/>
-              </w:rPr>
-              <w:t>- **Beneficios para los Perfiles Académicos:** Mejora las habilidades de comunicación escrita y oral, esenciales para compartir resultados de investigación y colaborar de manera efectiva en el ámbito científico.</w:t>
-            </w:r>
-          </w:p>
-          <w:p>
-            <w:pPr>
-              <w:pStyle w:val="Normal"/>
-              <w:widowControl/>
-              <w:suppressAutoHyphens w:val="true"/>
-              <w:spacing w:before="0" w:after="0"/>
-              <w:jc w:val="both"/>
-              <w:rPr>
-                <w:rFonts w:ascii="Calibri" w:hAnsi="Calibri" w:asciiTheme="minorHAnsi" w:hAnsiTheme="minorHAnsi"/>
-                <w:sz w:val="22"/>
-                <w:szCs w:val="22"/>
-              </w:rPr>
-            </w:pPr>
-            <w:r>
-              <w:rPr>
-                <w:rFonts w:asciiTheme="minorHAnsi" w:hAnsiTheme="minorHAnsi" w:ascii="Calibri" w:hAnsi="Calibri"/>
-                <w:sz w:val="22"/>
-                <w:szCs w:val="22"/>
-              </w:rPr>
-            </w:r>
-          </w:p>
-          <w:p>
-            <w:pPr>
-              <w:pStyle w:val="Normal"/>
-              <w:widowControl/>
-              <w:suppressAutoHyphens w:val="true"/>
-              <w:spacing w:before="0" w:after="0"/>
-              <w:jc w:val="both"/>
-              <w:rPr>
-                <w:rFonts w:ascii="Calibri" w:hAnsi="Calibri" w:asciiTheme="minorHAnsi" w:hAnsiTheme="minorHAnsi"/>
-                <w:sz w:val="22"/>
-                <w:szCs w:val="22"/>
-              </w:rPr>
-            </w:pPr>
-            <w:r>
-              <w:rPr>
-                <w:rFonts w:asciiTheme="minorHAnsi" w:hAnsiTheme="minorHAnsi" w:ascii="Calibri" w:hAnsi="Calibri"/>
+            </w:r>
+          </w:p>
+          <w:p>
+            <w:pPr>
+              <w:pStyle w:val="Normal"/>
+              <w:widowControl/>
+              <w:suppressAutoHyphens w:val="true"/>
+              <w:spacing w:before="0" w:after="0"/>
+              <w:jc w:val="both"/>
+              <w:rPr>
+                <w:rFonts w:ascii="Calibri" w:hAnsi="Calibri" w:asciiTheme="minorHAnsi" w:hAnsiTheme="minorHAnsi"/>
+                <w:sz w:val="22"/>
+                <w:szCs w:val="22"/>
+              </w:rPr>
+            </w:pPr>
+            <w:r>
+              <w:rPr>
+                <w:rFonts w:ascii="Calibri" w:hAnsi="Calibri" w:asciiTheme="minorHAnsi" w:hAnsiTheme="minorHAnsi"/>
                 <w:sz w:val="22"/>
                 <w:szCs w:val="22"/>
               </w:rPr>
@@ -3488,11 +3425,114 @@
             </w:pPr>
             <w:r>
               <w:rPr>
+                <w:rFonts w:ascii="Calibri" w:hAnsi="Calibri" w:asciiTheme="minorHAnsi" w:hAnsiTheme="minorHAnsi"/>
+                <w:sz w:val="22"/>
+                <w:szCs w:val="22"/>
+              </w:rPr>
+              <w:t>**Elementos Orientadores del Curso de Machine Learning con Python en la Universidad de Antioquia, Colombia:**</w:t>
+            </w:r>
+          </w:p>
+          <w:p>
+            <w:pPr>
+              <w:pStyle w:val="Normal"/>
+              <w:widowControl/>
+              <w:suppressAutoHyphens w:val="true"/>
+              <w:spacing w:before="0" w:after="0"/>
+              <w:jc w:val="both"/>
+              <w:rPr>
+                <w:rFonts w:ascii="Calibri" w:hAnsi="Calibri" w:asciiTheme="minorHAnsi" w:hAnsiTheme="minorHAnsi"/>
+                <w:sz w:val="22"/>
+                <w:szCs w:val="22"/>
+              </w:rPr>
+            </w:pPr>
+            <w:r>
+              <w:rPr>
                 <w:rFonts w:asciiTheme="minorHAnsi" w:hAnsiTheme="minorHAnsi" w:ascii="Calibri" w:hAnsi="Calibri"/>
                 <w:sz w:val="22"/>
                 <w:szCs w:val="22"/>
               </w:rPr>
-              <w:t>**Elementos Orientadores del Curso de Machine Learning con Python en la Universidad de Antioquia, Colombia:**</w:t>
+            </w:r>
+          </w:p>
+          <w:p>
+            <w:pPr>
+              <w:pStyle w:val="Normal"/>
+              <w:widowControl/>
+              <w:suppressAutoHyphens w:val="true"/>
+              <w:spacing w:before="0" w:after="0"/>
+              <w:jc w:val="both"/>
+              <w:rPr>
+                <w:rFonts w:ascii="Calibri" w:hAnsi="Calibri" w:asciiTheme="minorHAnsi" w:hAnsiTheme="minorHAnsi"/>
+                <w:sz w:val="22"/>
+                <w:szCs w:val="22"/>
+              </w:rPr>
+            </w:pPr>
+            <w:r>
+              <w:rPr>
+                <w:rFonts w:ascii="Calibri" w:hAnsi="Calibri" w:asciiTheme="minorHAnsi" w:hAnsiTheme="minorHAnsi"/>
+                <w:sz w:val="22"/>
+                <w:szCs w:val="22"/>
+              </w:rPr>
+              <w:t>1. **Problemas de Formación:**</w:t>
+            </w:r>
+          </w:p>
+          <w:p>
+            <w:pPr>
+              <w:pStyle w:val="Normal"/>
+              <w:widowControl/>
+              <w:suppressAutoHyphens w:val="true"/>
+              <w:spacing w:before="0" w:after="0"/>
+              <w:jc w:val="both"/>
+              <w:rPr>
+                <w:rFonts w:ascii="Calibri" w:hAnsi="Calibri" w:asciiTheme="minorHAnsi" w:hAnsiTheme="minorHAnsi"/>
+                <w:sz w:val="22"/>
+                <w:szCs w:val="22"/>
+              </w:rPr>
+            </w:pPr>
+            <w:r>
+              <w:rPr>
+                <w:rFonts w:ascii="Calibri" w:hAnsi="Calibri" w:asciiTheme="minorHAnsi" w:hAnsiTheme="minorHAnsi"/>
+                <w:sz w:val="22"/>
+                <w:szCs w:val="22"/>
+              </w:rPr>
+              <w:t xml:space="preserve">   </w:t>
+            </w:r>
+            <w:r>
+              <w:rPr>
+                <w:rFonts w:ascii="Calibri" w:hAnsi="Calibri" w:asciiTheme="minorHAnsi" w:hAnsiTheme="minorHAnsi"/>
+                <w:sz w:val="22"/>
+                <w:szCs w:val="22"/>
+              </w:rPr>
+              <w:t>- **Problema Principal:** Escasa formación en machine learning y su aplicación práctica con Python en los estudiantes.</w:t>
+            </w:r>
+          </w:p>
+          <w:p>
+            <w:pPr>
+              <w:pStyle w:val="Normal"/>
+              <w:widowControl/>
+              <w:suppressAutoHyphens w:val="true"/>
+              <w:spacing w:before="0" w:after="0"/>
+              <w:jc w:val="both"/>
+              <w:rPr>
+                <w:rFonts w:ascii="Calibri" w:hAnsi="Calibri" w:asciiTheme="minorHAnsi" w:hAnsiTheme="minorHAnsi"/>
+                <w:sz w:val="22"/>
+                <w:szCs w:val="22"/>
+              </w:rPr>
+            </w:pPr>
+            <w:r>
+              <w:rPr>
+                <w:rFonts w:ascii="Calibri" w:hAnsi="Calibri" w:asciiTheme="minorHAnsi" w:hAnsiTheme="minorHAnsi"/>
+                <w:sz w:val="22"/>
+                <w:szCs w:val="22"/>
+              </w:rPr>
+              <w:t xml:space="preserve">   </w:t>
+            </w:r>
+            <w:r>
+              <w:rPr>
+                <w:rFonts w:ascii="Calibri" w:hAnsi="Calibri" w:asciiTheme="minorHAnsi" w:hAnsiTheme="minorHAnsi"/>
+                <w:sz w:val="22"/>
+                <w:szCs w:val="22"/>
+              </w:rPr>
+              <w:t>- **Enfoque:** Diseñar estrategias que aborden la brecha de conocimiento en machine learning, adaptándose a diversos niveles de habilidad y experiencia previa.</w:t>
             </w:r>
           </w:p>
           <w:p>
@@ -3531,11 +3571,204 @@
             </w:pPr>
             <w:r>
               <w:rPr>
+                <w:rFonts w:ascii="Calibri" w:hAnsi="Calibri" w:asciiTheme="minorHAnsi" w:hAnsiTheme="minorHAnsi"/>
+                <w:sz w:val="22"/>
+                <w:szCs w:val="22"/>
+              </w:rPr>
+              <w:t>2. **Propósitos de Formación:**</w:t>
+            </w:r>
+          </w:p>
+          <w:p>
+            <w:pPr>
+              <w:pStyle w:val="Normal"/>
+              <w:widowControl/>
+              <w:suppressAutoHyphens w:val="true"/>
+              <w:spacing w:before="0" w:after="0"/>
+              <w:jc w:val="both"/>
+              <w:rPr>
+                <w:rFonts w:ascii="Calibri" w:hAnsi="Calibri" w:asciiTheme="minorHAnsi" w:hAnsiTheme="minorHAnsi"/>
+                <w:sz w:val="22"/>
+                <w:szCs w:val="22"/>
+              </w:rPr>
+            </w:pPr>
+            <w:r>
+              <w:rPr>
+                <w:rFonts w:ascii="Calibri" w:hAnsi="Calibri" w:asciiTheme="minorHAnsi" w:hAnsiTheme="minorHAnsi"/>
+                <w:sz w:val="22"/>
+                <w:szCs w:val="22"/>
+              </w:rPr>
+              <w:t xml:space="preserve">   </w:t>
+            </w:r>
+            <w:r>
+              <w:rPr>
+                <w:rFonts w:ascii="Calibri" w:hAnsi="Calibri" w:asciiTheme="minorHAnsi" w:hAnsiTheme="minorHAnsi"/>
+                <w:sz w:val="22"/>
+                <w:szCs w:val="22"/>
+              </w:rPr>
+              <w:t>- **Propósito Principal:** Capacitar a los estudiantes para comprender, aplicar y desarrollar soluciones de machine learning utilizando Python.</w:t>
+            </w:r>
+          </w:p>
+          <w:p>
+            <w:pPr>
+              <w:pStyle w:val="Normal"/>
+              <w:widowControl/>
+              <w:suppressAutoHyphens w:val="true"/>
+              <w:spacing w:before="0" w:after="0"/>
+              <w:jc w:val="both"/>
+              <w:rPr>
+                <w:rFonts w:ascii="Calibri" w:hAnsi="Calibri" w:asciiTheme="minorHAnsi" w:hAnsiTheme="minorHAnsi"/>
+                <w:sz w:val="22"/>
+                <w:szCs w:val="22"/>
+              </w:rPr>
+            </w:pPr>
+            <w:r>
+              <w:rPr>
+                <w:rFonts w:ascii="Calibri" w:hAnsi="Calibri" w:asciiTheme="minorHAnsi" w:hAnsiTheme="minorHAnsi"/>
+                <w:sz w:val="22"/>
+                <w:szCs w:val="22"/>
+              </w:rPr>
+              <w:t xml:space="preserve">   </w:t>
+            </w:r>
+            <w:r>
+              <w:rPr>
+                <w:rFonts w:ascii="Calibri" w:hAnsi="Calibri" w:asciiTheme="minorHAnsi" w:hAnsiTheme="minorHAnsi"/>
+                <w:sz w:val="22"/>
+                <w:szCs w:val="22"/>
+              </w:rPr>
+              <w:t>- **Enfoque:** Integrar los principios teóricos con la práctica, promoviendo la resolución de problemas y la aplicación de técnicas de machine learning en contextos del mundo real.</w:t>
+            </w:r>
+          </w:p>
+          <w:p>
+            <w:pPr>
+              <w:pStyle w:val="Normal"/>
+              <w:widowControl/>
+              <w:suppressAutoHyphens w:val="true"/>
+              <w:spacing w:before="0" w:after="0"/>
+              <w:jc w:val="both"/>
+              <w:rPr>
+                <w:rFonts w:ascii="Calibri" w:hAnsi="Calibri" w:asciiTheme="minorHAnsi" w:hAnsiTheme="minorHAnsi"/>
+                <w:sz w:val="22"/>
+                <w:szCs w:val="22"/>
+              </w:rPr>
+            </w:pPr>
+            <w:r>
+              <w:rPr>
                 <w:rFonts w:asciiTheme="minorHAnsi" w:hAnsiTheme="minorHAnsi" w:ascii="Calibri" w:hAnsi="Calibri"/>
                 <w:sz w:val="22"/>
                 <w:szCs w:val="22"/>
               </w:rPr>
-              <w:t>1. **Problemas de Formación:**</w:t>
+            </w:r>
+          </w:p>
+          <w:p>
+            <w:pPr>
+              <w:pStyle w:val="Normal"/>
+              <w:widowControl/>
+              <w:suppressAutoHyphens w:val="true"/>
+              <w:spacing w:before="0" w:after="0"/>
+              <w:jc w:val="both"/>
+              <w:rPr>
+                <w:rFonts w:ascii="Calibri" w:hAnsi="Calibri" w:asciiTheme="minorHAnsi" w:hAnsiTheme="minorHAnsi"/>
+                <w:sz w:val="22"/>
+                <w:szCs w:val="22"/>
+              </w:rPr>
+            </w:pPr>
+            <w:r>
+              <w:rPr>
+                <w:rFonts w:ascii="Calibri" w:hAnsi="Calibri" w:asciiTheme="minorHAnsi" w:hAnsiTheme="minorHAnsi"/>
+                <w:sz w:val="22"/>
+                <w:szCs w:val="22"/>
+              </w:rPr>
+              <w:t>3. **Objetivos:**</w:t>
+            </w:r>
+          </w:p>
+          <w:p>
+            <w:pPr>
+              <w:pStyle w:val="Normal"/>
+              <w:widowControl/>
+              <w:suppressAutoHyphens w:val="true"/>
+              <w:spacing w:before="0" w:after="0"/>
+              <w:jc w:val="both"/>
+              <w:rPr>
+                <w:rFonts w:ascii="Calibri" w:hAnsi="Calibri" w:asciiTheme="minorHAnsi" w:hAnsiTheme="minorHAnsi"/>
+                <w:sz w:val="22"/>
+                <w:szCs w:val="22"/>
+              </w:rPr>
+            </w:pPr>
+            <w:r>
+              <w:rPr>
+                <w:rFonts w:ascii="Calibri" w:hAnsi="Calibri" w:asciiTheme="minorHAnsi" w:hAnsiTheme="minorHAnsi"/>
+                <w:sz w:val="22"/>
+                <w:szCs w:val="22"/>
+              </w:rPr>
+              <w:t xml:space="preserve">   </w:t>
+            </w:r>
+            <w:r>
+              <w:rPr>
+                <w:rFonts w:ascii="Calibri" w:hAnsi="Calibri" w:asciiTheme="minorHAnsi" w:hAnsiTheme="minorHAnsi"/>
+                <w:sz w:val="22"/>
+                <w:szCs w:val="22"/>
+              </w:rPr>
+              <w:t>- **Objetivo Específico 1:** Comprender los fundamentos teóricos del machine learning.</w:t>
+            </w:r>
+          </w:p>
+          <w:p>
+            <w:pPr>
+              <w:pStyle w:val="Normal"/>
+              <w:widowControl/>
+              <w:suppressAutoHyphens w:val="true"/>
+              <w:spacing w:before="0" w:after="0"/>
+              <w:jc w:val="both"/>
+              <w:rPr>
+                <w:rFonts w:ascii="Calibri" w:hAnsi="Calibri" w:asciiTheme="minorHAnsi" w:hAnsiTheme="minorHAnsi"/>
+                <w:sz w:val="22"/>
+                <w:szCs w:val="22"/>
+              </w:rPr>
+            </w:pPr>
+            <w:r>
+              <w:rPr>
+                <w:rFonts w:ascii="Calibri" w:hAnsi="Calibri" w:asciiTheme="minorHAnsi" w:hAnsiTheme="minorHAnsi"/>
+                <w:sz w:val="22"/>
+                <w:szCs w:val="22"/>
+              </w:rPr>
+              <w:t xml:space="preserve">   </w:t>
+            </w:r>
+            <w:r>
+              <w:rPr>
+                <w:rFonts w:ascii="Calibri" w:hAnsi="Calibri" w:asciiTheme="minorHAnsi" w:hAnsiTheme="minorHAnsi"/>
+                <w:sz w:val="22"/>
+                <w:szCs w:val="22"/>
+              </w:rPr>
+              <w:t>- **Objetivo Específico 2:** Desarrollar habilidades prácticas en la implementación de algoritmos de machine learning con Python.</w:t>
+            </w:r>
+          </w:p>
+          <w:p>
+            <w:pPr>
+              <w:pStyle w:val="Normal"/>
+              <w:widowControl/>
+              <w:suppressAutoHyphens w:val="true"/>
+              <w:spacing w:before="0" w:after="0"/>
+              <w:jc w:val="both"/>
+              <w:rPr>
+                <w:rFonts w:ascii="Calibri" w:hAnsi="Calibri" w:asciiTheme="minorHAnsi" w:hAnsiTheme="minorHAnsi"/>
+                <w:sz w:val="22"/>
+                <w:szCs w:val="22"/>
+              </w:rPr>
+            </w:pPr>
+            <w:r>
+              <w:rPr>
+                <w:rFonts w:ascii="Calibri" w:hAnsi="Calibri" w:asciiTheme="minorHAnsi" w:hAnsiTheme="minorHAnsi"/>
+                <w:sz w:val="22"/>
+                <w:szCs w:val="22"/>
+              </w:rPr>
+              <w:t xml:space="preserve">   </w:t>
+            </w:r>
+            <w:r>
+              <w:rPr>
+                <w:rFonts w:ascii="Calibri" w:hAnsi="Calibri" w:asciiTheme="minorHAnsi" w:hAnsiTheme="minorHAnsi"/>
+                <w:sz w:val="22"/>
+                <w:szCs w:val="22"/>
+              </w:rPr>
+              <w:t>- **Objetivo Específico 3:** Aplicar el machine learning a problemas específicos en diversos campos.</w:t>
             </w:r>
           </w:p>
           <w:p>
@@ -3557,15 +3790,251 @@
                 <w:sz w:val="22"/>
                 <w:szCs w:val="22"/>
               </w:rPr>
+            </w:r>
+          </w:p>
+          <w:p>
+            <w:pPr>
+              <w:pStyle w:val="Normal"/>
+              <w:widowControl/>
+              <w:suppressAutoHyphens w:val="true"/>
+              <w:spacing w:before="0" w:after="0"/>
+              <w:jc w:val="both"/>
+              <w:rPr>
+                <w:rFonts w:ascii="Calibri" w:hAnsi="Calibri" w:asciiTheme="minorHAnsi" w:hAnsiTheme="minorHAnsi"/>
+                <w:sz w:val="22"/>
+                <w:szCs w:val="22"/>
+              </w:rPr>
+            </w:pPr>
+            <w:r>
+              <w:rPr>
+                <w:rFonts w:ascii="Calibri" w:hAnsi="Calibri" w:asciiTheme="minorHAnsi" w:hAnsiTheme="minorHAnsi"/>
+                <w:sz w:val="22"/>
+                <w:szCs w:val="22"/>
+              </w:rPr>
+              <w:t>4. **Capacidades y Competencias:**</w:t>
+            </w:r>
+          </w:p>
+          <w:p>
+            <w:pPr>
+              <w:pStyle w:val="Normal"/>
+              <w:widowControl/>
+              <w:suppressAutoHyphens w:val="true"/>
+              <w:spacing w:before="0" w:after="0"/>
+              <w:jc w:val="both"/>
+              <w:rPr>
+                <w:rFonts w:ascii="Calibri" w:hAnsi="Calibri" w:asciiTheme="minorHAnsi" w:hAnsiTheme="minorHAnsi"/>
+                <w:sz w:val="22"/>
+                <w:szCs w:val="22"/>
+              </w:rPr>
+            </w:pPr>
+            <w:r>
+              <w:rPr>
+                <w:rFonts w:ascii="Calibri" w:hAnsi="Calibri" w:asciiTheme="minorHAnsi" w:hAnsiTheme="minorHAnsi"/>
+                <w:sz w:val="22"/>
+                <w:szCs w:val="22"/>
+              </w:rPr>
               <w:t xml:space="preserve">   </w:t>
             </w:r>
             <w:r>
               <w:rPr>
+                <w:rFonts w:ascii="Calibri" w:hAnsi="Calibri" w:asciiTheme="minorHAnsi" w:hAnsiTheme="minorHAnsi"/>
+                <w:sz w:val="22"/>
+                <w:szCs w:val="22"/>
+              </w:rPr>
+              <w:t>- **Capacidad 1:** Programar y aplicar algoritmos de machine learning utilizando Python.</w:t>
+            </w:r>
+          </w:p>
+          <w:p>
+            <w:pPr>
+              <w:pStyle w:val="Normal"/>
+              <w:widowControl/>
+              <w:suppressAutoHyphens w:val="true"/>
+              <w:spacing w:before="0" w:after="0"/>
+              <w:jc w:val="both"/>
+              <w:rPr>
+                <w:rFonts w:ascii="Calibri" w:hAnsi="Calibri" w:asciiTheme="minorHAnsi" w:hAnsiTheme="minorHAnsi"/>
+                <w:sz w:val="22"/>
+                <w:szCs w:val="22"/>
+              </w:rPr>
+            </w:pPr>
+            <w:r>
+              <w:rPr>
+                <w:rFonts w:ascii="Calibri" w:hAnsi="Calibri" w:asciiTheme="minorHAnsi" w:hAnsiTheme="minorHAnsi"/>
+                <w:sz w:val="22"/>
+                <w:szCs w:val="22"/>
+              </w:rPr>
+              <w:t xml:space="preserve">   </w:t>
+            </w:r>
+            <w:r>
+              <w:rPr>
+                <w:rFonts w:ascii="Calibri" w:hAnsi="Calibri" w:asciiTheme="minorHAnsi" w:hAnsiTheme="minorHAnsi"/>
+                <w:sz w:val="22"/>
+                <w:szCs w:val="22"/>
+              </w:rPr>
+              <w:t>- **Capacidad 2:** Evaluar críticamente la selección y rendimiento de modelos de machine learning.</w:t>
+            </w:r>
+          </w:p>
+          <w:p>
+            <w:pPr>
+              <w:pStyle w:val="Normal"/>
+              <w:widowControl/>
+              <w:suppressAutoHyphens w:val="true"/>
+              <w:spacing w:before="0" w:after="0"/>
+              <w:jc w:val="both"/>
+              <w:rPr>
+                <w:rFonts w:ascii="Calibri" w:hAnsi="Calibri" w:asciiTheme="minorHAnsi" w:hAnsiTheme="minorHAnsi"/>
+                <w:sz w:val="22"/>
+                <w:szCs w:val="22"/>
+              </w:rPr>
+            </w:pPr>
+            <w:r>
+              <w:rPr>
+                <w:rFonts w:ascii="Calibri" w:hAnsi="Calibri" w:asciiTheme="minorHAnsi" w:hAnsiTheme="minorHAnsi"/>
+                <w:sz w:val="22"/>
+                <w:szCs w:val="22"/>
+              </w:rPr>
+              <w:t xml:space="preserve">   </w:t>
+            </w:r>
+            <w:r>
+              <w:rPr>
+                <w:rFonts w:ascii="Calibri" w:hAnsi="Calibri" w:asciiTheme="minorHAnsi" w:hAnsiTheme="minorHAnsi"/>
+                <w:sz w:val="22"/>
+                <w:szCs w:val="22"/>
+              </w:rPr>
+              <w:t>- **Competencia 1:** Aplicar soluciones de machine learning a problemas del mundo real.</w:t>
+            </w:r>
+          </w:p>
+          <w:p>
+            <w:pPr>
+              <w:pStyle w:val="Normal"/>
+              <w:widowControl/>
+              <w:suppressAutoHyphens w:val="true"/>
+              <w:spacing w:before="0" w:after="0"/>
+              <w:jc w:val="both"/>
+              <w:rPr>
+                <w:rFonts w:ascii="Calibri" w:hAnsi="Calibri" w:asciiTheme="minorHAnsi" w:hAnsiTheme="minorHAnsi"/>
+                <w:sz w:val="22"/>
+                <w:szCs w:val="22"/>
+              </w:rPr>
+            </w:pPr>
+            <w:r>
+              <w:rPr>
                 <w:rFonts w:asciiTheme="minorHAnsi" w:hAnsiTheme="minorHAnsi" w:ascii="Calibri" w:hAnsi="Calibri"/>
                 <w:sz w:val="22"/>
                 <w:szCs w:val="22"/>
               </w:rPr>
-              <w:t>- **Problema Principal:** Escasa formación en machine learning y su aplicación práctica con Python en los estudiantes.</w:t>
+            </w:r>
+          </w:p>
+          <w:p>
+            <w:pPr>
+              <w:pStyle w:val="Normal"/>
+              <w:widowControl/>
+              <w:suppressAutoHyphens w:val="true"/>
+              <w:spacing w:before="0" w:after="0"/>
+              <w:jc w:val="both"/>
+              <w:rPr>
+                <w:rFonts w:ascii="Calibri" w:hAnsi="Calibri" w:asciiTheme="minorHAnsi" w:hAnsiTheme="minorHAnsi"/>
+                <w:sz w:val="22"/>
+                <w:szCs w:val="22"/>
+              </w:rPr>
+            </w:pPr>
+            <w:r>
+              <w:rPr>
+                <w:rFonts w:ascii="Calibri" w:hAnsi="Calibri" w:asciiTheme="minorHAnsi" w:hAnsiTheme="minorHAnsi"/>
+                <w:sz w:val="22"/>
+                <w:szCs w:val="22"/>
+              </w:rPr>
+              <w:t>5. **Contenidos o Temas:**</w:t>
+            </w:r>
+          </w:p>
+          <w:p>
+            <w:pPr>
+              <w:pStyle w:val="Normal"/>
+              <w:widowControl/>
+              <w:suppressAutoHyphens w:val="true"/>
+              <w:spacing w:before="0" w:after="0"/>
+              <w:jc w:val="both"/>
+              <w:rPr>
+                <w:rFonts w:ascii="Calibri" w:hAnsi="Calibri" w:asciiTheme="minorHAnsi" w:hAnsiTheme="minorHAnsi"/>
+                <w:sz w:val="22"/>
+                <w:szCs w:val="22"/>
+              </w:rPr>
+            </w:pPr>
+            <w:r>
+              <w:rPr>
+                <w:rFonts w:ascii="Calibri" w:hAnsi="Calibri" w:asciiTheme="minorHAnsi" w:hAnsiTheme="minorHAnsi"/>
+                <w:sz w:val="22"/>
+                <w:szCs w:val="22"/>
+              </w:rPr>
+              <w:t xml:space="preserve">   </w:t>
+            </w:r>
+            <w:r>
+              <w:rPr>
+                <w:rFonts w:ascii="Calibri" w:hAnsi="Calibri" w:asciiTheme="minorHAnsi" w:hAnsiTheme="minorHAnsi"/>
+                <w:sz w:val="22"/>
+                <w:szCs w:val="22"/>
+              </w:rPr>
+              <w:t>- **Tema 1:** Introducción a Python y bibliotecas de machine learning (e.g., NumPy, pandas, scikit-learn).</w:t>
+            </w:r>
+          </w:p>
+          <w:p>
+            <w:pPr>
+              <w:pStyle w:val="Normal"/>
+              <w:widowControl/>
+              <w:suppressAutoHyphens w:val="true"/>
+              <w:spacing w:before="0" w:after="0"/>
+              <w:jc w:val="both"/>
+              <w:rPr>
+                <w:rFonts w:ascii="Calibri" w:hAnsi="Calibri" w:asciiTheme="minorHAnsi" w:hAnsiTheme="minorHAnsi"/>
+                <w:sz w:val="22"/>
+                <w:szCs w:val="22"/>
+              </w:rPr>
+            </w:pPr>
+            <w:r>
+              <w:rPr>
+                <w:rFonts w:ascii="Calibri" w:hAnsi="Calibri" w:asciiTheme="minorHAnsi" w:hAnsiTheme="minorHAnsi"/>
+                <w:sz w:val="22"/>
+                <w:szCs w:val="22"/>
+              </w:rPr>
+              <w:t xml:space="preserve">   </w:t>
+            </w:r>
+            <w:r>
+              <w:rPr>
+                <w:rFonts w:ascii="Calibri" w:hAnsi="Calibri" w:asciiTheme="minorHAnsi" w:hAnsiTheme="minorHAnsi"/>
+                <w:sz w:val="22"/>
+                <w:szCs w:val="22"/>
+              </w:rPr>
+              <w:t>- **Tema 2:** Fundamentos teóricos de machine learning (e.g., tipos de algoritmos, evaluación de modelos).</w:t>
+            </w:r>
+          </w:p>
+          <w:p>
+            <w:pPr>
+              <w:pStyle w:val="Normal"/>
+              <w:widowControl/>
+              <w:suppressAutoHyphens w:val="true"/>
+              <w:spacing w:before="0" w:after="0"/>
+              <w:jc w:val="both"/>
+              <w:rPr>
+                <w:rFonts w:ascii="Calibri" w:hAnsi="Calibri" w:asciiTheme="minorHAnsi" w:hAnsiTheme="minorHAnsi"/>
+                <w:sz w:val="22"/>
+                <w:szCs w:val="22"/>
+              </w:rPr>
+            </w:pPr>
+            <w:r>
+              <w:rPr>
+                <w:rFonts w:ascii="Calibri" w:hAnsi="Calibri" w:asciiTheme="minorHAnsi" w:hAnsiTheme="minorHAnsi"/>
+                <w:sz w:val="22"/>
+                <w:szCs w:val="22"/>
+              </w:rPr>
+              <w:t xml:space="preserve">   </w:t>
+            </w:r>
+            <w:r>
+              <w:rPr>
+                <w:rFonts w:ascii="Calibri" w:hAnsi="Calibri" w:asciiTheme="minorHAnsi" w:hAnsiTheme="minorHAnsi"/>
+                <w:sz w:val="22"/>
+                <w:szCs w:val="22"/>
+              </w:rPr>
+              <w:t>- **Tema 3:** Aplicación práctica de machine learning en casos de estudio específicos.</w:t>
             </w:r>
           </w:p>
           <w:p>
@@ -3587,15 +4056,191 @@
                 <w:sz w:val="22"/>
                 <w:szCs w:val="22"/>
               </w:rPr>
+            </w:r>
+          </w:p>
+          <w:p>
+            <w:pPr>
+              <w:pStyle w:val="Normal"/>
+              <w:widowControl/>
+              <w:suppressAutoHyphens w:val="true"/>
+              <w:spacing w:before="0" w:after="0"/>
+              <w:jc w:val="both"/>
+              <w:rPr>
+                <w:rFonts w:ascii="Calibri" w:hAnsi="Calibri" w:asciiTheme="minorHAnsi" w:hAnsiTheme="minorHAnsi"/>
+                <w:sz w:val="22"/>
+                <w:szCs w:val="22"/>
+              </w:rPr>
+            </w:pPr>
+            <w:r>
+              <w:rPr>
+                <w:rFonts w:ascii="Calibri" w:hAnsi="Calibri" w:asciiTheme="minorHAnsi" w:hAnsiTheme="minorHAnsi"/>
+                <w:sz w:val="22"/>
+                <w:szCs w:val="22"/>
+              </w:rPr>
+              <w:t>6. **Metodologías de Enseñanza:**</w:t>
+            </w:r>
+          </w:p>
+          <w:p>
+            <w:pPr>
+              <w:pStyle w:val="Normal"/>
+              <w:widowControl/>
+              <w:suppressAutoHyphens w:val="true"/>
+              <w:spacing w:before="0" w:after="0"/>
+              <w:jc w:val="both"/>
+              <w:rPr>
+                <w:rFonts w:ascii="Calibri" w:hAnsi="Calibri" w:asciiTheme="minorHAnsi" w:hAnsiTheme="minorHAnsi"/>
+                <w:sz w:val="22"/>
+                <w:szCs w:val="22"/>
+              </w:rPr>
+            </w:pPr>
+            <w:r>
+              <w:rPr>
+                <w:rFonts w:ascii="Calibri" w:hAnsi="Calibri" w:asciiTheme="minorHAnsi" w:hAnsiTheme="minorHAnsi"/>
+                <w:sz w:val="22"/>
+                <w:szCs w:val="22"/>
+              </w:rPr>
               <w:t xml:space="preserve">   </w:t>
             </w:r>
             <w:r>
               <w:rPr>
+                <w:rFonts w:ascii="Calibri" w:hAnsi="Calibri" w:asciiTheme="minorHAnsi" w:hAnsiTheme="minorHAnsi"/>
+                <w:sz w:val="22"/>
+                <w:szCs w:val="22"/>
+              </w:rPr>
+              <w:t>- **Metodología Principal:** Flipped learning, donde los estudiantes adquieren conocimientos teóricos de forma autónoma antes de las clases presenciales y se enfocan en la aplicación práctica en el aula.</w:t>
+            </w:r>
+          </w:p>
+          <w:p>
+            <w:pPr>
+              <w:pStyle w:val="Normal"/>
+              <w:widowControl/>
+              <w:suppressAutoHyphens w:val="true"/>
+              <w:spacing w:before="0" w:after="0"/>
+              <w:jc w:val="both"/>
+              <w:rPr>
+                <w:rFonts w:ascii="Calibri" w:hAnsi="Calibri" w:asciiTheme="minorHAnsi" w:hAnsiTheme="minorHAnsi"/>
+                <w:sz w:val="22"/>
+                <w:szCs w:val="22"/>
+              </w:rPr>
+            </w:pPr>
+            <w:r>
+              <w:rPr>
+                <w:rFonts w:ascii="Calibri" w:hAnsi="Calibri" w:asciiTheme="minorHAnsi" w:hAnsiTheme="minorHAnsi"/>
+                <w:sz w:val="22"/>
+                <w:szCs w:val="22"/>
+              </w:rPr>
+              <w:t xml:space="preserve">   </w:t>
+            </w:r>
+            <w:r>
+              <w:rPr>
+                <w:rFonts w:ascii="Calibri" w:hAnsi="Calibri" w:asciiTheme="minorHAnsi" w:hAnsiTheme="minorHAnsi"/>
+                <w:sz w:val="22"/>
+                <w:szCs w:val="22"/>
+              </w:rPr>
+              <w:t>- **Enfoque Pedagógico:** Aprendizaje basado en problemas (ABP) para fomentar la resolución de problemas y la aplicación de conocimientos en contextos reales.</w:t>
+            </w:r>
+          </w:p>
+          <w:p>
+            <w:pPr>
+              <w:pStyle w:val="Normal"/>
+              <w:widowControl/>
+              <w:suppressAutoHyphens w:val="true"/>
+              <w:spacing w:before="0" w:after="0"/>
+              <w:jc w:val="both"/>
+              <w:rPr>
+                <w:rFonts w:ascii="Calibri" w:hAnsi="Calibri" w:asciiTheme="minorHAnsi" w:hAnsiTheme="minorHAnsi"/>
+                <w:sz w:val="22"/>
+                <w:szCs w:val="22"/>
+              </w:rPr>
+            </w:pPr>
+            <w:r>
+              <w:rPr>
                 <w:rFonts w:asciiTheme="minorHAnsi" w:hAnsiTheme="minorHAnsi" w:ascii="Calibri" w:hAnsi="Calibri"/>
                 <w:sz w:val="22"/>
                 <w:szCs w:val="22"/>
               </w:rPr>
-              <w:t>- **Enfoque:** Diseñar estrategias que aborden la brecha de conocimiento en machine learning, adaptándose a diversos niveles de habilidad y experiencia previa.</w:t>
+            </w:r>
+          </w:p>
+          <w:p>
+            <w:pPr>
+              <w:pStyle w:val="Normal"/>
+              <w:widowControl/>
+              <w:suppressAutoHyphens w:val="true"/>
+              <w:spacing w:before="0" w:after="0"/>
+              <w:jc w:val="both"/>
+              <w:rPr>
+                <w:rFonts w:ascii="Calibri" w:hAnsi="Calibri" w:asciiTheme="minorHAnsi" w:hAnsiTheme="minorHAnsi"/>
+                <w:sz w:val="22"/>
+                <w:szCs w:val="22"/>
+              </w:rPr>
+            </w:pPr>
+            <w:r>
+              <w:rPr>
+                <w:rFonts w:ascii="Calibri" w:hAnsi="Calibri" w:asciiTheme="minorHAnsi" w:hAnsiTheme="minorHAnsi"/>
+                <w:sz w:val="22"/>
+                <w:szCs w:val="22"/>
+              </w:rPr>
+              <w:t>7. **Evaluación:**</w:t>
+            </w:r>
+          </w:p>
+          <w:p>
+            <w:pPr>
+              <w:pStyle w:val="Normal"/>
+              <w:widowControl/>
+              <w:suppressAutoHyphens w:val="true"/>
+              <w:spacing w:before="0" w:after="0"/>
+              <w:jc w:val="both"/>
+              <w:rPr>
+                <w:rFonts w:ascii="Calibri" w:hAnsi="Calibri" w:asciiTheme="minorHAnsi" w:hAnsiTheme="minorHAnsi"/>
+                <w:sz w:val="22"/>
+                <w:szCs w:val="22"/>
+              </w:rPr>
+            </w:pPr>
+            <w:r>
+              <w:rPr>
+                <w:rFonts w:ascii="Calibri" w:hAnsi="Calibri" w:asciiTheme="minorHAnsi" w:hAnsiTheme="minorHAnsi"/>
+                <w:sz w:val="22"/>
+                <w:szCs w:val="22"/>
+              </w:rPr>
+              <w:t xml:space="preserve">   </w:t>
+            </w:r>
+            <w:r>
+              <w:rPr>
+                <w:rFonts w:ascii="Calibri" w:hAnsi="Calibri" w:asciiTheme="minorHAnsi" w:hAnsiTheme="minorHAnsi"/>
+                <w:sz w:val="22"/>
+                <w:szCs w:val="22"/>
+              </w:rPr>
+              <w:t>- **Criterios de Evaluación:** Desempeño en proyectos prácticos, presentaciones, y evaluación continua de participación en actividades de clase.</w:t>
+            </w:r>
+          </w:p>
+          <w:p>
+            <w:pPr>
+              <w:pStyle w:val="Normal"/>
+              <w:widowControl/>
+              <w:suppressAutoHyphens w:val="true"/>
+              <w:spacing w:before="0" w:after="0"/>
+              <w:jc w:val="both"/>
+              <w:rPr>
+                <w:rFonts w:ascii="Calibri" w:hAnsi="Calibri" w:asciiTheme="minorHAnsi" w:hAnsiTheme="minorHAnsi"/>
+                <w:sz w:val="22"/>
+                <w:szCs w:val="22"/>
+              </w:rPr>
+            </w:pPr>
+            <w:r>
+              <w:rPr>
+                <w:rFonts w:ascii="Calibri" w:hAnsi="Calibri" w:asciiTheme="minorHAnsi" w:hAnsiTheme="minorHAnsi"/>
+                <w:sz w:val="22"/>
+                <w:szCs w:val="22"/>
+              </w:rPr>
+              <w:t xml:space="preserve">   </w:t>
+            </w:r>
+            <w:r>
+              <w:rPr>
+                <w:rFonts w:ascii="Calibri" w:hAnsi="Calibri" w:asciiTheme="minorHAnsi" w:hAnsiTheme="minorHAnsi"/>
+                <w:sz w:val="22"/>
+                <w:szCs w:val="22"/>
+              </w:rPr>
+              <w:t>- **Instrumentos de Evaluación:** Proyectos de implementación, informes técnicos, presentaciones orales, y exámenes prácticos.</w:t>
             </w:r>
           </w:p>
           <w:p>
@@ -3634,818 +4279,110 @@
             </w:pPr>
             <w:r>
               <w:rPr>
+                <w:rFonts w:ascii="Calibri" w:hAnsi="Calibri" w:asciiTheme="minorHAnsi" w:hAnsiTheme="minorHAnsi"/>
+                <w:sz w:val="22"/>
+                <w:szCs w:val="22"/>
+              </w:rPr>
+              <w:t>8. **Relación con Políticas de Ciencia Libre:**</w:t>
+            </w:r>
+          </w:p>
+          <w:p>
+            <w:pPr>
+              <w:pStyle w:val="Normal"/>
+              <w:widowControl/>
+              <w:suppressAutoHyphens w:val="true"/>
+              <w:spacing w:before="0" w:after="0"/>
+              <w:jc w:val="both"/>
+              <w:rPr>
+                <w:rFonts w:ascii="Calibri" w:hAnsi="Calibri" w:asciiTheme="minorHAnsi" w:hAnsiTheme="minorHAnsi"/>
+                <w:sz w:val="22"/>
+                <w:szCs w:val="22"/>
+              </w:rPr>
+            </w:pPr>
+            <w:r>
+              <w:rPr>
+                <w:rFonts w:ascii="Calibri" w:hAnsi="Calibri" w:asciiTheme="minorHAnsi" w:hAnsiTheme="minorHAnsi"/>
+                <w:sz w:val="22"/>
+                <w:szCs w:val="22"/>
+              </w:rPr>
+              <w:t xml:space="preserve">   </w:t>
+            </w:r>
+            <w:r>
+              <w:rPr>
+                <w:rFonts w:ascii="Calibri" w:hAnsi="Calibri" w:asciiTheme="minorHAnsi" w:hAnsiTheme="minorHAnsi"/>
+                <w:sz w:val="22"/>
+                <w:szCs w:val="22"/>
+              </w:rPr>
+              <w:t>- **Enfoque:** Promover el uso de bibliotecas y recursos de código abierto en proyectos de machine learning.</w:t>
+            </w:r>
+          </w:p>
+          <w:p>
+            <w:pPr>
+              <w:pStyle w:val="Normal"/>
+              <w:widowControl/>
+              <w:suppressAutoHyphens w:val="true"/>
+              <w:spacing w:before="0" w:after="0"/>
+              <w:jc w:val="both"/>
+              <w:rPr>
+                <w:rFonts w:ascii="Calibri" w:hAnsi="Calibri" w:asciiTheme="minorHAnsi" w:hAnsiTheme="minorHAnsi"/>
+                <w:sz w:val="22"/>
+                <w:szCs w:val="22"/>
+              </w:rPr>
+            </w:pPr>
+            <w:r>
+              <w:rPr>
+                <w:rFonts w:ascii="Calibri" w:hAnsi="Calibri" w:asciiTheme="minorHAnsi" w:hAnsiTheme="minorHAnsi"/>
+                <w:sz w:val="22"/>
+                <w:szCs w:val="22"/>
+              </w:rPr>
+              <w:t xml:space="preserve">   </w:t>
+            </w:r>
+            <w:r>
+              <w:rPr>
+                <w:rFonts w:ascii="Calibri" w:hAnsi="Calibri" w:asciiTheme="minorHAnsi" w:hAnsiTheme="minorHAnsi"/>
+                <w:sz w:val="22"/>
+                <w:szCs w:val="22"/>
+              </w:rPr>
+              <w:t>- **Objetivo:** Incentivar la colaboración abierta, la transparencia y el acceso libre al conocimiento científico.</w:t>
+            </w:r>
+          </w:p>
+          <w:p>
+            <w:pPr>
+              <w:pStyle w:val="Normal"/>
+              <w:widowControl/>
+              <w:suppressAutoHyphens w:val="true"/>
+              <w:spacing w:before="0" w:after="0"/>
+              <w:jc w:val="both"/>
+              <w:rPr>
+                <w:rFonts w:ascii="Calibri" w:hAnsi="Calibri" w:asciiTheme="minorHAnsi" w:hAnsiTheme="minorHAnsi"/>
+                <w:sz w:val="22"/>
+                <w:szCs w:val="22"/>
+              </w:rPr>
+            </w:pPr>
+            <w:r>
+              <w:rPr>
                 <w:rFonts w:asciiTheme="minorHAnsi" w:hAnsiTheme="minorHAnsi" w:ascii="Calibri" w:hAnsi="Calibri"/>
                 <w:sz w:val="22"/>
                 <w:szCs w:val="22"/>
               </w:rPr>
-              <w:t>2. **Propósitos de Formación:**</w:t>
-            </w:r>
-          </w:p>
-          <w:p>
-            <w:pPr>
-              <w:pStyle w:val="Normal"/>
-              <w:widowControl/>
-              <w:suppressAutoHyphens w:val="true"/>
-              <w:spacing w:before="0" w:after="0"/>
-              <w:jc w:val="both"/>
-              <w:rPr>
-                <w:rFonts w:ascii="Calibri" w:hAnsi="Calibri" w:asciiTheme="minorHAnsi" w:hAnsiTheme="minorHAnsi"/>
-                <w:sz w:val="22"/>
-                <w:szCs w:val="22"/>
-              </w:rPr>
-            </w:pPr>
-            <w:r>
-              <w:rPr>
-                <w:rFonts w:asciiTheme="minorHAnsi" w:hAnsiTheme="minorHAnsi" w:ascii="Calibri" w:hAnsi="Calibri"/>
-                <w:sz w:val="22"/>
-                <w:szCs w:val="22"/>
-              </w:rPr>
-              <w:t xml:space="preserve">   </w:t>
-            </w:r>
-            <w:r>
-              <w:rPr>
-                <w:rFonts w:asciiTheme="minorHAnsi" w:hAnsiTheme="minorHAnsi" w:ascii="Calibri" w:hAnsi="Calibri"/>
-                <w:sz w:val="22"/>
-                <w:szCs w:val="22"/>
-              </w:rPr>
-              <w:t>- **Propósito Principal:** Capacitar a los estudiantes para comprender, aplicar y desarrollar soluciones de machine learning utilizando Python.</w:t>
-            </w:r>
-          </w:p>
-          <w:p>
-            <w:pPr>
-              <w:pStyle w:val="Normal"/>
-              <w:widowControl/>
-              <w:suppressAutoHyphens w:val="true"/>
-              <w:spacing w:before="0" w:after="0"/>
-              <w:jc w:val="both"/>
-              <w:rPr>
-                <w:rFonts w:ascii="Calibri" w:hAnsi="Calibri" w:asciiTheme="minorHAnsi" w:hAnsiTheme="minorHAnsi"/>
-                <w:sz w:val="22"/>
-                <w:szCs w:val="22"/>
-              </w:rPr>
-            </w:pPr>
-            <w:r>
-              <w:rPr>
-                <w:rFonts w:asciiTheme="minorHAnsi" w:hAnsiTheme="minorHAnsi" w:ascii="Calibri" w:hAnsi="Calibri"/>
-                <w:sz w:val="22"/>
-                <w:szCs w:val="22"/>
-              </w:rPr>
-              <w:t xml:space="preserve">   </w:t>
-            </w:r>
-            <w:r>
-              <w:rPr>
-                <w:rFonts w:asciiTheme="minorHAnsi" w:hAnsiTheme="minorHAnsi" w:ascii="Calibri" w:hAnsi="Calibri"/>
-                <w:sz w:val="22"/>
-                <w:szCs w:val="22"/>
-              </w:rPr>
-              <w:t>- **Enfoque:** Integrar los principios teóricos con la práctica, promoviendo la resolución de problemas y la aplicación de técnicas de machine learning en contextos del mundo real.</w:t>
-            </w:r>
-          </w:p>
-          <w:p>
-            <w:pPr>
-              <w:pStyle w:val="Normal"/>
-              <w:widowControl/>
-              <w:suppressAutoHyphens w:val="true"/>
-              <w:spacing w:before="0" w:after="0"/>
-              <w:jc w:val="both"/>
-              <w:rPr>
-                <w:rFonts w:ascii="Calibri" w:hAnsi="Calibri" w:asciiTheme="minorHAnsi" w:hAnsiTheme="minorHAnsi"/>
-                <w:sz w:val="22"/>
-                <w:szCs w:val="22"/>
-              </w:rPr>
-            </w:pPr>
-            <w:r>
-              <w:rPr>
-                <w:rFonts w:asciiTheme="minorHAnsi" w:hAnsiTheme="minorHAnsi" w:ascii="Calibri" w:hAnsi="Calibri"/>
-                <w:sz w:val="22"/>
-                <w:szCs w:val="22"/>
-              </w:rPr>
-            </w:r>
-          </w:p>
-          <w:p>
-            <w:pPr>
-              <w:pStyle w:val="Normal"/>
-              <w:widowControl/>
-              <w:suppressAutoHyphens w:val="true"/>
-              <w:spacing w:before="0" w:after="0"/>
-              <w:jc w:val="both"/>
-              <w:rPr>
-                <w:rFonts w:ascii="Calibri" w:hAnsi="Calibri" w:asciiTheme="minorHAnsi" w:hAnsiTheme="minorHAnsi"/>
-                <w:sz w:val="22"/>
-                <w:szCs w:val="22"/>
-              </w:rPr>
-            </w:pPr>
-            <w:r>
-              <w:rPr>
-                <w:rFonts w:asciiTheme="minorHAnsi" w:hAnsiTheme="minorHAnsi" w:ascii="Calibri" w:hAnsi="Calibri"/>
-                <w:sz w:val="22"/>
-                <w:szCs w:val="22"/>
-              </w:rPr>
-              <w:t>3. **Objetivos:**</w:t>
-            </w:r>
-          </w:p>
-          <w:p>
-            <w:pPr>
-              <w:pStyle w:val="Normal"/>
-              <w:widowControl/>
-              <w:suppressAutoHyphens w:val="true"/>
-              <w:spacing w:before="0" w:after="0"/>
-              <w:jc w:val="both"/>
-              <w:rPr>
-                <w:rFonts w:ascii="Calibri" w:hAnsi="Calibri" w:asciiTheme="minorHAnsi" w:hAnsiTheme="minorHAnsi"/>
-                <w:sz w:val="22"/>
-                <w:szCs w:val="22"/>
-              </w:rPr>
-            </w:pPr>
-            <w:r>
-              <w:rPr>
-                <w:rFonts w:asciiTheme="minorHAnsi" w:hAnsiTheme="minorHAnsi" w:ascii="Calibri" w:hAnsi="Calibri"/>
-                <w:sz w:val="22"/>
-                <w:szCs w:val="22"/>
-              </w:rPr>
-              <w:t xml:space="preserve">   </w:t>
-            </w:r>
-            <w:r>
-              <w:rPr>
-                <w:rFonts w:asciiTheme="minorHAnsi" w:hAnsiTheme="minorHAnsi" w:ascii="Calibri" w:hAnsi="Calibri"/>
-                <w:sz w:val="22"/>
-                <w:szCs w:val="22"/>
-              </w:rPr>
-              <w:t>- **Objetivo Específico 1:** Comprender los fundamentos teóricos del machine learning.</w:t>
-            </w:r>
-          </w:p>
-          <w:p>
-            <w:pPr>
-              <w:pStyle w:val="Normal"/>
-              <w:widowControl/>
-              <w:suppressAutoHyphens w:val="true"/>
-              <w:spacing w:before="0" w:after="0"/>
-              <w:jc w:val="both"/>
-              <w:rPr>
-                <w:rFonts w:ascii="Calibri" w:hAnsi="Calibri" w:asciiTheme="minorHAnsi" w:hAnsiTheme="minorHAnsi"/>
-                <w:sz w:val="22"/>
-                <w:szCs w:val="22"/>
-              </w:rPr>
-            </w:pPr>
-            <w:r>
-              <w:rPr>
-                <w:rFonts w:asciiTheme="minorHAnsi" w:hAnsiTheme="minorHAnsi" w:ascii="Calibri" w:hAnsi="Calibri"/>
-                <w:sz w:val="22"/>
-                <w:szCs w:val="22"/>
-              </w:rPr>
-              <w:t xml:space="preserve">   </w:t>
-            </w:r>
-            <w:r>
-              <w:rPr>
-                <w:rFonts w:asciiTheme="minorHAnsi" w:hAnsiTheme="minorHAnsi" w:ascii="Calibri" w:hAnsi="Calibri"/>
-                <w:sz w:val="22"/>
-                <w:szCs w:val="22"/>
-              </w:rPr>
-              <w:t>- **Objetivo Específico 2:** Desarrollar habilidades prácticas en la implementación de algoritmos de machine learning con Python.</w:t>
-            </w:r>
-          </w:p>
-          <w:p>
-            <w:pPr>
-              <w:pStyle w:val="Normal"/>
-              <w:widowControl/>
-              <w:suppressAutoHyphens w:val="true"/>
-              <w:spacing w:before="0" w:after="0"/>
-              <w:jc w:val="both"/>
-              <w:rPr>
-                <w:rFonts w:ascii="Calibri" w:hAnsi="Calibri" w:asciiTheme="minorHAnsi" w:hAnsiTheme="minorHAnsi"/>
-                <w:sz w:val="22"/>
-                <w:szCs w:val="22"/>
-              </w:rPr>
-            </w:pPr>
-            <w:r>
-              <w:rPr>
-                <w:rFonts w:asciiTheme="minorHAnsi" w:hAnsiTheme="minorHAnsi" w:ascii="Calibri" w:hAnsi="Calibri"/>
-                <w:sz w:val="22"/>
-                <w:szCs w:val="22"/>
-              </w:rPr>
-              <w:t xml:space="preserve">   </w:t>
-            </w:r>
-            <w:r>
-              <w:rPr>
-                <w:rFonts w:asciiTheme="minorHAnsi" w:hAnsiTheme="minorHAnsi" w:ascii="Calibri" w:hAnsi="Calibri"/>
-                <w:sz w:val="22"/>
-                <w:szCs w:val="22"/>
-              </w:rPr>
-              <w:t>- **Objetivo Específico 3:** Aplicar el machine learning a problemas específicos en diversos campos.</w:t>
-            </w:r>
-          </w:p>
-          <w:p>
-            <w:pPr>
-              <w:pStyle w:val="Normal"/>
-              <w:widowControl/>
-              <w:suppressAutoHyphens w:val="true"/>
-              <w:spacing w:before="0" w:after="0"/>
-              <w:jc w:val="both"/>
-              <w:rPr>
-                <w:rFonts w:ascii="Calibri" w:hAnsi="Calibri" w:asciiTheme="minorHAnsi" w:hAnsiTheme="minorHAnsi"/>
-                <w:sz w:val="22"/>
-                <w:szCs w:val="22"/>
-              </w:rPr>
-            </w:pPr>
-            <w:r>
-              <w:rPr>
-                <w:rFonts w:asciiTheme="minorHAnsi" w:hAnsiTheme="minorHAnsi" w:ascii="Calibri" w:hAnsi="Calibri"/>
-                <w:sz w:val="22"/>
-                <w:szCs w:val="22"/>
-              </w:rPr>
-            </w:r>
-          </w:p>
-          <w:p>
-            <w:pPr>
-              <w:pStyle w:val="Normal"/>
-              <w:widowControl/>
-              <w:suppressAutoHyphens w:val="true"/>
-              <w:spacing w:before="0" w:after="0"/>
-              <w:jc w:val="both"/>
-              <w:rPr>
-                <w:rFonts w:ascii="Calibri" w:hAnsi="Calibri" w:asciiTheme="minorHAnsi" w:hAnsiTheme="minorHAnsi"/>
-                <w:sz w:val="22"/>
-                <w:szCs w:val="22"/>
-              </w:rPr>
-            </w:pPr>
-            <w:r>
-              <w:rPr>
-                <w:rFonts w:asciiTheme="minorHAnsi" w:hAnsiTheme="minorHAnsi" w:ascii="Calibri" w:hAnsi="Calibri"/>
-                <w:sz w:val="22"/>
-                <w:szCs w:val="22"/>
-              </w:rPr>
-              <w:t>4. **Capacidades y Competencias:**</w:t>
-            </w:r>
-          </w:p>
-          <w:p>
-            <w:pPr>
-              <w:pStyle w:val="Normal"/>
-              <w:widowControl/>
-              <w:suppressAutoHyphens w:val="true"/>
-              <w:spacing w:before="0" w:after="0"/>
-              <w:jc w:val="both"/>
-              <w:rPr>
-                <w:rFonts w:ascii="Calibri" w:hAnsi="Calibri" w:asciiTheme="minorHAnsi" w:hAnsiTheme="minorHAnsi"/>
-                <w:sz w:val="22"/>
-                <w:szCs w:val="22"/>
-              </w:rPr>
-            </w:pPr>
-            <w:r>
-              <w:rPr>
-                <w:rFonts w:asciiTheme="minorHAnsi" w:hAnsiTheme="minorHAnsi" w:ascii="Calibri" w:hAnsi="Calibri"/>
-                <w:sz w:val="22"/>
-                <w:szCs w:val="22"/>
-              </w:rPr>
-              <w:t xml:space="preserve">   </w:t>
-            </w:r>
-            <w:r>
-              <w:rPr>
-                <w:rFonts w:asciiTheme="minorHAnsi" w:hAnsiTheme="minorHAnsi" w:ascii="Calibri" w:hAnsi="Calibri"/>
-                <w:sz w:val="22"/>
-                <w:szCs w:val="22"/>
-              </w:rPr>
-              <w:t>- **Capacidad 1:** Programar y aplicar algoritmos de machine learning utilizando Python.</w:t>
-            </w:r>
-          </w:p>
-          <w:p>
-            <w:pPr>
-              <w:pStyle w:val="Normal"/>
-              <w:widowControl/>
-              <w:suppressAutoHyphens w:val="true"/>
-              <w:spacing w:before="0" w:after="0"/>
-              <w:jc w:val="both"/>
-              <w:rPr>
-                <w:rFonts w:ascii="Calibri" w:hAnsi="Calibri" w:asciiTheme="minorHAnsi" w:hAnsiTheme="minorHAnsi"/>
-                <w:sz w:val="22"/>
-                <w:szCs w:val="22"/>
-              </w:rPr>
-            </w:pPr>
-            <w:r>
-              <w:rPr>
-                <w:rFonts w:asciiTheme="minorHAnsi" w:hAnsiTheme="minorHAnsi" w:ascii="Calibri" w:hAnsi="Calibri"/>
-                <w:sz w:val="22"/>
-                <w:szCs w:val="22"/>
-              </w:rPr>
-              <w:t xml:space="preserve">   </w:t>
-            </w:r>
-            <w:r>
-              <w:rPr>
-                <w:rFonts w:asciiTheme="minorHAnsi" w:hAnsiTheme="minorHAnsi" w:ascii="Calibri" w:hAnsi="Calibri"/>
-                <w:sz w:val="22"/>
-                <w:szCs w:val="22"/>
-              </w:rPr>
-              <w:t>- **Capacidad 2:** Evaluar críticamente la selección y rendimiento de modelos de machine learning.</w:t>
-            </w:r>
-          </w:p>
-          <w:p>
-            <w:pPr>
-              <w:pStyle w:val="Normal"/>
-              <w:widowControl/>
-              <w:suppressAutoHyphens w:val="true"/>
-              <w:spacing w:before="0" w:after="0"/>
-              <w:jc w:val="both"/>
-              <w:rPr>
-                <w:rFonts w:ascii="Calibri" w:hAnsi="Calibri" w:asciiTheme="minorHAnsi" w:hAnsiTheme="minorHAnsi"/>
-                <w:sz w:val="22"/>
-                <w:szCs w:val="22"/>
-              </w:rPr>
-            </w:pPr>
-            <w:r>
-              <w:rPr>
-                <w:rFonts w:asciiTheme="minorHAnsi" w:hAnsiTheme="minorHAnsi" w:ascii="Calibri" w:hAnsi="Calibri"/>
-                <w:sz w:val="22"/>
-                <w:szCs w:val="22"/>
-              </w:rPr>
-              <w:t xml:space="preserve">   </w:t>
-            </w:r>
-            <w:r>
-              <w:rPr>
-                <w:rFonts w:asciiTheme="minorHAnsi" w:hAnsiTheme="minorHAnsi" w:ascii="Calibri" w:hAnsi="Calibri"/>
-                <w:sz w:val="22"/>
-                <w:szCs w:val="22"/>
-              </w:rPr>
-              <w:t>- **Competencia 1:** Aplicar soluciones de machine learning a problemas del mundo real.</w:t>
-            </w:r>
-          </w:p>
-          <w:p>
-            <w:pPr>
-              <w:pStyle w:val="Normal"/>
-              <w:widowControl/>
-              <w:suppressAutoHyphens w:val="true"/>
-              <w:spacing w:before="0" w:after="0"/>
-              <w:jc w:val="both"/>
-              <w:rPr>
-                <w:rFonts w:ascii="Calibri" w:hAnsi="Calibri" w:asciiTheme="minorHAnsi" w:hAnsiTheme="minorHAnsi"/>
-                <w:sz w:val="22"/>
-                <w:szCs w:val="22"/>
-              </w:rPr>
-            </w:pPr>
-            <w:r>
-              <w:rPr>
-                <w:rFonts w:asciiTheme="minorHAnsi" w:hAnsiTheme="minorHAnsi" w:ascii="Calibri" w:hAnsi="Calibri"/>
-                <w:sz w:val="22"/>
-                <w:szCs w:val="22"/>
-              </w:rPr>
-            </w:r>
-          </w:p>
-          <w:p>
-            <w:pPr>
-              <w:pStyle w:val="Normal"/>
-              <w:widowControl/>
-              <w:suppressAutoHyphens w:val="true"/>
-              <w:spacing w:before="0" w:after="0"/>
-              <w:jc w:val="both"/>
-              <w:rPr>
-                <w:rFonts w:ascii="Calibri" w:hAnsi="Calibri" w:asciiTheme="minorHAnsi" w:hAnsiTheme="minorHAnsi"/>
-                <w:sz w:val="22"/>
-                <w:szCs w:val="22"/>
-              </w:rPr>
-            </w:pPr>
-            <w:r>
-              <w:rPr>
-                <w:rFonts w:asciiTheme="minorHAnsi" w:hAnsiTheme="minorHAnsi" w:ascii="Calibri" w:hAnsi="Calibri"/>
-                <w:sz w:val="22"/>
-                <w:szCs w:val="22"/>
-              </w:rPr>
-              <w:t>5. **Contenidos o Temas:**</w:t>
-            </w:r>
-          </w:p>
-          <w:p>
-            <w:pPr>
-              <w:pStyle w:val="Normal"/>
-              <w:widowControl/>
-              <w:suppressAutoHyphens w:val="true"/>
-              <w:spacing w:before="0" w:after="0"/>
-              <w:jc w:val="both"/>
-              <w:rPr>
-                <w:rFonts w:ascii="Calibri" w:hAnsi="Calibri" w:asciiTheme="minorHAnsi" w:hAnsiTheme="minorHAnsi"/>
-                <w:sz w:val="22"/>
-                <w:szCs w:val="22"/>
-              </w:rPr>
-            </w:pPr>
-            <w:r>
-              <w:rPr>
-                <w:rFonts w:asciiTheme="minorHAnsi" w:hAnsiTheme="minorHAnsi" w:ascii="Calibri" w:hAnsi="Calibri"/>
-                <w:sz w:val="22"/>
-                <w:szCs w:val="22"/>
-              </w:rPr>
-              <w:t xml:space="preserve">   </w:t>
-            </w:r>
-            <w:r>
-              <w:rPr>
-                <w:rFonts w:asciiTheme="minorHAnsi" w:hAnsiTheme="minorHAnsi" w:ascii="Calibri" w:hAnsi="Calibri"/>
-                <w:sz w:val="22"/>
-                <w:szCs w:val="22"/>
-              </w:rPr>
-              <w:t>- **Tema 1:** Introducción a Python y bibliotecas de machine learning (e.g., NumPy, pandas, scikit-learn).</w:t>
-            </w:r>
-          </w:p>
-          <w:p>
-            <w:pPr>
-              <w:pStyle w:val="Normal"/>
-              <w:widowControl/>
-              <w:suppressAutoHyphens w:val="true"/>
-              <w:spacing w:before="0" w:after="0"/>
-              <w:jc w:val="both"/>
-              <w:rPr>
-                <w:rFonts w:ascii="Calibri" w:hAnsi="Calibri" w:asciiTheme="minorHAnsi" w:hAnsiTheme="minorHAnsi"/>
-                <w:sz w:val="22"/>
-                <w:szCs w:val="22"/>
-              </w:rPr>
-            </w:pPr>
-            <w:r>
-              <w:rPr>
-                <w:rFonts w:asciiTheme="minorHAnsi" w:hAnsiTheme="minorHAnsi" w:ascii="Calibri" w:hAnsi="Calibri"/>
-                <w:sz w:val="22"/>
-                <w:szCs w:val="22"/>
-              </w:rPr>
-              <w:t xml:space="preserve">   </w:t>
-            </w:r>
-            <w:r>
-              <w:rPr>
-                <w:rFonts w:asciiTheme="minorHAnsi" w:hAnsiTheme="minorHAnsi" w:ascii="Calibri" w:hAnsi="Calibri"/>
-                <w:sz w:val="22"/>
-                <w:szCs w:val="22"/>
-              </w:rPr>
-              <w:t>- **Tema 2:** Fundamentos teóricos de machine learning (e.g., tipos de algoritmos, evaluación de modelos).</w:t>
-            </w:r>
-          </w:p>
-          <w:p>
-            <w:pPr>
-              <w:pStyle w:val="Normal"/>
-              <w:widowControl/>
-              <w:suppressAutoHyphens w:val="true"/>
-              <w:spacing w:before="0" w:after="0"/>
-              <w:jc w:val="both"/>
-              <w:rPr>
-                <w:rFonts w:ascii="Calibri" w:hAnsi="Calibri" w:asciiTheme="minorHAnsi" w:hAnsiTheme="minorHAnsi"/>
-                <w:sz w:val="22"/>
-                <w:szCs w:val="22"/>
-              </w:rPr>
-            </w:pPr>
-            <w:r>
-              <w:rPr>
-                <w:rFonts w:asciiTheme="minorHAnsi" w:hAnsiTheme="minorHAnsi" w:ascii="Calibri" w:hAnsi="Calibri"/>
-                <w:sz w:val="22"/>
-                <w:szCs w:val="22"/>
-              </w:rPr>
-              <w:t xml:space="preserve">   </w:t>
-            </w:r>
-            <w:r>
-              <w:rPr>
-                <w:rFonts w:asciiTheme="minorHAnsi" w:hAnsiTheme="minorHAnsi" w:ascii="Calibri" w:hAnsi="Calibri"/>
-                <w:sz w:val="22"/>
-                <w:szCs w:val="22"/>
-              </w:rPr>
-              <w:t>- **Tema 3:** Aplicación práctica de machine learning en casos de estudio específicos.</w:t>
-            </w:r>
-          </w:p>
-          <w:p>
-            <w:pPr>
-              <w:pStyle w:val="Normal"/>
-              <w:widowControl/>
-              <w:suppressAutoHyphens w:val="true"/>
-              <w:spacing w:before="0" w:after="0"/>
-              <w:jc w:val="both"/>
-              <w:rPr>
-                <w:rFonts w:ascii="Calibri" w:hAnsi="Calibri" w:asciiTheme="minorHAnsi" w:hAnsiTheme="minorHAnsi"/>
-                <w:sz w:val="22"/>
-                <w:szCs w:val="22"/>
-              </w:rPr>
-            </w:pPr>
-            <w:r>
-              <w:rPr>
-                <w:rFonts w:asciiTheme="minorHAnsi" w:hAnsiTheme="minorHAnsi" w:ascii="Calibri" w:hAnsi="Calibri"/>
-                <w:sz w:val="22"/>
-                <w:szCs w:val="22"/>
-              </w:rPr>
-            </w:r>
-          </w:p>
-          <w:p>
-            <w:pPr>
-              <w:pStyle w:val="Normal"/>
-              <w:widowControl/>
-              <w:suppressAutoHyphens w:val="true"/>
-              <w:spacing w:before="0" w:after="0"/>
-              <w:jc w:val="both"/>
-              <w:rPr>
-                <w:rFonts w:ascii="Calibri" w:hAnsi="Calibri" w:asciiTheme="minorHAnsi" w:hAnsiTheme="minorHAnsi"/>
-                <w:sz w:val="22"/>
-                <w:szCs w:val="22"/>
-              </w:rPr>
-            </w:pPr>
-            <w:r>
-              <w:rPr>
-                <w:rFonts w:asciiTheme="minorHAnsi" w:hAnsiTheme="minorHAnsi" w:ascii="Calibri" w:hAnsi="Calibri"/>
-                <w:sz w:val="22"/>
-                <w:szCs w:val="22"/>
-              </w:rPr>
-              <w:t>6. **Metodologías de Enseñanza:**</w:t>
-            </w:r>
-          </w:p>
-          <w:p>
-            <w:pPr>
-              <w:pStyle w:val="Normal"/>
-              <w:widowControl/>
-              <w:suppressAutoHyphens w:val="true"/>
-              <w:spacing w:before="0" w:after="0"/>
-              <w:jc w:val="both"/>
-              <w:rPr>
-                <w:rFonts w:ascii="Calibri" w:hAnsi="Calibri" w:asciiTheme="minorHAnsi" w:hAnsiTheme="minorHAnsi"/>
-                <w:sz w:val="22"/>
-                <w:szCs w:val="22"/>
-              </w:rPr>
-            </w:pPr>
-            <w:r>
-              <w:rPr>
-                <w:rFonts w:asciiTheme="minorHAnsi" w:hAnsiTheme="minorHAnsi" w:ascii="Calibri" w:hAnsi="Calibri"/>
-                <w:sz w:val="22"/>
-                <w:szCs w:val="22"/>
-              </w:rPr>
-              <w:t xml:space="preserve">   </w:t>
-            </w:r>
-            <w:r>
-              <w:rPr>
-                <w:rFonts w:asciiTheme="minorHAnsi" w:hAnsiTheme="minorHAnsi" w:ascii="Calibri" w:hAnsi="Calibri"/>
-                <w:sz w:val="22"/>
-                <w:szCs w:val="22"/>
-              </w:rPr>
-              <w:t>- **Metodología Principal:** Flipped learning, donde los estudiantes adquieren conocimientos teóricos de forma autónoma antes de las clases presenciales y se enfocan en la aplicación práctica en el aula.</w:t>
-            </w:r>
-          </w:p>
-          <w:p>
-            <w:pPr>
-              <w:pStyle w:val="Normal"/>
-              <w:widowControl/>
-              <w:suppressAutoHyphens w:val="true"/>
-              <w:spacing w:before="0" w:after="0"/>
-              <w:jc w:val="both"/>
-              <w:rPr>
-                <w:rFonts w:ascii="Calibri" w:hAnsi="Calibri" w:asciiTheme="minorHAnsi" w:hAnsiTheme="minorHAnsi"/>
-                <w:sz w:val="22"/>
-                <w:szCs w:val="22"/>
-              </w:rPr>
-            </w:pPr>
-            <w:r>
-              <w:rPr>
-                <w:rFonts w:asciiTheme="minorHAnsi" w:hAnsiTheme="minorHAnsi" w:ascii="Calibri" w:hAnsi="Calibri"/>
-                <w:sz w:val="22"/>
-                <w:szCs w:val="22"/>
-              </w:rPr>
-              <w:t xml:space="preserve">   </w:t>
-            </w:r>
-            <w:r>
-              <w:rPr>
-                <w:rFonts w:asciiTheme="minorHAnsi" w:hAnsiTheme="minorHAnsi" w:ascii="Calibri" w:hAnsi="Calibri"/>
-                <w:sz w:val="22"/>
-                <w:szCs w:val="22"/>
-              </w:rPr>
-              <w:t>- **Enfoque Pedagógico:** Aprendizaje basado en problemas (ABP) para fomentar la resolución de problemas y la aplicación de conocimientos en contextos reales.</w:t>
-            </w:r>
-          </w:p>
-          <w:p>
-            <w:pPr>
-              <w:pStyle w:val="Normal"/>
-              <w:widowControl/>
-              <w:suppressAutoHyphens w:val="true"/>
-              <w:spacing w:before="0" w:after="0"/>
-              <w:jc w:val="both"/>
-              <w:rPr>
-                <w:rFonts w:ascii="Calibri" w:hAnsi="Calibri" w:asciiTheme="minorHAnsi" w:hAnsiTheme="minorHAnsi"/>
-                <w:sz w:val="22"/>
-                <w:szCs w:val="22"/>
-              </w:rPr>
-            </w:pPr>
-            <w:r>
-              <w:rPr>
-                <w:rFonts w:asciiTheme="minorHAnsi" w:hAnsiTheme="minorHAnsi" w:ascii="Calibri" w:hAnsi="Calibri"/>
-                <w:sz w:val="22"/>
-                <w:szCs w:val="22"/>
-              </w:rPr>
-            </w:r>
-          </w:p>
-          <w:p>
-            <w:pPr>
-              <w:pStyle w:val="Normal"/>
-              <w:widowControl/>
-              <w:suppressAutoHyphens w:val="true"/>
-              <w:spacing w:before="0" w:after="0"/>
-              <w:jc w:val="both"/>
-              <w:rPr>
-                <w:rFonts w:ascii="Calibri" w:hAnsi="Calibri" w:asciiTheme="minorHAnsi" w:hAnsiTheme="minorHAnsi"/>
-                <w:sz w:val="22"/>
-                <w:szCs w:val="22"/>
-              </w:rPr>
-            </w:pPr>
-            <w:r>
-              <w:rPr>
-                <w:rFonts w:asciiTheme="minorHAnsi" w:hAnsiTheme="minorHAnsi" w:ascii="Calibri" w:hAnsi="Calibri"/>
-                <w:sz w:val="22"/>
-                <w:szCs w:val="22"/>
-              </w:rPr>
-              <w:t>7. **Evaluación:**</w:t>
-            </w:r>
-          </w:p>
-          <w:p>
-            <w:pPr>
-              <w:pStyle w:val="Normal"/>
-              <w:widowControl/>
-              <w:suppressAutoHyphens w:val="true"/>
-              <w:spacing w:before="0" w:after="0"/>
-              <w:jc w:val="both"/>
-              <w:rPr>
-                <w:rFonts w:ascii="Calibri" w:hAnsi="Calibri" w:asciiTheme="minorHAnsi" w:hAnsiTheme="minorHAnsi"/>
-                <w:sz w:val="22"/>
-                <w:szCs w:val="22"/>
-              </w:rPr>
-            </w:pPr>
-            <w:r>
-              <w:rPr>
-                <w:rFonts w:asciiTheme="minorHAnsi" w:hAnsiTheme="minorHAnsi" w:ascii="Calibri" w:hAnsi="Calibri"/>
-                <w:sz w:val="22"/>
-                <w:szCs w:val="22"/>
-              </w:rPr>
-              <w:t xml:space="preserve">   </w:t>
-            </w:r>
-            <w:r>
-              <w:rPr>
-                <w:rFonts w:asciiTheme="minorHAnsi" w:hAnsiTheme="minorHAnsi" w:ascii="Calibri" w:hAnsi="Calibri"/>
-                <w:sz w:val="22"/>
-                <w:szCs w:val="22"/>
-              </w:rPr>
-              <w:t>- **Criterios de Evaluación:** Desempeño en proyectos prácticos, presentaciones, y evaluación continua de participación en actividades de clase.</w:t>
-            </w:r>
-          </w:p>
-          <w:p>
-            <w:pPr>
-              <w:pStyle w:val="Normal"/>
-              <w:widowControl/>
-              <w:suppressAutoHyphens w:val="true"/>
-              <w:spacing w:before="0" w:after="0"/>
-              <w:jc w:val="both"/>
-              <w:rPr>
-                <w:rFonts w:ascii="Calibri" w:hAnsi="Calibri" w:asciiTheme="minorHAnsi" w:hAnsiTheme="minorHAnsi"/>
-                <w:sz w:val="22"/>
-                <w:szCs w:val="22"/>
-              </w:rPr>
-            </w:pPr>
-            <w:r>
-              <w:rPr>
-                <w:rFonts w:asciiTheme="minorHAnsi" w:hAnsiTheme="minorHAnsi" w:ascii="Calibri" w:hAnsi="Calibri"/>
-                <w:sz w:val="22"/>
-                <w:szCs w:val="22"/>
-              </w:rPr>
-              <w:t xml:space="preserve">   </w:t>
-            </w:r>
-            <w:r>
-              <w:rPr>
-                <w:rFonts w:asciiTheme="minorHAnsi" w:hAnsiTheme="minorHAnsi" w:ascii="Calibri" w:hAnsi="Calibri"/>
-                <w:sz w:val="22"/>
-                <w:szCs w:val="22"/>
-              </w:rPr>
-              <w:t>- **Instrumentos de Evaluación:** Proyectos de implementación, informes técnicos, presentaciones orales, y exámenes prácticos.</w:t>
-            </w:r>
-          </w:p>
-          <w:p>
-            <w:pPr>
-              <w:pStyle w:val="Normal"/>
-              <w:widowControl/>
-              <w:suppressAutoHyphens w:val="true"/>
-              <w:spacing w:before="0" w:after="0"/>
-              <w:jc w:val="both"/>
-              <w:rPr>
-                <w:rFonts w:ascii="Calibri" w:hAnsi="Calibri" w:asciiTheme="minorHAnsi" w:hAnsiTheme="minorHAnsi"/>
-                <w:sz w:val="22"/>
-                <w:szCs w:val="22"/>
-              </w:rPr>
-            </w:pPr>
-            <w:r>
-              <w:rPr>
-                <w:rFonts w:asciiTheme="minorHAnsi" w:hAnsiTheme="minorHAnsi" w:ascii="Calibri" w:hAnsi="Calibri"/>
-                <w:sz w:val="22"/>
-                <w:szCs w:val="22"/>
-              </w:rPr>
-            </w:r>
-          </w:p>
-          <w:p>
-            <w:pPr>
-              <w:pStyle w:val="Normal"/>
-              <w:widowControl/>
-              <w:suppressAutoHyphens w:val="true"/>
-              <w:spacing w:before="0" w:after="0"/>
-              <w:jc w:val="both"/>
-              <w:rPr>
-                <w:rFonts w:ascii="Calibri" w:hAnsi="Calibri" w:asciiTheme="minorHAnsi" w:hAnsiTheme="minorHAnsi"/>
-                <w:sz w:val="22"/>
-                <w:szCs w:val="22"/>
-              </w:rPr>
-            </w:pPr>
-            <w:r>
-              <w:rPr>
-                <w:rFonts w:asciiTheme="minorHAnsi" w:hAnsiTheme="minorHAnsi" w:ascii="Calibri" w:hAnsi="Calibri"/>
-                <w:sz w:val="22"/>
-                <w:szCs w:val="22"/>
-              </w:rPr>
-              <w:t>8. **Relación con Políticas de Ciencia Libre:**</w:t>
-            </w:r>
-          </w:p>
-          <w:p>
-            <w:pPr>
-              <w:pStyle w:val="Normal"/>
-              <w:widowControl/>
-              <w:suppressAutoHyphens w:val="true"/>
-              <w:spacing w:before="0" w:after="0"/>
-              <w:jc w:val="both"/>
-              <w:rPr>
-                <w:rFonts w:ascii="Calibri" w:hAnsi="Calibri" w:asciiTheme="minorHAnsi" w:hAnsiTheme="minorHAnsi"/>
-                <w:sz w:val="22"/>
-                <w:szCs w:val="22"/>
-              </w:rPr>
-            </w:pPr>
-            <w:r>
-              <w:rPr>
-                <w:rFonts w:asciiTheme="minorHAnsi" w:hAnsiTheme="minorHAnsi" w:ascii="Calibri" w:hAnsi="Calibri"/>
-                <w:sz w:val="22"/>
-                <w:szCs w:val="22"/>
-              </w:rPr>
-              <w:t xml:space="preserve">   </w:t>
-            </w:r>
-            <w:r>
-              <w:rPr>
-                <w:rFonts w:asciiTheme="minorHAnsi" w:hAnsiTheme="minorHAnsi" w:ascii="Calibri" w:hAnsi="Calibri"/>
-                <w:sz w:val="22"/>
-                <w:szCs w:val="22"/>
-              </w:rPr>
-              <w:t>- **Enfoque:** Promover el uso de bibliotecas y recursos de código abierto en proyectos de machine learning.</w:t>
-            </w:r>
-          </w:p>
-          <w:p>
-            <w:pPr>
-              <w:pStyle w:val="Normal"/>
-              <w:widowControl/>
-              <w:suppressAutoHyphens w:val="true"/>
-              <w:spacing w:before="0" w:after="0"/>
-              <w:jc w:val="both"/>
-              <w:rPr>
-                <w:rFonts w:ascii="Calibri" w:hAnsi="Calibri" w:asciiTheme="minorHAnsi" w:hAnsiTheme="minorHAnsi"/>
-                <w:sz w:val="22"/>
-                <w:szCs w:val="22"/>
-              </w:rPr>
-            </w:pPr>
-            <w:r>
-              <w:rPr>
-                <w:rFonts w:asciiTheme="minorHAnsi" w:hAnsiTheme="minorHAnsi" w:ascii="Calibri" w:hAnsi="Calibri"/>
-                <w:sz w:val="22"/>
-                <w:szCs w:val="22"/>
-              </w:rPr>
-              <w:t xml:space="preserve">   </w:t>
-            </w:r>
-            <w:r>
-              <w:rPr>
-                <w:rFonts w:asciiTheme="minorHAnsi" w:hAnsiTheme="minorHAnsi" w:ascii="Calibri" w:hAnsi="Calibri"/>
-                <w:sz w:val="22"/>
-                <w:szCs w:val="22"/>
-              </w:rPr>
-              <w:t>- **Objetivo:** Incentivar la colaboración abierta, la transparencia y el acceso libre al conocimiento científico.</w:t>
-            </w:r>
-          </w:p>
-          <w:p>
-            <w:pPr>
-              <w:pStyle w:val="Normal"/>
-              <w:widowControl/>
-              <w:suppressAutoHyphens w:val="true"/>
-              <w:spacing w:before="0" w:after="0"/>
-              <w:jc w:val="both"/>
-              <w:rPr>
-                <w:rFonts w:ascii="Calibri" w:hAnsi="Calibri" w:asciiTheme="minorHAnsi" w:hAnsiTheme="minorHAnsi"/>
-                <w:sz w:val="22"/>
-                <w:szCs w:val="22"/>
-              </w:rPr>
-            </w:pPr>
-            <w:r>
-              <w:rPr>
-                <w:rFonts w:asciiTheme="minorHAnsi" w:hAnsiTheme="minorHAnsi" w:ascii="Calibri" w:hAnsi="Calibri"/>
-                <w:sz w:val="22"/>
-                <w:szCs w:val="22"/>
-              </w:rPr>
-            </w:r>
-          </w:p>
-          <w:p>
-            <w:pPr>
-              <w:pStyle w:val="Normal"/>
-              <w:widowControl/>
-              <w:suppressAutoHyphens w:val="true"/>
-              <w:spacing w:before="0" w:after="0"/>
-              <w:jc w:val="both"/>
-              <w:rPr>
-                <w:rFonts w:ascii="Calibri" w:hAnsi="Calibri" w:asciiTheme="minorHAnsi" w:hAnsiTheme="minorHAnsi"/>
-                <w:sz w:val="22"/>
-                <w:szCs w:val="22"/>
-              </w:rPr>
-            </w:pPr>
-            <w:r>
-              <w:rPr>
-                <w:rFonts w:asciiTheme="minorHAnsi" w:hAnsiTheme="minorHAnsi" w:ascii="Calibri" w:hAnsi="Calibri"/>
+            </w:r>
+          </w:p>
+          <w:p>
+            <w:pPr>
+              <w:pStyle w:val="Normal"/>
+              <w:widowControl/>
+              <w:suppressAutoHyphens w:val="true"/>
+              <w:spacing w:before="0" w:after="0"/>
+              <w:jc w:val="both"/>
+              <w:rPr>
+                <w:rFonts w:ascii="Calibri" w:hAnsi="Calibri" w:asciiTheme="minorHAnsi" w:hAnsiTheme="minorHAnsi"/>
+                <w:sz w:val="22"/>
+                <w:szCs w:val="22"/>
+              </w:rPr>
+            </w:pPr>
+            <w:r>
+              <w:rPr>
+                <w:rFonts w:ascii="Calibri" w:hAnsi="Calibri" w:asciiTheme="minorHAnsi" w:hAnsiTheme="minorHAnsi"/>
                 <w:sz w:val="22"/>
                 <w:szCs w:val="22"/>
               </w:rPr>
@@ -4622,11 +4559,114 @@
             </w:pPr>
             <w:r>
               <w:rPr>
+                <w:rFonts w:ascii="Calibri" w:hAnsi="Calibri" w:asciiTheme="minorHAnsi" w:hAnsiTheme="minorHAnsi"/>
+                <w:sz w:val="22"/>
+                <w:szCs w:val="22"/>
+              </w:rPr>
+              <w:t>**Aportes del Curso de Machine Learning con Python a la Formación Integral:**</w:t>
+            </w:r>
+          </w:p>
+          <w:p>
+            <w:pPr>
+              <w:pStyle w:val="Normal"/>
+              <w:widowControl/>
+              <w:suppressAutoHyphens w:val="true"/>
+              <w:spacing w:before="0" w:after="0"/>
+              <w:jc w:val="both"/>
+              <w:rPr>
+                <w:rFonts w:ascii="Calibri" w:hAnsi="Calibri" w:asciiTheme="minorHAnsi" w:hAnsiTheme="minorHAnsi"/>
+                <w:sz w:val="22"/>
+                <w:szCs w:val="22"/>
+              </w:rPr>
+            </w:pPr>
+            <w:r>
+              <w:rPr>
                 <w:rFonts w:asciiTheme="minorHAnsi" w:hAnsiTheme="minorHAnsi" w:ascii="Calibri" w:hAnsi="Calibri"/>
                 <w:sz w:val="22"/>
                 <w:szCs w:val="22"/>
               </w:rPr>
-              <w:t>**Aportes del Curso de Machine Learning con Python a la Formación Integral:**</w:t>
+            </w:r>
+          </w:p>
+          <w:p>
+            <w:pPr>
+              <w:pStyle w:val="Normal"/>
+              <w:widowControl/>
+              <w:suppressAutoHyphens w:val="true"/>
+              <w:spacing w:before="0" w:after="0"/>
+              <w:jc w:val="both"/>
+              <w:rPr>
+                <w:rFonts w:ascii="Calibri" w:hAnsi="Calibri" w:asciiTheme="minorHAnsi" w:hAnsiTheme="minorHAnsi"/>
+                <w:sz w:val="22"/>
+                <w:szCs w:val="22"/>
+              </w:rPr>
+            </w:pPr>
+            <w:r>
+              <w:rPr>
+                <w:rFonts w:ascii="Calibri" w:hAnsi="Calibri" w:asciiTheme="minorHAnsi" w:hAnsiTheme="minorHAnsi"/>
+                <w:sz w:val="22"/>
+                <w:szCs w:val="22"/>
+              </w:rPr>
+              <w:t>1. **Racionalidad Ética:**</w:t>
+            </w:r>
+          </w:p>
+          <w:p>
+            <w:pPr>
+              <w:pStyle w:val="Normal"/>
+              <w:widowControl/>
+              <w:suppressAutoHyphens w:val="true"/>
+              <w:spacing w:before="0" w:after="0"/>
+              <w:jc w:val="both"/>
+              <w:rPr>
+                <w:rFonts w:ascii="Calibri" w:hAnsi="Calibri" w:asciiTheme="minorHAnsi" w:hAnsiTheme="minorHAnsi"/>
+                <w:sz w:val="22"/>
+                <w:szCs w:val="22"/>
+              </w:rPr>
+            </w:pPr>
+            <w:r>
+              <w:rPr>
+                <w:rFonts w:ascii="Calibri" w:hAnsi="Calibri" w:asciiTheme="minorHAnsi" w:hAnsiTheme="minorHAnsi"/>
+                <w:sz w:val="22"/>
+                <w:szCs w:val="22"/>
+              </w:rPr>
+              <w:t xml:space="preserve">   </w:t>
+            </w:r>
+            <w:r>
+              <w:rPr>
+                <w:rFonts w:ascii="Calibri" w:hAnsi="Calibri" w:asciiTheme="minorHAnsi" w:hAnsiTheme="minorHAnsi"/>
+                <w:sz w:val="22"/>
+                <w:szCs w:val="22"/>
+              </w:rPr>
+              <w:t>- *Aportes:* El curso destaca la importancia de consideraciones éticas en el desarrollo y aplicación de algoritmos de machine learning. Se abordan cuestiones éticas relacionadas con la privacidad, la discriminación algorítmica y la toma de decisiones automatizada.</w:t>
+            </w:r>
+          </w:p>
+          <w:p>
+            <w:pPr>
+              <w:pStyle w:val="Normal"/>
+              <w:widowControl/>
+              <w:suppressAutoHyphens w:val="true"/>
+              <w:spacing w:before="0" w:after="0"/>
+              <w:jc w:val="both"/>
+              <w:rPr>
+                <w:rFonts w:ascii="Calibri" w:hAnsi="Calibri" w:asciiTheme="minorHAnsi" w:hAnsiTheme="minorHAnsi"/>
+                <w:sz w:val="22"/>
+                <w:szCs w:val="22"/>
+              </w:rPr>
+            </w:pPr>
+            <w:r>
+              <w:rPr>
+                <w:rFonts w:ascii="Calibri" w:hAnsi="Calibri" w:asciiTheme="minorHAnsi" w:hAnsiTheme="minorHAnsi"/>
+                <w:sz w:val="22"/>
+                <w:szCs w:val="22"/>
+              </w:rPr>
+              <w:t xml:space="preserve">   </w:t>
+            </w:r>
+            <w:r>
+              <w:rPr>
+                <w:rFonts w:ascii="Calibri" w:hAnsi="Calibri" w:asciiTheme="minorHAnsi" w:hAnsiTheme="minorHAnsi"/>
+                <w:sz w:val="22"/>
+                <w:szCs w:val="22"/>
+              </w:rPr>
+              <w:t>- *Intencionalidades Formativas:* Promueve la reflexión ética en el uso de tecnologías de machine learning y la responsabilidad de los profesionales en la toma de decisiones éticas en el desarrollo y aplicación de modelos.</w:t>
             </w:r>
           </w:p>
           <w:p>
@@ -4665,11 +4705,174 @@
             </w:pPr>
             <w:r>
               <w:rPr>
+                <w:rFonts w:ascii="Calibri" w:hAnsi="Calibri" w:asciiTheme="minorHAnsi" w:hAnsiTheme="minorHAnsi"/>
+                <w:sz w:val="22"/>
+                <w:szCs w:val="22"/>
+              </w:rPr>
+              <w:t>2. **Racionalidad Política:**</w:t>
+            </w:r>
+          </w:p>
+          <w:p>
+            <w:pPr>
+              <w:pStyle w:val="Normal"/>
+              <w:widowControl/>
+              <w:suppressAutoHyphens w:val="true"/>
+              <w:spacing w:before="0" w:after="0"/>
+              <w:jc w:val="both"/>
+              <w:rPr>
+                <w:rFonts w:ascii="Calibri" w:hAnsi="Calibri" w:asciiTheme="minorHAnsi" w:hAnsiTheme="minorHAnsi"/>
+                <w:sz w:val="22"/>
+                <w:szCs w:val="22"/>
+              </w:rPr>
+            </w:pPr>
+            <w:r>
+              <w:rPr>
+                <w:rFonts w:ascii="Calibri" w:hAnsi="Calibri" w:asciiTheme="minorHAnsi" w:hAnsiTheme="minorHAnsi"/>
+                <w:sz w:val="22"/>
+                <w:szCs w:val="22"/>
+              </w:rPr>
+              <w:t xml:space="preserve">   </w:t>
+            </w:r>
+            <w:r>
+              <w:rPr>
+                <w:rFonts w:ascii="Calibri" w:hAnsi="Calibri" w:asciiTheme="minorHAnsi" w:hAnsiTheme="minorHAnsi"/>
+                <w:sz w:val="22"/>
+                <w:szCs w:val="22"/>
+              </w:rPr>
+              <w:t>- *Aportes:* Se exploran aspectos políticos relacionados con el acceso equitativo a tecnologías de machine learning y la influencia de estos sistemas en la sociedad. Se fomenta la comprensión de las implicaciones políticas de la inteligencia artificial.</w:t>
+            </w:r>
+          </w:p>
+          <w:p>
+            <w:pPr>
+              <w:pStyle w:val="Normal"/>
+              <w:widowControl/>
+              <w:suppressAutoHyphens w:val="true"/>
+              <w:spacing w:before="0" w:after="0"/>
+              <w:jc w:val="both"/>
+              <w:rPr>
+                <w:rFonts w:ascii="Calibri" w:hAnsi="Calibri" w:asciiTheme="minorHAnsi" w:hAnsiTheme="minorHAnsi"/>
+                <w:sz w:val="22"/>
+                <w:szCs w:val="22"/>
+              </w:rPr>
+            </w:pPr>
+            <w:r>
+              <w:rPr>
+                <w:rFonts w:ascii="Calibri" w:hAnsi="Calibri" w:asciiTheme="minorHAnsi" w:hAnsiTheme="minorHAnsi"/>
+                <w:sz w:val="22"/>
+                <w:szCs w:val="22"/>
+              </w:rPr>
+              <w:t xml:space="preserve">   </w:t>
+            </w:r>
+            <w:r>
+              <w:rPr>
+                <w:rFonts w:ascii="Calibri" w:hAnsi="Calibri" w:asciiTheme="minorHAnsi" w:hAnsiTheme="minorHAnsi"/>
+                <w:sz w:val="22"/>
+                <w:szCs w:val="22"/>
+              </w:rPr>
+              <w:t>- *Intencionalidades Formativas:* Desarrolla una conciencia crítica sobre el impacto político y social de las tecnologías de machine learning, preparando a los estudiantes para participar en discusiones informadas y contribuir a políticas tecnológicas éticas.</w:t>
+            </w:r>
+          </w:p>
+          <w:p>
+            <w:pPr>
+              <w:pStyle w:val="Normal"/>
+              <w:widowControl/>
+              <w:suppressAutoHyphens w:val="true"/>
+              <w:spacing w:before="0" w:after="0"/>
+              <w:jc w:val="both"/>
+              <w:rPr>
+                <w:rFonts w:ascii="Calibri" w:hAnsi="Calibri" w:asciiTheme="minorHAnsi" w:hAnsiTheme="minorHAnsi"/>
+                <w:sz w:val="22"/>
+                <w:szCs w:val="22"/>
+              </w:rPr>
+            </w:pPr>
+            <w:r>
+              <w:rPr>
                 <w:rFonts w:asciiTheme="minorHAnsi" w:hAnsiTheme="minorHAnsi" w:ascii="Calibri" w:hAnsi="Calibri"/>
                 <w:sz w:val="22"/>
                 <w:szCs w:val="22"/>
               </w:rPr>
-              <w:t>1. **Racionalidad Ética:**</w:t>
+            </w:r>
+          </w:p>
+          <w:p>
+            <w:pPr>
+              <w:pStyle w:val="Normal"/>
+              <w:widowControl/>
+              <w:suppressAutoHyphens w:val="true"/>
+              <w:spacing w:before="0" w:after="0"/>
+              <w:jc w:val="both"/>
+              <w:rPr>
+                <w:rFonts w:ascii="Calibri" w:hAnsi="Calibri" w:asciiTheme="minorHAnsi" w:hAnsiTheme="minorHAnsi"/>
+                <w:sz w:val="22"/>
+                <w:szCs w:val="22"/>
+              </w:rPr>
+            </w:pPr>
+            <w:r>
+              <w:rPr>
+                <w:rFonts w:ascii="Calibri" w:hAnsi="Calibri" w:asciiTheme="minorHAnsi" w:hAnsiTheme="minorHAnsi"/>
+                <w:sz w:val="22"/>
+                <w:szCs w:val="22"/>
+              </w:rPr>
+              <w:t>3. **Racionalidad Estética:**</w:t>
+            </w:r>
+          </w:p>
+          <w:p>
+            <w:pPr>
+              <w:pStyle w:val="Normal"/>
+              <w:widowControl/>
+              <w:suppressAutoHyphens w:val="true"/>
+              <w:spacing w:before="0" w:after="0"/>
+              <w:jc w:val="both"/>
+              <w:rPr>
+                <w:rFonts w:ascii="Calibri" w:hAnsi="Calibri" w:asciiTheme="minorHAnsi" w:hAnsiTheme="minorHAnsi"/>
+                <w:sz w:val="22"/>
+                <w:szCs w:val="22"/>
+              </w:rPr>
+            </w:pPr>
+            <w:r>
+              <w:rPr>
+                <w:rFonts w:ascii="Calibri" w:hAnsi="Calibri" w:asciiTheme="minorHAnsi" w:hAnsiTheme="minorHAnsi"/>
+                <w:sz w:val="22"/>
+                <w:szCs w:val="22"/>
+              </w:rPr>
+              <w:t xml:space="preserve">   </w:t>
+            </w:r>
+            <w:r>
+              <w:rPr>
+                <w:rFonts w:ascii="Calibri" w:hAnsi="Calibri" w:asciiTheme="minorHAnsi" w:hAnsiTheme="minorHAnsi"/>
+                <w:sz w:val="22"/>
+                <w:szCs w:val="22"/>
+              </w:rPr>
+              <w:t>- *Aportes:* Aunque en menor medida, se abordan aspectos estéticos al considerar la presentación visual de datos y resultados de modelos de machine learning. Se enfatiza la importancia de representar gráficamente la información de manera clara y comprensible.</w:t>
+            </w:r>
+          </w:p>
+          <w:p>
+            <w:pPr>
+              <w:pStyle w:val="Normal"/>
+              <w:widowControl/>
+              <w:suppressAutoHyphens w:val="true"/>
+              <w:spacing w:before="0" w:after="0"/>
+              <w:jc w:val="both"/>
+              <w:rPr>
+                <w:rFonts w:ascii="Calibri" w:hAnsi="Calibri" w:asciiTheme="minorHAnsi" w:hAnsiTheme="minorHAnsi"/>
+                <w:sz w:val="22"/>
+                <w:szCs w:val="22"/>
+              </w:rPr>
+            </w:pPr>
+            <w:r>
+              <w:rPr>
+                <w:rFonts w:ascii="Calibri" w:hAnsi="Calibri" w:asciiTheme="minorHAnsi" w:hAnsiTheme="minorHAnsi"/>
+                <w:sz w:val="22"/>
+                <w:szCs w:val="22"/>
+              </w:rPr>
+              <w:t xml:space="preserve">   </w:t>
+            </w:r>
+            <w:r>
+              <w:rPr>
+                <w:rFonts w:ascii="Calibri" w:hAnsi="Calibri" w:asciiTheme="minorHAnsi" w:hAnsiTheme="minorHAnsi"/>
+                <w:sz w:val="22"/>
+                <w:szCs w:val="22"/>
+              </w:rPr>
+              <w:t>- *Intencionalidades Formativas:* Fomenta la apreciación de la estética en la presentación visual de resultados, reconociendo que la representación gráfica puede influir en la interpretación y comprensión de los datos.</w:t>
             </w:r>
           </w:p>
           <w:p>
@@ -4691,15 +4894,131 @@
                 <w:sz w:val="22"/>
                 <w:szCs w:val="22"/>
               </w:rPr>
+            </w:r>
+          </w:p>
+          <w:p>
+            <w:pPr>
+              <w:pStyle w:val="Normal"/>
+              <w:widowControl/>
+              <w:suppressAutoHyphens w:val="true"/>
+              <w:spacing w:before="0" w:after="0"/>
+              <w:jc w:val="both"/>
+              <w:rPr>
+                <w:rFonts w:ascii="Calibri" w:hAnsi="Calibri" w:asciiTheme="minorHAnsi" w:hAnsiTheme="minorHAnsi"/>
+                <w:sz w:val="22"/>
+                <w:szCs w:val="22"/>
+              </w:rPr>
+            </w:pPr>
+            <w:r>
+              <w:rPr>
+                <w:rFonts w:ascii="Calibri" w:hAnsi="Calibri" w:asciiTheme="minorHAnsi" w:hAnsiTheme="minorHAnsi"/>
+                <w:sz w:val="22"/>
+                <w:szCs w:val="22"/>
+              </w:rPr>
+              <w:t>4. **Racionalidad Lógica:**</w:t>
+            </w:r>
+          </w:p>
+          <w:p>
+            <w:pPr>
+              <w:pStyle w:val="Normal"/>
+              <w:widowControl/>
+              <w:suppressAutoHyphens w:val="true"/>
+              <w:spacing w:before="0" w:after="0"/>
+              <w:jc w:val="both"/>
+              <w:rPr>
+                <w:rFonts w:ascii="Calibri" w:hAnsi="Calibri" w:asciiTheme="minorHAnsi" w:hAnsiTheme="minorHAnsi"/>
+                <w:sz w:val="22"/>
+                <w:szCs w:val="22"/>
+              </w:rPr>
+            </w:pPr>
+            <w:r>
+              <w:rPr>
+                <w:rFonts w:ascii="Calibri" w:hAnsi="Calibri" w:asciiTheme="minorHAnsi" w:hAnsiTheme="minorHAnsi"/>
+                <w:sz w:val="22"/>
+                <w:szCs w:val="22"/>
+              </w:rPr>
               <w:t xml:space="preserve">   </w:t>
             </w:r>
             <w:r>
               <w:rPr>
+                <w:rFonts w:ascii="Calibri" w:hAnsi="Calibri" w:asciiTheme="minorHAnsi" w:hAnsiTheme="minorHAnsi"/>
+                <w:sz w:val="22"/>
+                <w:szCs w:val="22"/>
+              </w:rPr>
+              <w:t>- *Aportes:* El curso desarrolla la capacidad de pensar lógicamente al abordar algoritmos y modelos complejos de machine learning. Se enfoca en la lógica detrás de la toma de decisiones algorítmica y la interpretación de resultados.</w:t>
+            </w:r>
+          </w:p>
+          <w:p>
+            <w:pPr>
+              <w:pStyle w:val="Normal"/>
+              <w:widowControl/>
+              <w:suppressAutoHyphens w:val="true"/>
+              <w:spacing w:before="0" w:after="0"/>
+              <w:jc w:val="both"/>
+              <w:rPr>
+                <w:rFonts w:ascii="Calibri" w:hAnsi="Calibri" w:asciiTheme="minorHAnsi" w:hAnsiTheme="minorHAnsi"/>
+                <w:sz w:val="22"/>
+                <w:szCs w:val="22"/>
+              </w:rPr>
+            </w:pPr>
+            <w:r>
+              <w:rPr>
+                <w:rFonts w:ascii="Calibri" w:hAnsi="Calibri" w:asciiTheme="minorHAnsi" w:hAnsiTheme="minorHAnsi"/>
+                <w:sz w:val="22"/>
+                <w:szCs w:val="22"/>
+              </w:rPr>
+              <w:t xml:space="preserve">   </w:t>
+            </w:r>
+            <w:r>
+              <w:rPr>
+                <w:rFonts w:ascii="Calibri" w:hAnsi="Calibri" w:asciiTheme="minorHAnsi" w:hAnsiTheme="minorHAnsi"/>
+                <w:sz w:val="22"/>
+                <w:szCs w:val="22"/>
+              </w:rPr>
+              <w:t>- *Intencionalidades Formativas:* Fortalece la habilidad de los estudiantes para analizar y comprender la lógica subyacente de los modelos de machine learning, promoviendo el pensamiento analítico.</w:t>
+            </w:r>
+          </w:p>
+          <w:p>
+            <w:pPr>
+              <w:pStyle w:val="Normal"/>
+              <w:widowControl/>
+              <w:suppressAutoHyphens w:val="true"/>
+              <w:spacing w:before="0" w:after="0"/>
+              <w:jc w:val="both"/>
+              <w:rPr>
+                <w:rFonts w:ascii="Calibri" w:hAnsi="Calibri" w:asciiTheme="minorHAnsi" w:hAnsiTheme="minorHAnsi"/>
+                <w:sz w:val="22"/>
+                <w:szCs w:val="22"/>
+              </w:rPr>
+            </w:pPr>
+            <w:r>
+              <w:rPr>
                 <w:rFonts w:asciiTheme="minorHAnsi" w:hAnsiTheme="minorHAnsi" w:ascii="Calibri" w:hAnsi="Calibri"/>
                 <w:sz w:val="22"/>
                 <w:szCs w:val="22"/>
               </w:rPr>
-              <w:t>- *Aportes:* El curso destaca la importancia de consideraciones éticas en el desarrollo y aplicación de algoritmos de machine learning. Se abordan cuestiones éticas relacionadas con la privacidad, la discriminación algorítmica y la toma de decisiones automatizada.</w:t>
+            </w:r>
+          </w:p>
+          <w:p>
+            <w:pPr>
+              <w:pStyle w:val="Normal"/>
+              <w:widowControl/>
+              <w:suppressAutoHyphens w:val="true"/>
+              <w:spacing w:before="0" w:after="0"/>
+              <w:jc w:val="both"/>
+              <w:rPr>
+                <w:rFonts w:ascii="Calibri" w:hAnsi="Calibri" w:asciiTheme="minorHAnsi" w:hAnsiTheme="minorHAnsi"/>
+                <w:sz w:val="22"/>
+                <w:szCs w:val="22"/>
+              </w:rPr>
+            </w:pPr>
+            <w:r>
+              <w:rPr>
+                <w:rFonts w:ascii="Calibri" w:hAnsi="Calibri" w:asciiTheme="minorHAnsi" w:hAnsiTheme="minorHAnsi"/>
+                <w:sz w:val="22"/>
+                <w:szCs w:val="22"/>
+              </w:rPr>
+              <w:t>**Aportes a la Formación en Investigación:**</w:t>
             </w:r>
           </w:p>
           <w:p>
@@ -4721,15 +5040,191 @@
                 <w:sz w:val="22"/>
                 <w:szCs w:val="22"/>
               </w:rPr>
+            </w:r>
+          </w:p>
+          <w:p>
+            <w:pPr>
+              <w:pStyle w:val="Normal"/>
+              <w:widowControl/>
+              <w:suppressAutoHyphens w:val="true"/>
+              <w:spacing w:before="0" w:after="0"/>
+              <w:jc w:val="both"/>
+              <w:rPr>
+                <w:rFonts w:ascii="Calibri" w:hAnsi="Calibri" w:asciiTheme="minorHAnsi" w:hAnsiTheme="minorHAnsi"/>
+                <w:sz w:val="22"/>
+                <w:szCs w:val="22"/>
+              </w:rPr>
+            </w:pPr>
+            <w:r>
+              <w:rPr>
+                <w:rFonts w:ascii="Calibri" w:hAnsi="Calibri" w:asciiTheme="minorHAnsi" w:hAnsiTheme="minorHAnsi"/>
+                <w:sz w:val="22"/>
+                <w:szCs w:val="22"/>
+              </w:rPr>
+              <w:t>1. **Intencionalidades Formativas en Investigación:**</w:t>
+            </w:r>
+          </w:p>
+          <w:p>
+            <w:pPr>
+              <w:pStyle w:val="Normal"/>
+              <w:widowControl/>
+              <w:suppressAutoHyphens w:val="true"/>
+              <w:spacing w:before="0" w:after="0"/>
+              <w:jc w:val="both"/>
+              <w:rPr>
+                <w:rFonts w:ascii="Calibri" w:hAnsi="Calibri" w:asciiTheme="minorHAnsi" w:hAnsiTheme="minorHAnsi"/>
+                <w:sz w:val="22"/>
+                <w:szCs w:val="22"/>
+              </w:rPr>
+            </w:pPr>
+            <w:r>
+              <w:rPr>
+                <w:rFonts w:ascii="Calibri" w:hAnsi="Calibri" w:asciiTheme="minorHAnsi" w:hAnsiTheme="minorHAnsi"/>
+                <w:sz w:val="22"/>
+                <w:szCs w:val="22"/>
+              </w:rPr>
               <w:t xml:space="preserve">   </w:t>
             </w:r>
             <w:r>
               <w:rPr>
+                <w:rFonts w:ascii="Calibri" w:hAnsi="Calibri" w:asciiTheme="minorHAnsi" w:hAnsiTheme="minorHAnsi"/>
+                <w:sz w:val="22"/>
+                <w:szCs w:val="22"/>
+              </w:rPr>
+              <w:t>- *Aportes:* El curso integra proyectos de investigación aplicada en los cuales los estudiantes aplican los conocimientos adquiridos para abordar problemas específicos. Se incentiva la investigación en soluciones innovadoras.</w:t>
+            </w:r>
+          </w:p>
+          <w:p>
+            <w:pPr>
+              <w:pStyle w:val="Normal"/>
+              <w:widowControl/>
+              <w:suppressAutoHyphens w:val="true"/>
+              <w:spacing w:before="0" w:after="0"/>
+              <w:jc w:val="both"/>
+              <w:rPr>
+                <w:rFonts w:ascii="Calibri" w:hAnsi="Calibri" w:asciiTheme="minorHAnsi" w:hAnsiTheme="minorHAnsi"/>
+                <w:sz w:val="22"/>
+                <w:szCs w:val="22"/>
+              </w:rPr>
+            </w:pPr>
+            <w:r>
+              <w:rPr>
+                <w:rFonts w:ascii="Calibri" w:hAnsi="Calibri" w:asciiTheme="minorHAnsi" w:hAnsiTheme="minorHAnsi"/>
+                <w:sz w:val="22"/>
+                <w:szCs w:val="22"/>
+              </w:rPr>
+              <w:t xml:space="preserve">   </w:t>
+            </w:r>
+            <w:r>
+              <w:rPr>
+                <w:rFonts w:ascii="Calibri" w:hAnsi="Calibri" w:asciiTheme="minorHAnsi" w:hAnsiTheme="minorHAnsi"/>
+                <w:sz w:val="22"/>
+                <w:szCs w:val="22"/>
+              </w:rPr>
+              <w:t>- *Abordaje de Conocimientos y Saberes:* Introduce a los estudiantes en la metodología de investigación en machine learning, desde la formulación de preguntas hasta la implementación y evaluación de soluciones.</w:t>
+            </w:r>
+          </w:p>
+          <w:p>
+            <w:pPr>
+              <w:pStyle w:val="Normal"/>
+              <w:widowControl/>
+              <w:suppressAutoHyphens w:val="true"/>
+              <w:spacing w:before="0" w:after="0"/>
+              <w:jc w:val="both"/>
+              <w:rPr>
+                <w:rFonts w:ascii="Calibri" w:hAnsi="Calibri" w:asciiTheme="minorHAnsi" w:hAnsiTheme="minorHAnsi"/>
+                <w:sz w:val="22"/>
+                <w:szCs w:val="22"/>
+              </w:rPr>
+            </w:pPr>
+            <w:r>
+              <w:rPr>
                 <w:rFonts w:asciiTheme="minorHAnsi" w:hAnsiTheme="minorHAnsi" w:ascii="Calibri" w:hAnsi="Calibri"/>
                 <w:sz w:val="22"/>
                 <w:szCs w:val="22"/>
               </w:rPr>
-              <w:t>- *Intencionalidades Formativas:* Promueve la reflexión ética en el uso de tecnologías de machine learning y la responsabilidad de los profesionales en la toma de decisiones éticas en el desarrollo y aplicación de modelos.</w:t>
+            </w:r>
+          </w:p>
+          <w:p>
+            <w:pPr>
+              <w:pStyle w:val="Normal"/>
+              <w:widowControl/>
+              <w:suppressAutoHyphens w:val="true"/>
+              <w:spacing w:before="0" w:after="0"/>
+              <w:jc w:val="both"/>
+              <w:rPr>
+                <w:rFonts w:ascii="Calibri" w:hAnsi="Calibri" w:asciiTheme="minorHAnsi" w:hAnsiTheme="minorHAnsi"/>
+                <w:sz w:val="22"/>
+                <w:szCs w:val="22"/>
+              </w:rPr>
+            </w:pPr>
+            <w:r>
+              <w:rPr>
+                <w:rFonts w:ascii="Calibri" w:hAnsi="Calibri" w:asciiTheme="minorHAnsi" w:hAnsiTheme="minorHAnsi"/>
+                <w:sz w:val="22"/>
+                <w:szCs w:val="22"/>
+              </w:rPr>
+              <w:t>2. **Abordaje de Conocimientos y Saberes:**</w:t>
+            </w:r>
+          </w:p>
+          <w:p>
+            <w:pPr>
+              <w:pStyle w:val="Normal"/>
+              <w:widowControl/>
+              <w:suppressAutoHyphens w:val="true"/>
+              <w:spacing w:before="0" w:after="0"/>
+              <w:jc w:val="both"/>
+              <w:rPr>
+                <w:rFonts w:ascii="Calibri" w:hAnsi="Calibri" w:asciiTheme="minorHAnsi" w:hAnsiTheme="minorHAnsi"/>
+                <w:sz w:val="22"/>
+                <w:szCs w:val="22"/>
+              </w:rPr>
+            </w:pPr>
+            <w:r>
+              <w:rPr>
+                <w:rFonts w:ascii="Calibri" w:hAnsi="Calibri" w:asciiTheme="minorHAnsi" w:hAnsiTheme="minorHAnsi"/>
+                <w:sz w:val="22"/>
+                <w:szCs w:val="22"/>
+              </w:rPr>
+              <w:t xml:space="preserve">   </w:t>
+            </w:r>
+            <w:r>
+              <w:rPr>
+                <w:rFonts w:ascii="Calibri" w:hAnsi="Calibri" w:asciiTheme="minorHAnsi" w:hAnsiTheme="minorHAnsi"/>
+                <w:sz w:val="22"/>
+                <w:szCs w:val="22"/>
+              </w:rPr>
+              <w:t>- *Aportes:* Los estudiantes adquieren conocimientos teóricos y prácticos en machine learning con Python, aplicando algoritmos a conjuntos de datos reales. Se enfatiza el equilibrio entre la teoría y la aplicación práctica.</w:t>
+            </w:r>
+          </w:p>
+          <w:p>
+            <w:pPr>
+              <w:pStyle w:val="Normal"/>
+              <w:widowControl/>
+              <w:suppressAutoHyphens w:val="true"/>
+              <w:spacing w:before="0" w:after="0"/>
+              <w:jc w:val="both"/>
+              <w:rPr>
+                <w:rFonts w:ascii="Calibri" w:hAnsi="Calibri" w:asciiTheme="minorHAnsi" w:hAnsiTheme="minorHAnsi"/>
+                <w:sz w:val="22"/>
+                <w:szCs w:val="22"/>
+              </w:rPr>
+            </w:pPr>
+            <w:r>
+              <w:rPr>
+                <w:rFonts w:ascii="Calibri" w:hAnsi="Calibri" w:asciiTheme="minorHAnsi" w:hAnsiTheme="minorHAnsi"/>
+                <w:sz w:val="22"/>
+                <w:szCs w:val="22"/>
+              </w:rPr>
+              <w:t xml:space="preserve">   </w:t>
+            </w:r>
+            <w:r>
+              <w:rPr>
+                <w:rFonts w:ascii="Calibri" w:hAnsi="Calibri" w:asciiTheme="minorHAnsi" w:hAnsiTheme="minorHAnsi"/>
+                <w:sz w:val="22"/>
+                <w:szCs w:val="22"/>
+              </w:rPr>
+              <w:t>- *Intencionalidades Formativas:* Desarrolla habilidades aplicadas y teóricas, preparando a los estudiantes para comprender, implementar y contribuir al avance del conocimiento en machine learning.</w:t>
             </w:r>
           </w:p>
           <w:p>
@@ -4768,668 +5263,110 @@
             </w:pPr>
             <w:r>
               <w:rPr>
+                <w:rFonts w:ascii="Calibri" w:hAnsi="Calibri" w:asciiTheme="minorHAnsi" w:hAnsiTheme="minorHAnsi"/>
+                <w:sz w:val="22"/>
+                <w:szCs w:val="22"/>
+              </w:rPr>
+              <w:t>3. **Aplicación Práctica de la Investigación:**</w:t>
+            </w:r>
+          </w:p>
+          <w:p>
+            <w:pPr>
+              <w:pStyle w:val="Normal"/>
+              <w:widowControl/>
+              <w:suppressAutoHyphens w:val="true"/>
+              <w:spacing w:before="0" w:after="0"/>
+              <w:jc w:val="both"/>
+              <w:rPr>
+                <w:rFonts w:ascii="Calibri" w:hAnsi="Calibri" w:asciiTheme="minorHAnsi" w:hAnsiTheme="minorHAnsi"/>
+                <w:sz w:val="22"/>
+                <w:szCs w:val="22"/>
+              </w:rPr>
+            </w:pPr>
+            <w:r>
+              <w:rPr>
+                <w:rFonts w:ascii="Calibri" w:hAnsi="Calibri" w:asciiTheme="minorHAnsi" w:hAnsiTheme="minorHAnsi"/>
+                <w:sz w:val="22"/>
+                <w:szCs w:val="22"/>
+              </w:rPr>
+              <w:t xml:space="preserve">   </w:t>
+            </w:r>
+            <w:r>
+              <w:rPr>
+                <w:rFonts w:ascii="Calibri" w:hAnsi="Calibri" w:asciiTheme="minorHAnsi" w:hAnsiTheme="minorHAnsi"/>
+                <w:sz w:val="22"/>
+                <w:szCs w:val="22"/>
+              </w:rPr>
+              <w:t>- *Aportes:* Los proyectos prácticos del curso requieren que los estudiantes apliquen sus conocimientos en la resolución de problemas del mundo real, fomentando la aplicación práctica de la investigación en machine learning.</w:t>
+            </w:r>
+          </w:p>
+          <w:p>
+            <w:pPr>
+              <w:pStyle w:val="Normal"/>
+              <w:widowControl/>
+              <w:suppressAutoHyphens w:val="true"/>
+              <w:spacing w:before="0" w:after="0"/>
+              <w:jc w:val="both"/>
+              <w:rPr>
+                <w:rFonts w:ascii="Calibri" w:hAnsi="Calibri" w:asciiTheme="minorHAnsi" w:hAnsiTheme="minorHAnsi"/>
+                <w:sz w:val="22"/>
+                <w:szCs w:val="22"/>
+              </w:rPr>
+            </w:pPr>
+            <w:r>
+              <w:rPr>
+                <w:rFonts w:ascii="Calibri" w:hAnsi="Calibri" w:asciiTheme="minorHAnsi" w:hAnsiTheme="minorHAnsi"/>
+                <w:sz w:val="22"/>
+                <w:szCs w:val="22"/>
+              </w:rPr>
+              <w:t xml:space="preserve">   </w:t>
+            </w:r>
+            <w:r>
+              <w:rPr>
+                <w:rFonts w:ascii="Calibri" w:hAnsi="Calibri" w:asciiTheme="minorHAnsi" w:hAnsiTheme="minorHAnsi"/>
+                <w:sz w:val="22"/>
+                <w:szCs w:val="22"/>
+              </w:rPr>
+              <w:t>- *Abordaje de Conocimientos y Saberes:* Facilita la transferencia de conocimientos a situaciones prácticas y promueve la capacidad de los estudiantes para resolver problemas complejos utilizando técnicas de investigación.</w:t>
+            </w:r>
+          </w:p>
+          <w:p>
+            <w:pPr>
+              <w:pStyle w:val="Normal"/>
+              <w:widowControl/>
+              <w:suppressAutoHyphens w:val="true"/>
+              <w:spacing w:before="0" w:after="0"/>
+              <w:jc w:val="both"/>
+              <w:rPr>
+                <w:rFonts w:ascii="Calibri" w:hAnsi="Calibri" w:asciiTheme="minorHAnsi" w:hAnsiTheme="minorHAnsi"/>
+                <w:sz w:val="22"/>
+                <w:szCs w:val="22"/>
+              </w:rPr>
+            </w:pPr>
+            <w:r>
+              <w:rPr>
                 <w:rFonts w:asciiTheme="minorHAnsi" w:hAnsiTheme="minorHAnsi" w:ascii="Calibri" w:hAnsi="Calibri"/>
                 <w:sz w:val="22"/>
                 <w:szCs w:val="22"/>
               </w:rPr>
-              <w:t>2. **Racionalidad Política:**</w:t>
-            </w:r>
-          </w:p>
-          <w:p>
-            <w:pPr>
-              <w:pStyle w:val="Normal"/>
-              <w:widowControl/>
-              <w:suppressAutoHyphens w:val="true"/>
-              <w:spacing w:before="0" w:after="0"/>
-              <w:jc w:val="both"/>
-              <w:rPr>
-                <w:rFonts w:ascii="Calibri" w:hAnsi="Calibri" w:asciiTheme="minorHAnsi" w:hAnsiTheme="minorHAnsi"/>
-                <w:sz w:val="22"/>
-                <w:szCs w:val="22"/>
-              </w:rPr>
-            </w:pPr>
-            <w:r>
-              <w:rPr>
-                <w:rFonts w:asciiTheme="minorHAnsi" w:hAnsiTheme="minorHAnsi" w:ascii="Calibri" w:hAnsi="Calibri"/>
-                <w:sz w:val="22"/>
-                <w:szCs w:val="22"/>
-              </w:rPr>
-              <w:t xml:space="preserve">   </w:t>
-            </w:r>
-            <w:r>
-              <w:rPr>
-                <w:rFonts w:asciiTheme="minorHAnsi" w:hAnsiTheme="minorHAnsi" w:ascii="Calibri" w:hAnsi="Calibri"/>
-                <w:sz w:val="22"/>
-                <w:szCs w:val="22"/>
-              </w:rPr>
-              <w:t>- *Aportes:* Se exploran aspectos políticos relacionados con el acceso equitativo a tecnologías de machine learning y la influencia de estos sistemas en la sociedad. Se fomenta la comprensión de las implicaciones políticas de la inteligencia artificial.</w:t>
-            </w:r>
-          </w:p>
-          <w:p>
-            <w:pPr>
-              <w:pStyle w:val="Normal"/>
-              <w:widowControl/>
-              <w:suppressAutoHyphens w:val="true"/>
-              <w:spacing w:before="0" w:after="0"/>
-              <w:jc w:val="both"/>
-              <w:rPr>
-                <w:rFonts w:ascii="Calibri" w:hAnsi="Calibri" w:asciiTheme="minorHAnsi" w:hAnsiTheme="minorHAnsi"/>
-                <w:sz w:val="22"/>
-                <w:szCs w:val="22"/>
-              </w:rPr>
-            </w:pPr>
-            <w:r>
-              <w:rPr>
-                <w:rFonts w:asciiTheme="minorHAnsi" w:hAnsiTheme="minorHAnsi" w:ascii="Calibri" w:hAnsi="Calibri"/>
-                <w:sz w:val="22"/>
-                <w:szCs w:val="22"/>
-              </w:rPr>
-              <w:t xml:space="preserve">   </w:t>
-            </w:r>
-            <w:r>
-              <w:rPr>
-                <w:rFonts w:asciiTheme="minorHAnsi" w:hAnsiTheme="minorHAnsi" w:ascii="Calibri" w:hAnsi="Calibri"/>
-                <w:sz w:val="22"/>
-                <w:szCs w:val="22"/>
-              </w:rPr>
-              <w:t>- *Intencionalidades Formativas:* Desarrolla una conciencia crítica sobre el impacto político y social de las tecnologías de machine learning, preparando a los estudiantes para participar en discusiones informadas y contribuir a políticas tecnológicas éticas.</w:t>
-            </w:r>
-          </w:p>
-          <w:p>
-            <w:pPr>
-              <w:pStyle w:val="Normal"/>
-              <w:widowControl/>
-              <w:suppressAutoHyphens w:val="true"/>
-              <w:spacing w:before="0" w:after="0"/>
-              <w:jc w:val="both"/>
-              <w:rPr>
-                <w:rFonts w:ascii="Calibri" w:hAnsi="Calibri" w:asciiTheme="minorHAnsi" w:hAnsiTheme="minorHAnsi"/>
-                <w:sz w:val="22"/>
-                <w:szCs w:val="22"/>
-              </w:rPr>
-            </w:pPr>
-            <w:r>
-              <w:rPr>
-                <w:rFonts w:asciiTheme="minorHAnsi" w:hAnsiTheme="minorHAnsi" w:ascii="Calibri" w:hAnsi="Calibri"/>
-                <w:sz w:val="22"/>
-                <w:szCs w:val="22"/>
-              </w:rPr>
-            </w:r>
-          </w:p>
-          <w:p>
-            <w:pPr>
-              <w:pStyle w:val="Normal"/>
-              <w:widowControl/>
-              <w:suppressAutoHyphens w:val="true"/>
-              <w:spacing w:before="0" w:after="0"/>
-              <w:jc w:val="both"/>
-              <w:rPr>
-                <w:rFonts w:ascii="Calibri" w:hAnsi="Calibri" w:asciiTheme="minorHAnsi" w:hAnsiTheme="minorHAnsi"/>
-                <w:sz w:val="22"/>
-                <w:szCs w:val="22"/>
-              </w:rPr>
-            </w:pPr>
-            <w:r>
-              <w:rPr>
-                <w:rFonts w:asciiTheme="minorHAnsi" w:hAnsiTheme="minorHAnsi" w:ascii="Calibri" w:hAnsi="Calibri"/>
-                <w:sz w:val="22"/>
-                <w:szCs w:val="22"/>
-              </w:rPr>
-              <w:t>3. **Racionalidad Estética:**</w:t>
-            </w:r>
-          </w:p>
-          <w:p>
-            <w:pPr>
-              <w:pStyle w:val="Normal"/>
-              <w:widowControl/>
-              <w:suppressAutoHyphens w:val="true"/>
-              <w:spacing w:before="0" w:after="0"/>
-              <w:jc w:val="both"/>
-              <w:rPr>
-                <w:rFonts w:ascii="Calibri" w:hAnsi="Calibri" w:asciiTheme="minorHAnsi" w:hAnsiTheme="minorHAnsi"/>
-                <w:sz w:val="22"/>
-                <w:szCs w:val="22"/>
-              </w:rPr>
-            </w:pPr>
-            <w:r>
-              <w:rPr>
-                <w:rFonts w:asciiTheme="minorHAnsi" w:hAnsiTheme="minorHAnsi" w:ascii="Calibri" w:hAnsi="Calibri"/>
-                <w:sz w:val="22"/>
-                <w:szCs w:val="22"/>
-              </w:rPr>
-              <w:t xml:space="preserve">   </w:t>
-            </w:r>
-            <w:r>
-              <w:rPr>
-                <w:rFonts w:asciiTheme="minorHAnsi" w:hAnsiTheme="minorHAnsi" w:ascii="Calibri" w:hAnsi="Calibri"/>
-                <w:sz w:val="22"/>
-                <w:szCs w:val="22"/>
-              </w:rPr>
-              <w:t>- *Aportes:* Aunque en menor medida, se abordan aspectos estéticos al considerar la presentación visual de datos y resultados de modelos de machine learning. Se enfatiza la importancia de representar gráficamente la información de manera clara y comprensible.</w:t>
-            </w:r>
-          </w:p>
-          <w:p>
-            <w:pPr>
-              <w:pStyle w:val="Normal"/>
-              <w:widowControl/>
-              <w:suppressAutoHyphens w:val="true"/>
-              <w:spacing w:before="0" w:after="0"/>
-              <w:jc w:val="both"/>
-              <w:rPr>
-                <w:rFonts w:ascii="Calibri" w:hAnsi="Calibri" w:asciiTheme="minorHAnsi" w:hAnsiTheme="minorHAnsi"/>
-                <w:sz w:val="22"/>
-                <w:szCs w:val="22"/>
-              </w:rPr>
-            </w:pPr>
-            <w:r>
-              <w:rPr>
-                <w:rFonts w:asciiTheme="minorHAnsi" w:hAnsiTheme="minorHAnsi" w:ascii="Calibri" w:hAnsi="Calibri"/>
-                <w:sz w:val="22"/>
-                <w:szCs w:val="22"/>
-              </w:rPr>
-              <w:t xml:space="preserve">   </w:t>
-            </w:r>
-            <w:r>
-              <w:rPr>
-                <w:rFonts w:asciiTheme="minorHAnsi" w:hAnsiTheme="minorHAnsi" w:ascii="Calibri" w:hAnsi="Calibri"/>
-                <w:sz w:val="22"/>
-                <w:szCs w:val="22"/>
-              </w:rPr>
-              <w:t>- *Intencionalidades Formativas:* Fomenta la apreciación de la estética en la presentación visual de resultados, reconociendo que la representación gráfica puede influir en la interpretación y comprensión de los datos.</w:t>
-            </w:r>
-          </w:p>
-          <w:p>
-            <w:pPr>
-              <w:pStyle w:val="Normal"/>
-              <w:widowControl/>
-              <w:suppressAutoHyphens w:val="true"/>
-              <w:spacing w:before="0" w:after="0"/>
-              <w:jc w:val="both"/>
-              <w:rPr>
-                <w:rFonts w:ascii="Calibri" w:hAnsi="Calibri" w:asciiTheme="minorHAnsi" w:hAnsiTheme="minorHAnsi"/>
-                <w:sz w:val="22"/>
-                <w:szCs w:val="22"/>
-              </w:rPr>
-            </w:pPr>
-            <w:r>
-              <w:rPr>
-                <w:rFonts w:asciiTheme="minorHAnsi" w:hAnsiTheme="minorHAnsi" w:ascii="Calibri" w:hAnsi="Calibri"/>
-                <w:sz w:val="22"/>
-                <w:szCs w:val="22"/>
-              </w:rPr>
-            </w:r>
-          </w:p>
-          <w:p>
-            <w:pPr>
-              <w:pStyle w:val="Normal"/>
-              <w:widowControl/>
-              <w:suppressAutoHyphens w:val="true"/>
-              <w:spacing w:before="0" w:after="0"/>
-              <w:jc w:val="both"/>
-              <w:rPr>
-                <w:rFonts w:ascii="Calibri" w:hAnsi="Calibri" w:asciiTheme="minorHAnsi" w:hAnsiTheme="minorHAnsi"/>
-                <w:sz w:val="22"/>
-                <w:szCs w:val="22"/>
-              </w:rPr>
-            </w:pPr>
-            <w:r>
-              <w:rPr>
-                <w:rFonts w:asciiTheme="minorHAnsi" w:hAnsiTheme="minorHAnsi" w:ascii="Calibri" w:hAnsi="Calibri"/>
-                <w:sz w:val="22"/>
-                <w:szCs w:val="22"/>
-              </w:rPr>
-              <w:t>4. **Racionalidad Lógica:**</w:t>
-            </w:r>
-          </w:p>
-          <w:p>
-            <w:pPr>
-              <w:pStyle w:val="Normal"/>
-              <w:widowControl/>
-              <w:suppressAutoHyphens w:val="true"/>
-              <w:spacing w:before="0" w:after="0"/>
-              <w:jc w:val="both"/>
-              <w:rPr>
-                <w:rFonts w:ascii="Calibri" w:hAnsi="Calibri" w:asciiTheme="minorHAnsi" w:hAnsiTheme="minorHAnsi"/>
-                <w:sz w:val="22"/>
-                <w:szCs w:val="22"/>
-              </w:rPr>
-            </w:pPr>
-            <w:r>
-              <w:rPr>
-                <w:rFonts w:asciiTheme="minorHAnsi" w:hAnsiTheme="minorHAnsi" w:ascii="Calibri" w:hAnsi="Calibri"/>
-                <w:sz w:val="22"/>
-                <w:szCs w:val="22"/>
-              </w:rPr>
-              <w:t xml:space="preserve">   </w:t>
-            </w:r>
-            <w:r>
-              <w:rPr>
-                <w:rFonts w:asciiTheme="minorHAnsi" w:hAnsiTheme="minorHAnsi" w:ascii="Calibri" w:hAnsi="Calibri"/>
-                <w:sz w:val="22"/>
-                <w:szCs w:val="22"/>
-              </w:rPr>
-              <w:t>- *Aportes:* El curso desarrolla la capacidad de pensar lógicamente al abordar algoritmos y modelos complejos de machine learning. Se enfoca en la lógica detrás de la toma de decisiones algorítmica y la interpretación de resultados.</w:t>
-            </w:r>
-          </w:p>
-          <w:p>
-            <w:pPr>
-              <w:pStyle w:val="Normal"/>
-              <w:widowControl/>
-              <w:suppressAutoHyphens w:val="true"/>
-              <w:spacing w:before="0" w:after="0"/>
-              <w:jc w:val="both"/>
-              <w:rPr>
-                <w:rFonts w:ascii="Calibri" w:hAnsi="Calibri" w:asciiTheme="minorHAnsi" w:hAnsiTheme="minorHAnsi"/>
-                <w:sz w:val="22"/>
-                <w:szCs w:val="22"/>
-              </w:rPr>
-            </w:pPr>
-            <w:r>
-              <w:rPr>
-                <w:rFonts w:asciiTheme="minorHAnsi" w:hAnsiTheme="minorHAnsi" w:ascii="Calibri" w:hAnsi="Calibri"/>
-                <w:sz w:val="22"/>
-                <w:szCs w:val="22"/>
-              </w:rPr>
-              <w:t xml:space="preserve">   </w:t>
-            </w:r>
-            <w:r>
-              <w:rPr>
-                <w:rFonts w:asciiTheme="minorHAnsi" w:hAnsiTheme="minorHAnsi" w:ascii="Calibri" w:hAnsi="Calibri"/>
-                <w:sz w:val="22"/>
-                <w:szCs w:val="22"/>
-              </w:rPr>
-              <w:t>- *Intencionalidades Formativas:* Fortalece la habilidad de los estudiantes para analizar y comprender la lógica subyacente de los modelos de machine learning, promoviendo el pensamiento analítico.</w:t>
-            </w:r>
-          </w:p>
-          <w:p>
-            <w:pPr>
-              <w:pStyle w:val="Normal"/>
-              <w:widowControl/>
-              <w:suppressAutoHyphens w:val="true"/>
-              <w:spacing w:before="0" w:after="0"/>
-              <w:jc w:val="both"/>
-              <w:rPr>
-                <w:rFonts w:ascii="Calibri" w:hAnsi="Calibri" w:asciiTheme="minorHAnsi" w:hAnsiTheme="minorHAnsi"/>
-                <w:sz w:val="22"/>
-                <w:szCs w:val="22"/>
-              </w:rPr>
-            </w:pPr>
-            <w:r>
-              <w:rPr>
-                <w:rFonts w:asciiTheme="minorHAnsi" w:hAnsiTheme="minorHAnsi" w:ascii="Calibri" w:hAnsi="Calibri"/>
-                <w:sz w:val="22"/>
-                <w:szCs w:val="22"/>
-              </w:rPr>
-            </w:r>
-          </w:p>
-          <w:p>
-            <w:pPr>
-              <w:pStyle w:val="Normal"/>
-              <w:widowControl/>
-              <w:suppressAutoHyphens w:val="true"/>
-              <w:spacing w:before="0" w:after="0"/>
-              <w:jc w:val="both"/>
-              <w:rPr>
-                <w:rFonts w:ascii="Calibri" w:hAnsi="Calibri" w:asciiTheme="minorHAnsi" w:hAnsiTheme="minorHAnsi"/>
-                <w:sz w:val="22"/>
-                <w:szCs w:val="22"/>
-              </w:rPr>
-            </w:pPr>
-            <w:r>
-              <w:rPr>
-                <w:rFonts w:asciiTheme="minorHAnsi" w:hAnsiTheme="minorHAnsi" w:ascii="Calibri" w:hAnsi="Calibri"/>
-                <w:sz w:val="22"/>
-                <w:szCs w:val="22"/>
-              </w:rPr>
-              <w:t>**Aportes a la Formación en Investigación:**</w:t>
-            </w:r>
-          </w:p>
-          <w:p>
-            <w:pPr>
-              <w:pStyle w:val="Normal"/>
-              <w:widowControl/>
-              <w:suppressAutoHyphens w:val="true"/>
-              <w:spacing w:before="0" w:after="0"/>
-              <w:jc w:val="both"/>
-              <w:rPr>
-                <w:rFonts w:ascii="Calibri" w:hAnsi="Calibri" w:asciiTheme="minorHAnsi" w:hAnsiTheme="minorHAnsi"/>
-                <w:sz w:val="22"/>
-                <w:szCs w:val="22"/>
-              </w:rPr>
-            </w:pPr>
-            <w:r>
-              <w:rPr>
-                <w:rFonts w:asciiTheme="minorHAnsi" w:hAnsiTheme="minorHAnsi" w:ascii="Calibri" w:hAnsi="Calibri"/>
-                <w:sz w:val="22"/>
-                <w:szCs w:val="22"/>
-              </w:rPr>
-            </w:r>
-          </w:p>
-          <w:p>
-            <w:pPr>
-              <w:pStyle w:val="Normal"/>
-              <w:widowControl/>
-              <w:suppressAutoHyphens w:val="true"/>
-              <w:spacing w:before="0" w:after="0"/>
-              <w:jc w:val="both"/>
-              <w:rPr>
-                <w:rFonts w:ascii="Calibri" w:hAnsi="Calibri" w:asciiTheme="minorHAnsi" w:hAnsiTheme="minorHAnsi"/>
-                <w:sz w:val="22"/>
-                <w:szCs w:val="22"/>
-              </w:rPr>
-            </w:pPr>
-            <w:r>
-              <w:rPr>
-                <w:rFonts w:asciiTheme="minorHAnsi" w:hAnsiTheme="minorHAnsi" w:ascii="Calibri" w:hAnsi="Calibri"/>
-                <w:sz w:val="22"/>
-                <w:szCs w:val="22"/>
-              </w:rPr>
-              <w:t>1. **Intencionalidades Formativas en Investigación:**</w:t>
-            </w:r>
-          </w:p>
-          <w:p>
-            <w:pPr>
-              <w:pStyle w:val="Normal"/>
-              <w:widowControl/>
-              <w:suppressAutoHyphens w:val="true"/>
-              <w:spacing w:before="0" w:after="0"/>
-              <w:jc w:val="both"/>
-              <w:rPr>
-                <w:rFonts w:ascii="Calibri" w:hAnsi="Calibri" w:asciiTheme="minorHAnsi" w:hAnsiTheme="minorHAnsi"/>
-                <w:sz w:val="22"/>
-                <w:szCs w:val="22"/>
-              </w:rPr>
-            </w:pPr>
-            <w:r>
-              <w:rPr>
-                <w:rFonts w:asciiTheme="minorHAnsi" w:hAnsiTheme="minorHAnsi" w:ascii="Calibri" w:hAnsi="Calibri"/>
-                <w:sz w:val="22"/>
-                <w:szCs w:val="22"/>
-              </w:rPr>
-              <w:t xml:space="preserve">   </w:t>
-            </w:r>
-            <w:r>
-              <w:rPr>
-                <w:rFonts w:asciiTheme="minorHAnsi" w:hAnsiTheme="minorHAnsi" w:ascii="Calibri" w:hAnsi="Calibri"/>
-                <w:sz w:val="22"/>
-                <w:szCs w:val="22"/>
-              </w:rPr>
-              <w:t>- *Aportes:* El curso integra proyectos de investigación aplicada en los cuales los estudiantes aplican los conocimientos adquiridos para abordar problemas específicos. Se incentiva la investigación en soluciones innovadoras.</w:t>
-            </w:r>
-          </w:p>
-          <w:p>
-            <w:pPr>
-              <w:pStyle w:val="Normal"/>
-              <w:widowControl/>
-              <w:suppressAutoHyphens w:val="true"/>
-              <w:spacing w:before="0" w:after="0"/>
-              <w:jc w:val="both"/>
-              <w:rPr>
-                <w:rFonts w:ascii="Calibri" w:hAnsi="Calibri" w:asciiTheme="minorHAnsi" w:hAnsiTheme="minorHAnsi"/>
-                <w:sz w:val="22"/>
-                <w:szCs w:val="22"/>
-              </w:rPr>
-            </w:pPr>
-            <w:r>
-              <w:rPr>
-                <w:rFonts w:asciiTheme="minorHAnsi" w:hAnsiTheme="minorHAnsi" w:ascii="Calibri" w:hAnsi="Calibri"/>
-                <w:sz w:val="22"/>
-                <w:szCs w:val="22"/>
-              </w:rPr>
-              <w:t xml:space="preserve">   </w:t>
-            </w:r>
-            <w:r>
-              <w:rPr>
-                <w:rFonts w:asciiTheme="minorHAnsi" w:hAnsiTheme="minorHAnsi" w:ascii="Calibri" w:hAnsi="Calibri"/>
-                <w:sz w:val="22"/>
-                <w:szCs w:val="22"/>
-              </w:rPr>
-              <w:t>- *Abordaje de Conocimientos y Saberes:* Introduce a los estudiantes en la metodología de investigación en machine learning, desde la formulación de preguntas hasta la implementación y evaluación de soluciones.</w:t>
-            </w:r>
-          </w:p>
-          <w:p>
-            <w:pPr>
-              <w:pStyle w:val="Normal"/>
-              <w:widowControl/>
-              <w:suppressAutoHyphens w:val="true"/>
-              <w:spacing w:before="0" w:after="0"/>
-              <w:jc w:val="both"/>
-              <w:rPr>
-                <w:rFonts w:ascii="Calibri" w:hAnsi="Calibri" w:asciiTheme="minorHAnsi" w:hAnsiTheme="minorHAnsi"/>
-                <w:sz w:val="22"/>
-                <w:szCs w:val="22"/>
-              </w:rPr>
-            </w:pPr>
-            <w:r>
-              <w:rPr>
-                <w:rFonts w:asciiTheme="minorHAnsi" w:hAnsiTheme="minorHAnsi" w:ascii="Calibri" w:hAnsi="Calibri"/>
-                <w:sz w:val="22"/>
-                <w:szCs w:val="22"/>
-              </w:rPr>
-            </w:r>
-          </w:p>
-          <w:p>
-            <w:pPr>
-              <w:pStyle w:val="Normal"/>
-              <w:widowControl/>
-              <w:suppressAutoHyphens w:val="true"/>
-              <w:spacing w:before="0" w:after="0"/>
-              <w:jc w:val="both"/>
-              <w:rPr>
-                <w:rFonts w:ascii="Calibri" w:hAnsi="Calibri" w:asciiTheme="minorHAnsi" w:hAnsiTheme="minorHAnsi"/>
-                <w:sz w:val="22"/>
-                <w:szCs w:val="22"/>
-              </w:rPr>
-            </w:pPr>
-            <w:r>
-              <w:rPr>
-                <w:rFonts w:asciiTheme="minorHAnsi" w:hAnsiTheme="minorHAnsi" w:ascii="Calibri" w:hAnsi="Calibri"/>
-                <w:sz w:val="22"/>
-                <w:szCs w:val="22"/>
-              </w:rPr>
-              <w:t>2. **Abordaje de Conocimientos y Saberes:**</w:t>
-            </w:r>
-          </w:p>
-          <w:p>
-            <w:pPr>
-              <w:pStyle w:val="Normal"/>
-              <w:widowControl/>
-              <w:suppressAutoHyphens w:val="true"/>
-              <w:spacing w:before="0" w:after="0"/>
-              <w:jc w:val="both"/>
-              <w:rPr>
-                <w:rFonts w:ascii="Calibri" w:hAnsi="Calibri" w:asciiTheme="minorHAnsi" w:hAnsiTheme="minorHAnsi"/>
-                <w:sz w:val="22"/>
-                <w:szCs w:val="22"/>
-              </w:rPr>
-            </w:pPr>
-            <w:r>
-              <w:rPr>
-                <w:rFonts w:asciiTheme="minorHAnsi" w:hAnsiTheme="minorHAnsi" w:ascii="Calibri" w:hAnsi="Calibri"/>
-                <w:sz w:val="22"/>
-                <w:szCs w:val="22"/>
-              </w:rPr>
-              <w:t xml:space="preserve">   </w:t>
-            </w:r>
-            <w:r>
-              <w:rPr>
-                <w:rFonts w:asciiTheme="minorHAnsi" w:hAnsiTheme="minorHAnsi" w:ascii="Calibri" w:hAnsi="Calibri"/>
-                <w:sz w:val="22"/>
-                <w:szCs w:val="22"/>
-              </w:rPr>
-              <w:t>- *Aportes:* Los estudiantes adquieren conocimientos teóricos y prácticos en machine learning con Python, aplicando algoritmos a conjuntos de datos reales. Se enfatiza el equilibrio entre la teoría y la aplicación práctica.</w:t>
-            </w:r>
-          </w:p>
-          <w:p>
-            <w:pPr>
-              <w:pStyle w:val="Normal"/>
-              <w:widowControl/>
-              <w:suppressAutoHyphens w:val="true"/>
-              <w:spacing w:before="0" w:after="0"/>
-              <w:jc w:val="both"/>
-              <w:rPr>
-                <w:rFonts w:ascii="Calibri" w:hAnsi="Calibri" w:asciiTheme="minorHAnsi" w:hAnsiTheme="minorHAnsi"/>
-                <w:sz w:val="22"/>
-                <w:szCs w:val="22"/>
-              </w:rPr>
-            </w:pPr>
-            <w:r>
-              <w:rPr>
-                <w:rFonts w:asciiTheme="minorHAnsi" w:hAnsiTheme="minorHAnsi" w:ascii="Calibri" w:hAnsi="Calibri"/>
-                <w:sz w:val="22"/>
-                <w:szCs w:val="22"/>
-              </w:rPr>
-              <w:t xml:space="preserve">   </w:t>
-            </w:r>
-            <w:r>
-              <w:rPr>
-                <w:rFonts w:asciiTheme="minorHAnsi" w:hAnsiTheme="minorHAnsi" w:ascii="Calibri" w:hAnsi="Calibri"/>
-                <w:sz w:val="22"/>
-                <w:szCs w:val="22"/>
-              </w:rPr>
-              <w:t>- *Intencionalidades Formativas:* Desarrolla habilidades aplicadas y teóricas, preparando a los estudiantes para comprender, implementar y contribuir al avance del conocimiento en machine learning.</w:t>
-            </w:r>
-          </w:p>
-          <w:p>
-            <w:pPr>
-              <w:pStyle w:val="Normal"/>
-              <w:widowControl/>
-              <w:suppressAutoHyphens w:val="true"/>
-              <w:spacing w:before="0" w:after="0"/>
-              <w:jc w:val="both"/>
-              <w:rPr>
-                <w:rFonts w:ascii="Calibri" w:hAnsi="Calibri" w:asciiTheme="minorHAnsi" w:hAnsiTheme="minorHAnsi"/>
-                <w:sz w:val="22"/>
-                <w:szCs w:val="22"/>
-              </w:rPr>
-            </w:pPr>
-            <w:r>
-              <w:rPr>
-                <w:rFonts w:asciiTheme="minorHAnsi" w:hAnsiTheme="minorHAnsi" w:ascii="Calibri" w:hAnsi="Calibri"/>
-                <w:sz w:val="22"/>
-                <w:szCs w:val="22"/>
-              </w:rPr>
-            </w:r>
-          </w:p>
-          <w:p>
-            <w:pPr>
-              <w:pStyle w:val="Normal"/>
-              <w:widowControl/>
-              <w:suppressAutoHyphens w:val="true"/>
-              <w:spacing w:before="0" w:after="0"/>
-              <w:jc w:val="both"/>
-              <w:rPr>
-                <w:rFonts w:ascii="Calibri" w:hAnsi="Calibri" w:asciiTheme="minorHAnsi" w:hAnsiTheme="minorHAnsi"/>
-                <w:sz w:val="22"/>
-                <w:szCs w:val="22"/>
-              </w:rPr>
-            </w:pPr>
-            <w:r>
-              <w:rPr>
-                <w:rFonts w:asciiTheme="minorHAnsi" w:hAnsiTheme="minorHAnsi" w:ascii="Calibri" w:hAnsi="Calibri"/>
-                <w:sz w:val="22"/>
-                <w:szCs w:val="22"/>
-              </w:rPr>
-              <w:t>3. **Aplicación Práctica de la Investigación:**</w:t>
-            </w:r>
-          </w:p>
-          <w:p>
-            <w:pPr>
-              <w:pStyle w:val="Normal"/>
-              <w:widowControl/>
-              <w:suppressAutoHyphens w:val="true"/>
-              <w:spacing w:before="0" w:after="0"/>
-              <w:jc w:val="both"/>
-              <w:rPr>
-                <w:rFonts w:ascii="Calibri" w:hAnsi="Calibri" w:asciiTheme="minorHAnsi" w:hAnsiTheme="minorHAnsi"/>
-                <w:sz w:val="22"/>
-                <w:szCs w:val="22"/>
-              </w:rPr>
-            </w:pPr>
-            <w:r>
-              <w:rPr>
-                <w:rFonts w:asciiTheme="minorHAnsi" w:hAnsiTheme="minorHAnsi" w:ascii="Calibri" w:hAnsi="Calibri"/>
-                <w:sz w:val="22"/>
-                <w:szCs w:val="22"/>
-              </w:rPr>
-              <w:t xml:space="preserve">   </w:t>
-            </w:r>
-            <w:r>
-              <w:rPr>
-                <w:rFonts w:asciiTheme="minorHAnsi" w:hAnsiTheme="minorHAnsi" w:ascii="Calibri" w:hAnsi="Calibri"/>
-                <w:sz w:val="22"/>
-                <w:szCs w:val="22"/>
-              </w:rPr>
-              <w:t>- *Aportes:* Los proyectos prácticos del curso requieren que los estudiantes apliquen sus conocimientos en la resolución de problemas del mundo real, fomentando la aplicación práctica de la investigación en machine learning.</w:t>
-            </w:r>
-          </w:p>
-          <w:p>
-            <w:pPr>
-              <w:pStyle w:val="Normal"/>
-              <w:widowControl/>
-              <w:suppressAutoHyphens w:val="true"/>
-              <w:spacing w:before="0" w:after="0"/>
-              <w:jc w:val="both"/>
-              <w:rPr>
-                <w:rFonts w:ascii="Calibri" w:hAnsi="Calibri" w:asciiTheme="minorHAnsi" w:hAnsiTheme="minorHAnsi"/>
-                <w:sz w:val="22"/>
-                <w:szCs w:val="22"/>
-              </w:rPr>
-            </w:pPr>
-            <w:r>
-              <w:rPr>
-                <w:rFonts w:asciiTheme="minorHAnsi" w:hAnsiTheme="minorHAnsi" w:ascii="Calibri" w:hAnsi="Calibri"/>
-                <w:sz w:val="22"/>
-                <w:szCs w:val="22"/>
-              </w:rPr>
-              <w:t xml:space="preserve">   </w:t>
-            </w:r>
-            <w:r>
-              <w:rPr>
-                <w:rFonts w:asciiTheme="minorHAnsi" w:hAnsiTheme="minorHAnsi" w:ascii="Calibri" w:hAnsi="Calibri"/>
-                <w:sz w:val="22"/>
-                <w:szCs w:val="22"/>
-              </w:rPr>
-              <w:t>- *Abordaje de Conocimientos y Saberes:* Facilita la transferencia de conocimientos a situaciones prácticas y promueve la capacidad de los estudiantes para resolver problemas complejos utilizando técnicas de investigación.</w:t>
-            </w:r>
-          </w:p>
-          <w:p>
-            <w:pPr>
-              <w:pStyle w:val="Normal"/>
-              <w:widowControl/>
-              <w:suppressAutoHyphens w:val="true"/>
-              <w:spacing w:before="0" w:after="0"/>
-              <w:jc w:val="both"/>
-              <w:rPr>
-                <w:rFonts w:ascii="Calibri" w:hAnsi="Calibri" w:asciiTheme="minorHAnsi" w:hAnsiTheme="minorHAnsi"/>
-                <w:sz w:val="22"/>
-                <w:szCs w:val="22"/>
-              </w:rPr>
-            </w:pPr>
-            <w:r>
-              <w:rPr>
-                <w:rFonts w:asciiTheme="minorHAnsi" w:hAnsiTheme="minorHAnsi" w:ascii="Calibri" w:hAnsi="Calibri"/>
-                <w:sz w:val="22"/>
-                <w:szCs w:val="22"/>
-              </w:rPr>
-            </w:r>
-          </w:p>
-          <w:p>
-            <w:pPr>
-              <w:pStyle w:val="Normal"/>
-              <w:widowControl/>
-              <w:suppressAutoHyphens w:val="true"/>
-              <w:spacing w:before="0" w:after="0"/>
-              <w:jc w:val="both"/>
-              <w:rPr>
-                <w:rFonts w:ascii="Calibri" w:hAnsi="Calibri" w:asciiTheme="minorHAnsi" w:hAnsiTheme="minorHAnsi"/>
-                <w:sz w:val="22"/>
-                <w:szCs w:val="22"/>
-              </w:rPr>
-            </w:pPr>
-            <w:r>
-              <w:rPr>
-                <w:rFonts w:asciiTheme="minorHAnsi" w:hAnsiTheme="minorHAnsi" w:ascii="Calibri" w:hAnsi="Calibri"/>
+            </w:r>
+          </w:p>
+          <w:p>
+            <w:pPr>
+              <w:pStyle w:val="Normal"/>
+              <w:widowControl/>
+              <w:suppressAutoHyphens w:val="true"/>
+              <w:spacing w:before="0" w:after="0"/>
+              <w:jc w:val="both"/>
+              <w:rPr>
+                <w:rFonts w:ascii="Calibri" w:hAnsi="Calibri" w:asciiTheme="minorHAnsi" w:hAnsiTheme="minorHAnsi"/>
+                <w:sz w:val="22"/>
+                <w:szCs w:val="22"/>
+              </w:rPr>
+            </w:pPr>
+            <w:r>
+              <w:rPr>
+                <w:rFonts w:ascii="Calibri" w:hAnsi="Calibri" w:asciiTheme="minorHAnsi" w:hAnsiTheme="minorHAnsi"/>
                 <w:sz w:val="22"/>
                 <w:szCs w:val="22"/>
               </w:rPr>
@@ -7274,14 +7211,6 @@
                   </w:rPr>
                   <w:t>☒</w:t>
                 </w:r>
-                <w:r>
-                  <w:rPr>
-                    <w:rFonts w:eastAsia="Times New Roman" w:cs="Segoe UI Symbol" w:ascii="Segoe UI Symbol" w:hAnsi="Segoe UI Symbol"/>
-                    <w:kern w:val="0"/>
-                    <w:szCs w:val="20"/>
-                    <w:lang w:val="es-ES" w:eastAsia="es-ES" w:bidi="ar-SA"/>
-                  </w:rPr>
-                </w:r>
               </w:sdtContent>
             </w:sdt>
             <w:r>
@@ -7320,14 +7249,6 @@
                   </w:rPr>
                   <w:t>☒</w:t>
                 </w:r>
-                <w:r>
-                  <w:rPr>
-                    <w:rFonts w:eastAsia="Times New Roman" w:cs="Segoe UI Symbol" w:ascii="Segoe UI Symbol" w:hAnsi="Segoe UI Symbol"/>
-                    <w:kern w:val="0"/>
-                    <w:szCs w:val="20"/>
-                    <w:lang w:val="es-ES" w:eastAsia="es-ES" w:bidi="ar-SA"/>
-                  </w:rPr>
-                </w:r>
               </w:sdtContent>
             </w:sdt>
             <w:r>
@@ -7365,14 +7286,6 @@
                     <w:lang w:val="es-ES" w:eastAsia="es-ES" w:bidi="ar-SA"/>
                   </w:rPr>
                   <w:t>☒</w:t>
-                </w:r>
-                <w:r>
-                  <w:rPr>
-                    <w:rFonts w:eastAsia="Times New Roman" w:cs="Segoe UI Symbol" w:ascii="Segoe UI Symbol" w:hAnsi="Segoe UI Symbol"/>
-                    <w:kern w:val="0"/>
-                    <w:szCs w:val="20"/>
-                    <w:lang w:val="es-ES" w:eastAsia="es-ES" w:bidi="ar-SA"/>
-                  </w:rPr>
                 </w:r>
               </w:sdtContent>
             </w:sdt>
@@ -8643,22 +8556,24 @@
                 <w:szCs w:val="20"/>
                 <w:lang w:val="es-ES" w:eastAsia="es-ES" w:bidi="ar-SA"/>
               </w:rPr>
-              <w:t xml:space="preserve">Medios y recursos didácticos:  </w:t>
-            </w:r>
-          </w:p>
-          <w:p>
-            <w:pPr>
-              <w:pStyle w:val="Normal"/>
-              <w:widowControl/>
-              <w:suppressAutoHyphens w:val="true"/>
-              <w:spacing w:before="0" w:after="0"/>
-              <w:jc w:val="both"/>
-              <w:rPr>
-                <w:rFonts w:ascii="Calibri" w:hAnsi="Calibri" w:asciiTheme="minorHAnsi" w:hAnsiTheme="minorHAnsi"/>
-              </w:rPr>
-            </w:pPr>
-            <w:r>
-              <w:rPr/>
+              <w:t>Medios y recursos didácticos:</w:t>
+            </w:r>
+          </w:p>
+          <w:p>
+            <w:pPr>
+              <w:pStyle w:val="Normal"/>
+              <w:widowControl/>
+              <w:suppressAutoHyphens w:val="true"/>
+              <w:spacing w:before="0" w:after="0"/>
+              <w:jc w:val="both"/>
+              <w:rPr>
+                <w:rFonts w:ascii="Calibri" w:hAnsi="Calibri" w:asciiTheme="minorHAnsi" w:hAnsiTheme="minorHAnsi"/>
+              </w:rPr>
+            </w:pPr>
+            <w:r>
+              <w:rPr>
+                <w:rFonts w:asciiTheme="minorHAnsi" w:hAnsiTheme="minorHAnsi" w:ascii="Calibri" w:hAnsi="Calibri"/>
+              </w:rPr>
             </w:r>
           </w:p>
           <w:p>
@@ -8694,7 +8609,9 @@
               </w:rPr>
             </w:pPr>
             <w:r>
-              <w:rPr/>
+              <w:rPr>
+                <w:rFonts w:asciiTheme="minorHAnsi" w:hAnsiTheme="minorHAnsi" w:ascii="Calibri" w:hAnsi="Calibri"/>
+              </w:rPr>
             </w:r>
           </w:p>
           <w:p>
@@ -8790,7 +8707,9 @@
               </w:rPr>
             </w:pPr>
             <w:r>
-              <w:rPr/>
+              <w:rPr>
+                <w:rFonts w:asciiTheme="minorHAnsi" w:hAnsiTheme="minorHAnsi" w:ascii="Calibri" w:hAnsi="Calibri"/>
+              </w:rPr>
             </w:r>
           </w:p>
           <w:p>
@@ -8886,7 +8805,9 @@
               </w:rPr>
             </w:pPr>
             <w:r>
-              <w:rPr/>
+              <w:rPr>
+                <w:rFonts w:asciiTheme="minorHAnsi" w:hAnsiTheme="minorHAnsi" w:ascii="Calibri" w:hAnsi="Calibri"/>
+              </w:rPr>
             </w:r>
           </w:p>
           <w:p>
@@ -8982,7 +8903,9 @@
               </w:rPr>
             </w:pPr>
             <w:r>
-              <w:rPr/>
+              <w:rPr>
+                <w:rFonts w:asciiTheme="minorHAnsi" w:hAnsiTheme="minorHAnsi" w:ascii="Calibri" w:hAnsi="Calibri"/>
+              </w:rPr>
             </w:r>
           </w:p>
           <w:p>
@@ -9078,7 +9001,9 @@
               </w:rPr>
             </w:pPr>
             <w:r>
-              <w:rPr/>
+              <w:rPr>
+                <w:rFonts w:asciiTheme="minorHAnsi" w:hAnsiTheme="minorHAnsi" w:ascii="Calibri" w:hAnsi="Calibri"/>
+              </w:rPr>
             </w:r>
           </w:p>
           <w:p>
@@ -9174,7 +9099,9 @@
               </w:rPr>
             </w:pPr>
             <w:r>
-              <w:rPr/>
+              <w:rPr>
+                <w:rFonts w:asciiTheme="minorHAnsi" w:hAnsiTheme="minorHAnsi" w:ascii="Calibri" w:hAnsi="Calibri"/>
+              </w:rPr>
             </w:r>
           </w:p>
           <w:p>
@@ -9270,7 +9197,9 @@
               </w:rPr>
             </w:pPr>
             <w:r>
-              <w:rPr/>
+              <w:rPr>
+                <w:rFonts w:asciiTheme="minorHAnsi" w:hAnsiTheme="minorHAnsi" w:ascii="Calibri" w:hAnsi="Calibri"/>
+              </w:rPr>
             </w:r>
           </w:p>
           <w:p>
@@ -9366,7 +9295,9 @@
               </w:rPr>
             </w:pPr>
             <w:r>
-              <w:rPr/>
+              <w:rPr>
+                <w:rFonts w:asciiTheme="minorHAnsi" w:hAnsiTheme="minorHAnsi" w:ascii="Calibri" w:hAnsi="Calibri"/>
+              </w:rPr>
             </w:r>
           </w:p>
           <w:p>
@@ -9462,7 +9393,9 @@
               </w:rPr>
             </w:pPr>
             <w:r>
-              <w:rPr/>
+              <w:rPr>
+                <w:rFonts w:asciiTheme="minorHAnsi" w:hAnsiTheme="minorHAnsi" w:ascii="Calibri" w:hAnsi="Calibri"/>
+              </w:rPr>
             </w:r>
           </w:p>
           <w:p>
@@ -9558,7 +9491,9 @@
               </w:rPr>
             </w:pPr>
             <w:r>
-              <w:rPr/>
+              <w:rPr>
+                <w:rFonts w:asciiTheme="minorHAnsi" w:hAnsiTheme="minorHAnsi" w:ascii="Calibri" w:hAnsi="Calibri"/>
+              </w:rPr>
             </w:r>
           </w:p>
           <w:p>
@@ -9953,37 +9888,41 @@
                 <w:szCs w:val="20"/>
                 <w:lang w:val="es-ES" w:eastAsia="es-ES" w:bidi="ar-SA"/>
               </w:rPr>
-              <w:t xml:space="preserve">Concepción de evaluación, modalidades (auto, co, hetero evaluación y evaluación entre pares) y estrategias a través de las cuales se va a orientar.  </w:t>
-            </w:r>
-          </w:p>
-          <w:p>
-            <w:pPr>
-              <w:pStyle w:val="Normal"/>
-              <w:widowControl/>
-              <w:suppressAutoHyphens w:val="true"/>
-              <w:spacing w:before="0" w:after="0"/>
-              <w:jc w:val="both"/>
-              <w:rPr>
-                <w:rFonts w:ascii="Calibri" w:hAnsi="Calibri"/>
-              </w:rPr>
-            </w:pPr>
-            <w:r>
-              <w:rPr/>
-            </w:r>
-          </w:p>
-          <w:p>
-            <w:pPr>
-              <w:pStyle w:val="Normal"/>
-              <w:widowControl/>
-              <w:suppressAutoHyphens w:val="true"/>
-              <w:spacing w:before="0" w:after="0"/>
-              <w:jc w:val="both"/>
-              <w:rPr>
-                <w:rFonts w:ascii="Calibri" w:hAnsi="Calibri"/>
-              </w:rPr>
-            </w:pPr>
-            <w:r>
-              <w:rPr/>
+              <w:t>Concepción de evaluación, modalidades (auto, co, hetero evaluación y evaluación entre pares) y estrategias a través de las cuales se va a orientar.</w:t>
+            </w:r>
+          </w:p>
+          <w:p>
+            <w:pPr>
+              <w:pStyle w:val="Normal"/>
+              <w:widowControl/>
+              <w:suppressAutoHyphens w:val="true"/>
+              <w:spacing w:before="0" w:after="0"/>
+              <w:jc w:val="both"/>
+              <w:rPr>
+                <w:rFonts w:ascii="Calibri" w:hAnsi="Calibri"/>
+              </w:rPr>
+            </w:pPr>
+            <w:r>
+              <w:rPr>
+                <w:rFonts w:ascii="Calibri" w:hAnsi="Calibri"/>
+              </w:rPr>
+            </w:r>
+          </w:p>
+          <w:p>
+            <w:pPr>
+              <w:pStyle w:val="Normal"/>
+              <w:widowControl/>
+              <w:suppressAutoHyphens w:val="true"/>
+              <w:spacing w:before="0" w:after="0"/>
+              <w:jc w:val="both"/>
+              <w:rPr>
+                <w:rFonts w:ascii="Calibri" w:hAnsi="Calibri"/>
+              </w:rPr>
+            </w:pPr>
+            <w:r>
+              <w:rPr>
+                <w:rFonts w:ascii="Calibri" w:hAnsi="Calibri"/>
+              </w:rPr>
             </w:r>
           </w:p>
           <w:p>
@@ -10019,7 +9958,9 @@
               </w:rPr>
             </w:pPr>
             <w:r>
-              <w:rPr/>
+              <w:rPr>
+                <w:rFonts w:ascii="Calibri" w:hAnsi="Calibri"/>
+              </w:rPr>
             </w:r>
           </w:p>
           <w:p>
@@ -10055,7 +9996,9 @@
               </w:rPr>
             </w:pPr>
             <w:r>
-              <w:rPr/>
+              <w:rPr>
+                <w:rFonts w:ascii="Calibri" w:hAnsi="Calibri"/>
+              </w:rPr>
             </w:r>
           </w:p>
           <w:p>
@@ -10091,7 +10034,9 @@
               </w:rPr>
             </w:pPr>
             <w:r>
-              <w:rPr/>
+              <w:rPr>
+                <w:rFonts w:ascii="Calibri" w:hAnsi="Calibri"/>
+              </w:rPr>
             </w:r>
           </w:p>
           <w:p>
@@ -10187,7 +10132,9 @@
               </w:rPr>
             </w:pPr>
             <w:r>
-              <w:rPr/>
+              <w:rPr>
+                <w:rFonts w:ascii="Calibri" w:hAnsi="Calibri"/>
+              </w:rPr>
             </w:r>
           </w:p>
           <w:p>
@@ -10283,7 +10230,9 @@
               </w:rPr>
             </w:pPr>
             <w:r>
-              <w:rPr/>
+              <w:rPr>
+                <w:rFonts w:ascii="Calibri" w:hAnsi="Calibri"/>
+              </w:rPr>
             </w:r>
           </w:p>
           <w:p>
@@ -10379,7 +10328,9 @@
               </w:rPr>
             </w:pPr>
             <w:r>
-              <w:rPr/>
+              <w:rPr>
+                <w:rFonts w:ascii="Calibri" w:hAnsi="Calibri"/>
+              </w:rPr>
             </w:r>
           </w:p>
           <w:p>
@@ -10475,7 +10426,9 @@
               </w:rPr>
             </w:pPr>
             <w:r>
-              <w:rPr/>
+              <w:rPr>
+                <w:rFonts w:ascii="Calibri" w:hAnsi="Calibri"/>
+              </w:rPr>
             </w:r>
           </w:p>
           <w:p>
@@ -10511,7 +10464,9 @@
               </w:rPr>
             </w:pPr>
             <w:r>
-              <w:rPr/>
+              <w:rPr>
+                <w:rFonts w:ascii="Calibri" w:hAnsi="Calibri"/>
+              </w:rPr>
             </w:r>
           </w:p>
           <w:p>
@@ -10577,7 +10532,9 @@
               </w:rPr>
             </w:pPr>
             <w:r>
-              <w:rPr/>
+              <w:rPr>
+                <w:rFonts w:ascii="Calibri" w:hAnsi="Calibri"/>
+              </w:rPr>
             </w:r>
           </w:p>
           <w:p>
@@ -10643,7 +10600,9 @@
               </w:rPr>
             </w:pPr>
             <w:r>
-              <w:rPr/>
+              <w:rPr>
+                <w:rFonts w:ascii="Calibri" w:hAnsi="Calibri"/>
+              </w:rPr>
             </w:r>
           </w:p>
           <w:p>
@@ -10709,7 +10668,9 @@
               </w:rPr>
             </w:pPr>
             <w:r>
-              <w:rPr/>
+              <w:rPr>
+                <w:rFonts w:ascii="Calibri" w:hAnsi="Calibri"/>
+              </w:rPr>
             </w:r>
           </w:p>
           <w:p>
@@ -10775,7 +10736,9 @@
               </w:rPr>
             </w:pPr>
             <w:r>
-              <w:rPr/>
+              <w:rPr>
+                <w:rFonts w:ascii="Calibri" w:hAnsi="Calibri"/>
+              </w:rPr>
             </w:r>
           </w:p>
           <w:p>
@@ -10841,7 +10804,9 @@
               </w:rPr>
             </w:pPr>
             <w:r>
-              <w:rPr/>
+              <w:rPr>
+                <w:rFonts w:ascii="Calibri" w:hAnsi="Calibri"/>
+              </w:rPr>
             </w:r>
           </w:p>
           <w:p>
@@ -10907,7 +10872,9 @@
               </w:rPr>
             </w:pPr>
             <w:r>
-              <w:rPr/>
+              <w:rPr>
+                <w:rFonts w:ascii="Calibri" w:hAnsi="Calibri"/>
+              </w:rPr>
             </w:r>
           </w:p>
           <w:p>
@@ -10973,7 +10940,9 @@
               </w:rPr>
             </w:pPr>
             <w:r>
-              <w:rPr/>
+              <w:rPr>
+                <w:rFonts w:ascii="Calibri" w:hAnsi="Calibri"/>
+              </w:rPr>
             </w:r>
           </w:p>
           <w:p>
@@ -11039,7 +11008,9 @@
               </w:rPr>
             </w:pPr>
             <w:r>
-              <w:rPr/>
+              <w:rPr>
+                <w:rFonts w:ascii="Calibri" w:hAnsi="Calibri"/>
+              </w:rPr>
             </w:r>
           </w:p>
           <w:p>
@@ -11075,7 +11046,9 @@
               </w:rPr>
             </w:pPr>
             <w:r>
-              <w:rPr/>
+              <w:rPr>
+                <w:rFonts w:ascii="Calibri" w:hAnsi="Calibri"/>
+              </w:rPr>
             </w:r>
           </w:p>
           <w:p>
@@ -11969,7 +11942,7 @@
             </w:pPr>
             <w:r>
               <w:rPr>
-                <w:rFonts w:cs="Calibri" w:cstheme="minorHAnsi" w:ascii="Calibri" w:hAnsi="Calibri"/>
+                <w:rFonts w:cs="Calibri" w:ascii="Calibri" w:hAnsi="Calibri" w:cstheme="minorHAnsi"/>
                 <w:sz w:val="22"/>
                 <w:szCs w:val="22"/>
               </w:rPr>
@@ -12076,7 +12049,7 @@
             </w:pPr>
             <w:r>
               <w:rPr>
-                <w:rFonts w:cs="Calibri" w:cstheme="minorHAnsi" w:ascii="Calibri" w:hAnsi="Calibri"/>
+                <w:rFonts w:cs="Calibri" w:ascii="Calibri" w:hAnsi="Calibri" w:cstheme="minorHAnsi"/>
                 <w:sz w:val="22"/>
                 <w:szCs w:val="22"/>
               </w:rPr>
@@ -12456,7 +12429,7 @@
             </w:pPr>
             <w:r>
               <w:rPr>
-                <w:rFonts w:asciiTheme="minorHAnsi" w:hAnsiTheme="minorHAnsi" w:ascii="Calibri" w:hAnsi="Calibri"/>
+                <w:rFonts w:ascii="Calibri" w:hAnsi="Calibri" w:asciiTheme="minorHAnsi" w:hAnsiTheme="minorHAnsi"/>
               </w:rPr>
               <w:t>Marco Julio Cañas Campillo</w:t>
             </w:r>
@@ -12487,7 +12460,7 @@
             </w:pPr>
             <w:r>
               <w:rPr>
-                <w:rFonts w:asciiTheme="minorHAnsi" w:hAnsiTheme="minorHAnsi" w:ascii="Calibri" w:hAnsi="Calibri"/>
+                <w:rFonts w:ascii="Calibri" w:hAnsi="Calibri" w:asciiTheme="minorHAnsi" w:hAnsiTheme="minorHAnsi"/>
               </w:rPr>
               <w:t>Dirección de regionalización</w:t>
             </w:r>
@@ -12518,7 +12491,7 @@
             </w:pPr>
             <w:r>
               <w:rPr>
-                <w:rFonts w:asciiTheme="minorHAnsi" w:hAnsiTheme="minorHAnsi" w:ascii="Calibri" w:hAnsi="Calibri"/>
+                <w:rFonts w:ascii="Calibri" w:hAnsi="Calibri" w:asciiTheme="minorHAnsi" w:hAnsiTheme="minorHAnsi"/>
               </w:rPr>
               <w:t>Licenciado en Matemáticas y Física de la UdeA Magíster en ciencias matemáticas de la Universidad Nacional de Colombia</w:t>
             </w:r>
@@ -13713,8 +13686,12 @@
       </w:r>
     </w:p>
     <w:sectPr>
-      <w:headerReference w:type="default" r:id="rId3"/>
-      <w:footerReference w:type="default" r:id="rId4"/>
+      <w:headerReference w:type="even" r:id="rId3"/>
+      <w:headerReference w:type="default" r:id="rId4"/>
+      <w:headerReference w:type="first" r:id="rId5"/>
+      <w:footerReference w:type="even" r:id="rId6"/>
+      <w:footerReference w:type="default" r:id="rId7"/>
+      <w:footerReference w:type="first" r:id="rId8"/>
       <w:footnotePr>
         <w:numFmt w:val="decimal"/>
       </w:footnotePr>
@@ -13731,6 +13708,168 @@
 </file>
 
 <file path=word/footer1.xml><?xml version="1.0" encoding="utf-8"?>
+<w:ftr xmlns:o="urn:schemas-microsoft-com:office:office" xmlns:r="http://schemas.openxmlformats.org/officeDocument/2006/relationships" xmlns:v="urn:schemas-microsoft-com:vml" xmlns:w="http://schemas.openxmlformats.org/wordprocessingml/2006/main" xmlns:w10="urn:schemas-microsoft-com:office:word" xmlns:wp="http://schemas.openxmlformats.org/drawingml/2006/wordprocessingDrawing" xmlns:wps="http://schemas.microsoft.com/office/word/2010/wordprocessingShape" xmlns:wpg="http://schemas.microsoft.com/office/word/2010/wordprocessingGroup" xmlns:mc="http://schemas.openxmlformats.org/markup-compatibility/2006" xmlns:wp14="http://schemas.microsoft.com/office/word/2010/wordprocessingDrawing" xmlns:w14="http://schemas.microsoft.com/office/word/2010/wordml" xmlns:w15="http://schemas.microsoft.com/office/word/2012/wordml" mc:Ignorable="w14 wp14 w15">
+  <w:p>
+    <w:pPr>
+      <w:pStyle w:val="Footer"/>
+      <w:rPr/>
+    </w:pPr>
+    <w:r>
+      <w:rPr/>
+    </w:r>
+  </w:p>
+</w:ftr>
+</file>
+
+<file path=word/footer2.xml><?xml version="1.0" encoding="utf-8"?>
+<w:ftr xmlns:o="urn:schemas-microsoft-com:office:office" xmlns:r="http://schemas.openxmlformats.org/officeDocument/2006/relationships" xmlns:v="urn:schemas-microsoft-com:vml" xmlns:w="http://schemas.openxmlformats.org/wordprocessingml/2006/main" xmlns:w10="urn:schemas-microsoft-com:office:word" xmlns:wp="http://schemas.openxmlformats.org/drawingml/2006/wordprocessingDrawing" xmlns:wps="http://schemas.microsoft.com/office/word/2010/wordprocessingShape" xmlns:wpg="http://schemas.microsoft.com/office/word/2010/wordprocessingGroup" xmlns:mc="http://schemas.openxmlformats.org/markup-compatibility/2006" xmlns:wp14="http://schemas.microsoft.com/office/word/2010/wordprocessingDrawing" xmlns:w14="http://schemas.microsoft.com/office/word/2010/wordml" xmlns:w15="http://schemas.microsoft.com/office/word/2012/wordml" mc:Ignorable="w14 wp14 w15">
+  <w:sdt>
+    <w:sdtPr>
+      <w:docPartObj>
+        <w:docPartGallery w:val="Page Numbers (Top of Page)"/>
+        <w:docPartUnique w:val="true"/>
+      </w:docPartObj>
+    </w:sdtPr>
+    <w:sdtContent>
+      <w:p>
+        <w:pPr>
+          <w:pStyle w:val="Footer"/>
+          <w:jc w:val="right"/>
+          <w:rPr>
+            <w:rFonts w:ascii="Calibri" w:hAnsi="Calibri"/>
+            <w:sz w:val="20"/>
+          </w:rPr>
+        </w:pPr>
+        <w:r>
+          <w:rPr>
+            <w:rFonts w:ascii="Calibri" w:hAnsi="Calibri"/>
+            <w:sz w:val="20"/>
+            <w:lang w:val="es-ES"/>
+          </w:rPr>
+          <w:t xml:space="preserve">Página </w:t>
+        </w:r>
+        <w:r>
+          <w:rPr>
+            <w:rFonts w:ascii="Calibri" w:hAnsi="Calibri"/>
+            <w:bCs/>
+            <w:sz w:val="20"/>
+            <w:szCs w:val="24"/>
+          </w:rPr>
+          <w:fldChar w:fldCharType="begin"/>
+        </w:r>
+        <w:r>
+          <w:rPr>
+            <w:sz w:val="20"/>
+            <w:szCs w:val="24"/>
+            <w:bCs/>
+            <w:rFonts w:ascii="Calibri" w:hAnsi="Calibri"/>
+          </w:rPr>
+          <w:instrText xml:space="preserve"> PAGE </w:instrText>
+        </w:r>
+        <w:r>
+          <w:rPr>
+            <w:sz w:val="20"/>
+            <w:szCs w:val="24"/>
+            <w:bCs/>
+            <w:rFonts w:ascii="Calibri" w:hAnsi="Calibri"/>
+          </w:rPr>
+          <w:fldChar w:fldCharType="separate"/>
+        </w:r>
+        <w:r>
+          <w:rPr>
+            <w:sz w:val="20"/>
+            <w:szCs w:val="24"/>
+            <w:bCs/>
+            <w:rFonts w:ascii="Calibri" w:hAnsi="Calibri"/>
+          </w:rPr>
+          <w:t>14</w:t>
+        </w:r>
+        <w:r>
+          <w:rPr>
+            <w:sz w:val="20"/>
+            <w:szCs w:val="24"/>
+            <w:bCs/>
+            <w:rFonts w:ascii="Calibri" w:hAnsi="Calibri"/>
+          </w:rPr>
+          <w:fldChar w:fldCharType="end"/>
+        </w:r>
+        <w:r>
+          <w:rPr>
+            <w:rFonts w:ascii="Calibri" w:hAnsi="Calibri"/>
+            <w:sz w:val="20"/>
+            <w:lang w:val="es-ES"/>
+          </w:rPr>
+          <w:t xml:space="preserve"> de </w:t>
+        </w:r>
+        <w:r>
+          <w:rPr>
+            <w:rFonts w:ascii="Calibri" w:hAnsi="Calibri"/>
+            <w:bCs/>
+            <w:sz w:val="20"/>
+            <w:szCs w:val="24"/>
+          </w:rPr>
+          <w:fldChar w:fldCharType="begin"/>
+        </w:r>
+        <w:r>
+          <w:rPr>
+            <w:sz w:val="20"/>
+            <w:szCs w:val="24"/>
+            <w:bCs/>
+            <w:rFonts w:ascii="Calibri" w:hAnsi="Calibri"/>
+          </w:rPr>
+          <w:instrText xml:space="preserve"> NUMPAGES </w:instrText>
+        </w:r>
+        <w:r>
+          <w:rPr>
+            <w:sz w:val="20"/>
+            <w:szCs w:val="24"/>
+            <w:bCs/>
+            <w:rFonts w:ascii="Calibri" w:hAnsi="Calibri"/>
+          </w:rPr>
+          <w:fldChar w:fldCharType="separate"/>
+        </w:r>
+        <w:r>
+          <w:rPr>
+            <w:sz w:val="20"/>
+            <w:szCs w:val="24"/>
+            <w:bCs/>
+            <w:rFonts w:ascii="Calibri" w:hAnsi="Calibri"/>
+          </w:rPr>
+          <w:t>14</w:t>
+        </w:r>
+        <w:r>
+          <w:rPr>
+            <w:sz w:val="20"/>
+            <w:szCs w:val="24"/>
+            <w:bCs/>
+            <w:rFonts w:ascii="Calibri" w:hAnsi="Calibri"/>
+          </w:rPr>
+          <w:fldChar w:fldCharType="end"/>
+        </w:r>
+      </w:p>
+    </w:sdtContent>
+  </w:sdt>
+  <w:p>
+    <w:pPr>
+      <w:pStyle w:val="Footer"/>
+      <w:rPr>
+        <w:rFonts w:ascii="Calibri" w:hAnsi="Calibri" w:asciiTheme="minorHAnsi" w:hAnsiTheme="minorHAnsi"/>
+        <w:sz w:val="20"/>
+      </w:rPr>
+    </w:pPr>
+    <w:r>
+      <w:rPr>
+        <w:rFonts w:ascii="Calibri" w:hAnsi="Calibri" w:asciiTheme="minorHAnsi" w:hAnsiTheme="minorHAnsi"/>
+        <w:sz w:val="20"/>
+        <w:lang w:val="es-CO"/>
+      </w:rPr>
+      <w:t>VD-FO-003, Versión 04</w:t>
+    </w:r>
+  </w:p>
+</w:ftr>
+</file>
+
+<file path=word/footer3.xml><?xml version="1.0" encoding="utf-8"?>
 <w:ftr xmlns:o="urn:schemas-microsoft-com:office:office" xmlns:r="http://schemas.openxmlformats.org/officeDocument/2006/relationships" xmlns:v="urn:schemas-microsoft-com:vml" xmlns:w="http://schemas.openxmlformats.org/wordprocessingml/2006/main" xmlns:w10="urn:schemas-microsoft-com:office:word" xmlns:wp="http://schemas.openxmlformats.org/drawingml/2006/wordprocessingDrawing" xmlns:wps="http://schemas.microsoft.com/office/word/2010/wordprocessingShape" xmlns:wpg="http://schemas.microsoft.com/office/word/2010/wordprocessingGroup" xmlns:mc="http://schemas.openxmlformats.org/markup-compatibility/2006" xmlns:wp14="http://schemas.microsoft.com/office/word/2010/wordprocessingDrawing" xmlns:w14="http://schemas.microsoft.com/office/word/2010/wordml" xmlns:w15="http://schemas.microsoft.com/office/word/2012/wordml" mc:Ignorable="w14 wp14 w15">
   <w:sdt>
     <w:sdtPr>
@@ -14195,6 +14334,108 @@
 </file>
 
 <file path=word/header1.xml><?xml version="1.0" encoding="utf-8"?>
+<w:hdr xmlns:o="urn:schemas-microsoft-com:office:office" xmlns:r="http://schemas.openxmlformats.org/officeDocument/2006/relationships" xmlns:v="urn:schemas-microsoft-com:vml" xmlns:w="http://schemas.openxmlformats.org/wordprocessingml/2006/main" xmlns:w10="urn:schemas-microsoft-com:office:word" xmlns:wp="http://schemas.openxmlformats.org/drawingml/2006/wordprocessingDrawing" xmlns:wps="http://schemas.microsoft.com/office/word/2010/wordprocessingShape" xmlns:wpg="http://schemas.microsoft.com/office/word/2010/wordprocessingGroup" xmlns:mc="http://schemas.openxmlformats.org/markup-compatibility/2006" xmlns:wp14="http://schemas.microsoft.com/office/word/2010/wordprocessingDrawing" xmlns:w14="http://schemas.microsoft.com/office/word/2010/wordml" xmlns:w15="http://schemas.microsoft.com/office/word/2012/wordml" mc:Ignorable="w14 wp14 w15">
+  <w:p>
+    <w:pPr>
+      <w:pStyle w:val="Header"/>
+      <w:rPr/>
+    </w:pPr>
+    <w:r>
+      <w:rPr/>
+    </w:r>
+  </w:p>
+</w:hdr>
+</file>
+
+<file path=word/header2.xml><?xml version="1.0" encoding="utf-8"?>
+<w:hdr xmlns:o="urn:schemas-microsoft-com:office:office" xmlns:r="http://schemas.openxmlformats.org/officeDocument/2006/relationships" xmlns:v="urn:schemas-microsoft-com:vml" xmlns:w="http://schemas.openxmlformats.org/wordprocessingml/2006/main" xmlns:w10="urn:schemas-microsoft-com:office:word" xmlns:wp="http://schemas.openxmlformats.org/drawingml/2006/wordprocessingDrawing" xmlns:wps="http://schemas.microsoft.com/office/word/2010/wordprocessingShape" xmlns:wpg="http://schemas.microsoft.com/office/word/2010/wordprocessingGroup" xmlns:mc="http://schemas.openxmlformats.org/markup-compatibility/2006" xmlns:wp14="http://schemas.microsoft.com/office/word/2010/wordprocessingDrawing" xmlns:w14="http://schemas.microsoft.com/office/word/2010/wordml" xmlns:w15="http://schemas.microsoft.com/office/word/2012/wordml" mc:Ignorable="w14 wp14 w15">
+  <w:tbl>
+    <w:tblPr>
+      <w:tblW w:w="10530" w:type="dxa"/>
+      <w:jc w:val="left"/>
+      <w:tblInd w:w="0" w:type="dxa"/>
+      <w:tblLayout w:type="fixed"/>
+      <w:tblCellMar>
+        <w:top w:w="0" w:type="dxa"/>
+        <w:left w:w="108" w:type="dxa"/>
+        <w:bottom w:w="0" w:type="dxa"/>
+        <w:right w:w="108" w:type="dxa"/>
+      </w:tblCellMar>
+      <w:tblLook w:val="06a0" w:noHBand="1" w:noVBand="1" w:firstColumn="1" w:lastRow="0" w:lastColumn="0" w:firstRow="1"/>
+    </w:tblPr>
+    <w:tblGrid>
+      <w:gridCol w:w="3510"/>
+      <w:gridCol w:w="3510"/>
+      <w:gridCol w:w="3510"/>
+    </w:tblGrid>
+    <w:tr>
+      <w:trPr>
+        <w:trHeight w:val="300" w:hRule="atLeast"/>
+      </w:trPr>
+      <w:tc>
+        <w:tcPr>
+          <w:tcW w:w="3510" w:type="dxa"/>
+          <w:tcBorders/>
+        </w:tcPr>
+        <w:p>
+          <w:pPr>
+            <w:pStyle w:val="Header"/>
+            <w:ind w:left="-115"/>
+            <w:rPr/>
+          </w:pPr>
+          <w:r>
+            <w:rPr/>
+          </w:r>
+        </w:p>
+      </w:tc>
+      <w:tc>
+        <w:tcPr>
+          <w:tcW w:w="3510" w:type="dxa"/>
+          <w:tcBorders/>
+        </w:tcPr>
+        <w:p>
+          <w:pPr>
+            <w:pStyle w:val="Header"/>
+            <w:jc w:val="center"/>
+            <w:rPr/>
+          </w:pPr>
+          <w:r>
+            <w:rPr/>
+          </w:r>
+        </w:p>
+      </w:tc>
+      <w:tc>
+        <w:tcPr>
+          <w:tcW w:w="3510" w:type="dxa"/>
+          <w:tcBorders/>
+        </w:tcPr>
+        <w:p>
+          <w:pPr>
+            <w:pStyle w:val="Header"/>
+            <w:ind w:right="-115"/>
+            <w:jc w:val="right"/>
+            <w:rPr/>
+          </w:pPr>
+          <w:r>
+            <w:rPr/>
+          </w:r>
+        </w:p>
+      </w:tc>
+    </w:tr>
+  </w:tbl>
+  <w:p>
+    <w:pPr>
+      <w:pStyle w:val="Header"/>
+      <w:rPr/>
+    </w:pPr>
+    <w:r>
+      <w:rPr/>
+    </w:r>
+  </w:p>
+</w:hdr>
+</file>
+
+<file path=word/header3.xml><?xml version="1.0" encoding="utf-8"?>
 <w:hdr xmlns:o="urn:schemas-microsoft-com:office:office" xmlns:r="http://schemas.openxmlformats.org/officeDocument/2006/relationships" xmlns:v="urn:schemas-microsoft-com:vml" xmlns:w="http://schemas.openxmlformats.org/wordprocessingml/2006/main" xmlns:w10="urn:schemas-microsoft-com:office:word" xmlns:wp="http://schemas.openxmlformats.org/drawingml/2006/wordprocessingDrawing" xmlns:wps="http://schemas.microsoft.com/office/word/2010/wordprocessingShape" xmlns:wpg="http://schemas.microsoft.com/office/word/2010/wordprocessingGroup" xmlns:mc="http://schemas.openxmlformats.org/markup-compatibility/2006" xmlns:wp14="http://schemas.microsoft.com/office/word/2010/wordprocessingDrawing" xmlns:w14="http://schemas.microsoft.com/office/word/2010/wordml" xmlns:w15="http://schemas.microsoft.com/office/word/2012/wordml" mc:Ignorable="w14 wp14 w15">
   <w:tbl>
     <w:tblPr>

</xml_diff>